<commit_message>
feat(vibecoding): rewrite all test questions to genuine Vibecoding, prompt engineering, AI tools and agentic coding
</commit_message>
<xml_diff>
--- a/tests/TEST_5-6_SINF_VIBECODING.docx
+++ b/tests/TEST_5-6_SINF_VIBECODING.docx
@@ -341,7 +341,7 @@
           <w:color w:val="0F172A"/>
           <w:sz w:val="20"/>
         </w:rPr>
-        <w:t xml:space="preserve">Vibecoding nima va uning an'anaviy dasturlashdan asosiy farqi nimada? </w:t>
+        <w:t xml:space="preserve">Vibecoding tushunchasining asosiy mohiyati nimada? </w:t>
       </w:r>
       <w:r>
         <w:rPr>
@@ -350,7 +350,7 @@
           <w:color w:val="475569"/>
           <w:sz w:val="19"/>
         </w:rPr>
-        <w:t>(Что такое Vibecoding и в чем его главное отличие от традиционного программирования?)</w:t>
+        <w:t>(В чем заключается главная суть концепции Vibecoding?)</w:t>
       </w:r>
     </w:p>
     <w:p>
@@ -371,7 +371,7 @@
           <w:color w:val="0F172A"/>
           <w:sz w:val="19"/>
         </w:rPr>
-        <w:t xml:space="preserve">Faqat kompyuter o'yinlarini o'ynash va yangiliklarni o'qish. </w:t>
+        <w:t xml:space="preserve">Dasturchining o'zi kodning har bir harfini qo'lda terishi. </w:t>
       </w:r>
       <w:r>
         <w:rPr>
@@ -379,7 +379,7 @@
           <w:color w:val="505F73"/>
           <w:sz w:val="18"/>
         </w:rPr>
-        <w:t>(Просто играть в компьютерные игры и читать новости.)</w:t>
+        <w:t>(В ручном наборе каждой строчки кода строго по памяти.)</w:t>
       </w:r>
     </w:p>
     <w:p>
@@ -400,7 +400,7 @@
           <w:color w:val="0F172A"/>
           <w:sz w:val="19"/>
         </w:rPr>
-        <w:t xml:space="preserve">Kompyuterni elektr tarmog'idan uzib qo'yish. </w:t>
+        <w:t xml:space="preserve">Faqat kompyuter o'yinlarini o'ynash. </w:t>
       </w:r>
       <w:r>
         <w:rPr>
@@ -408,7 +408,7 @@
           <w:color w:val="505F73"/>
           <w:sz w:val="18"/>
         </w:rPr>
-        <w:t>(Полное отключение компьютера от электричества.)</w:t>
+        <w:t>(Исключительно в игре в компьютерные игры.)</w:t>
       </w:r>
     </w:p>
     <w:p>
@@ -429,7 +429,7 @@
           <w:color w:val="0F172A"/>
           <w:sz w:val="19"/>
         </w:rPr>
-        <w:t xml:space="preserve">Sun'iy intellekt (AI) bilan muloqot qilib, g'oya va promptlar orqali real kod va tayyor interaktiv loyihalarni tezkor yaratish. </w:t>
+        <w:t xml:space="preserve">Sun'iy intellekt (AI) ga aniq g'oya va promptlar berib, kod va loyihalarni tezkor yaratish hamda natijani boshqarish. </w:t>
       </w:r>
       <w:r>
         <w:rPr>
@@ -437,7 +437,7 @@
           <w:color w:val="505F73"/>
           <w:sz w:val="18"/>
         </w:rPr>
-        <w:t>(Создавать реальный код и готовые интерактивные веб-проекты в диалоге с искусственным интеллектом (AI) через точные идеи и промпты.)</w:t>
+        <w:t>(В быстром создании реальных работающих программ в диалоге с искусственным интеллектом (AI) через точные идеи и промпты.)</w:t>
       </w:r>
     </w:p>
     <w:p>
@@ -458,7 +458,7 @@
           <w:color w:val="0F172A"/>
           <w:sz w:val="19"/>
         </w:rPr>
-        <w:t xml:space="preserve">Klaviaturadan foydalanmasdan faqat ovoz yozib olish. </w:t>
+        <w:t xml:space="preserve">Kompyuterni elektr tarmog'idan uzib qo'yish. </w:t>
       </w:r>
       <w:r>
         <w:rPr>
@@ -466,7 +466,7 @@
           <w:color w:val="505F73"/>
           <w:sz w:val="18"/>
         </w:rPr>
-        <w:t>(Запись голоса без использования клавиатуры.)</w:t>
+        <w:t>(В полном отключении компьютера от питания.)</w:t>
       </w:r>
     </w:p>
     <w:p>
@@ -487,7 +487,7 @@
           <w:color w:val="0F172A"/>
           <w:sz w:val="19"/>
         </w:rPr>
-        <w:t xml:space="preserve">Faqat tayyor rasmlarni printerdan chop etish. </w:t>
+        <w:t xml:space="preserve">Klaviaturani umuman ishlatmaslik. </w:t>
       </w:r>
       <w:r>
         <w:rPr>
@@ -495,7 +495,7 @@
           <w:color w:val="505F73"/>
           <w:sz w:val="18"/>
         </w:rPr>
-        <w:t>(Печать готовых картинок на обычном принтере.)</w:t>
+        <w:t>(В полном отказе от клавиатуры.)</w:t>
       </w:r>
     </w:p>
     <w:p>
@@ -517,7 +517,7 @@
           <w:color w:val="0F172A"/>
           <w:sz w:val="20"/>
         </w:rPr>
-        <w:t xml:space="preserve">Sun'iy intellektdan o'yin kodi olishda eng sifatli natija beruvchi prompt (buyruq) qaysi? </w:t>
+        <w:t xml:space="preserve">Sun'iy intellektga yuboriladigan buyruq yoki savol matni nima deb ataladi? </w:t>
       </w:r>
       <w:r>
         <w:rPr>
@@ -526,7 +526,7 @@
           <w:color w:val="475569"/>
           <w:sz w:val="19"/>
         </w:rPr>
-        <w:t>(Какой промпт (запрос к AI) даст самый качественный результат для генерации игры?)</w:t>
+        <w:t>(Как называется текстовый запрос или инструкция, которую пользователь отправляет нейросети?)</w:t>
       </w:r>
     </w:p>
     <w:p>
@@ -547,7 +547,7 @@
           <w:color w:val="0F172A"/>
           <w:sz w:val="19"/>
         </w:rPr>
-        <w:t xml:space="preserve">'HTML Canvas da 2D o'yin yarat: qahramon kvadrat bo'lsin, strelkalar bilan yursin, tikanlarga tegsa joni kamaysin va ochko hisoblansin.' </w:t>
+        <w:t xml:space="preserve">Prompt (Prompt / So'rov) </w:t>
       </w:r>
       <w:r>
         <w:rPr>
@@ -555,7 +555,7 @@
           <w:color w:val="505F73"/>
           <w:sz w:val="18"/>
         </w:rPr>
-        <w:t>('Создай 2D-игру на HTML Canvas: персонаж — синий квадрат, ходит на стрелочки, при касании шипов теряет жизни, собирает монеты и считает очки.')</w:t>
+        <w:t>(Промпт (Prompt / Запрос))</w:t>
       </w:r>
     </w:p>
     <w:p>
@@ -576,7 +576,7 @@
           <w:color w:val="0F172A"/>
           <w:sz w:val="19"/>
         </w:rPr>
-        <w:t xml:space="preserve">'Menga biron narsa yozib ber.' </w:t>
+        <w:t xml:space="preserve">Virus </w:t>
       </w:r>
       <w:r>
         <w:rPr>
@@ -584,7 +584,7 @@
           <w:color w:val="505F73"/>
           <w:sz w:val="18"/>
         </w:rPr>
-        <w:t>('Напиши мне что-нибудь.')</w:t>
+        <w:t>(Вирус)</w:t>
       </w:r>
     </w:p>
     <w:p>
@@ -605,7 +605,7 @@
           <w:color w:val="0F172A"/>
           <w:sz w:val="19"/>
         </w:rPr>
-        <w:t xml:space="preserve">'O'yin qil.' </w:t>
+        <w:t xml:space="preserve">Drayver </w:t>
       </w:r>
       <w:r>
         <w:rPr>
@@ -613,7 +613,7 @@
           <w:color w:val="505F73"/>
           <w:sz w:val="18"/>
         </w:rPr>
-        <w:t>('Сделай игру.')</w:t>
+        <w:t>(Драйвер)</w:t>
       </w:r>
     </w:p>
     <w:p>
@@ -634,7 +634,7 @@
           <w:color w:val="0F172A"/>
           <w:sz w:val="19"/>
         </w:rPr>
-        <w:t xml:space="preserve">'Menga eng chiroyli ranglarni ayt.' </w:t>
+        <w:t xml:space="preserve">Piksel </w:t>
       </w:r>
       <w:r>
         <w:rPr>
@@ -642,7 +642,7 @@
           <w:color w:val="505F73"/>
           <w:sz w:val="18"/>
         </w:rPr>
-        <w:t>('Назови мне самые красивые цвета.')</w:t>
+        <w:t>(Пиксель)</w:t>
       </w:r>
     </w:p>
     <w:p>
@@ -663,7 +663,7 @@
           <w:color w:val="0F172A"/>
           <w:sz w:val="19"/>
         </w:rPr>
-        <w:t xml:space="preserve">'Kompyuterimni tezlashtirib ber.' </w:t>
+        <w:t xml:space="preserve">Kabel </w:t>
       </w:r>
       <w:r>
         <w:rPr>
@@ -671,7 +671,7 @@
           <w:color w:val="505F73"/>
           <w:sz w:val="18"/>
         </w:rPr>
-        <w:t>('Ускорь мой компьютер.')</w:t>
+        <w:t>(Сетевой кабель)</w:t>
       </w:r>
     </w:p>
     <w:p>
@@ -693,7 +693,7 @@
           <w:color w:val="0F172A"/>
           <w:sz w:val="20"/>
         </w:rPr>
-        <w:t xml:space="preserve">Veb-sahifada 2D o'yin grafikasini chizish uchun qaysi maxsus HTML tegi ishlatiladi? </w:t>
+        <w:t xml:space="preserve">AI bilan muloqotda eng sifatli javob olish uchun prompt qanday tuzilishi kerak? </w:t>
       </w:r>
       <w:r>
         <w:rPr>
@@ -702,7 +702,7 @@
           <w:color w:val="475569"/>
           <w:sz w:val="19"/>
         </w:rPr>
-        <w:t>(Какой специальный HTML-тег используется для рисования 2D-графики и игр в браузере?)</w:t>
+        <w:t>(Из каких ключевых элементов строится действительно качественный и результативный промпт?)</w:t>
       </w:r>
     </w:p>
     <w:p>
@@ -720,10 +720,18 @@
       </w:r>
       <w:r>
         <w:rPr>
-          <w:color w:val="1E293B"/>
+          <w:color w:val="0F172A"/>
           <w:sz w:val="19"/>
         </w:rPr>
-        <w:t>&lt;button&gt;</w:t>
+        <w:t xml:space="preserve">Faqat bitta so'z yozish kifoya. </w:t>
+      </w:r>
+      <w:r>
+        <w:rPr>
+          <w:i/>
+          <w:color w:val="505F73"/>
+          <w:sz w:val="18"/>
+        </w:rPr>
+        <w:t>(Достаточно написать всего одно короткое слово.)</w:t>
       </w:r>
     </w:p>
     <w:p>
@@ -741,10 +749,18 @@
       </w:r>
       <w:r>
         <w:rPr>
-          <w:color w:val="1E293B"/>
+          <w:color w:val="0F172A"/>
           <w:sz w:val="19"/>
         </w:rPr>
-        <w:t>&lt;input&gt;</w:t>
+        <w:t xml:space="preserve">Faqat katta harflar bilan yozilishi shart. </w:t>
+      </w:r>
+      <w:r>
+        <w:rPr>
+          <w:i/>
+          <w:color w:val="505F73"/>
+          <w:sz w:val="18"/>
+        </w:rPr>
+        <w:t>(Текст должен быть написан исключительно заглавными буквами.)</w:t>
       </w:r>
     </w:p>
     <w:p>
@@ -762,10 +778,18 @@
       </w:r>
       <w:r>
         <w:rPr>
-          <w:color w:val="1E293B"/>
+          <w:color w:val="0F172A"/>
           <w:sz w:val="19"/>
         </w:rPr>
-        <w:t>&lt;audio&gt;</w:t>
+        <w:t xml:space="preserve">Faqat ingliz tilida yozilishi kerak, o'zbekcha yozish taqiqlanadi. </w:t>
+      </w:r>
+      <w:r>
+        <w:rPr>
+          <w:i/>
+          <w:color w:val="505F73"/>
+          <w:sz w:val="18"/>
+        </w:rPr>
+        <w:t>(Писать можно строго на английском языке, русский язык запрещен.)</w:t>
       </w:r>
     </w:p>
     <w:p>
@@ -783,10 +807,18 @@
       </w:r>
       <w:r>
         <w:rPr>
-          <w:color w:val="1E293B"/>
+          <w:color w:val="0F172A"/>
           <w:sz w:val="19"/>
         </w:rPr>
-        <w:t>&lt;canvas&gt;</w:t>
+        <w:t xml:space="preserve">Rol (Sen kimsan), Vazifa (Nima qilish kerak), Kontekst va Natija formati aniq ko'rsatilishi kerak. </w:t>
+      </w:r>
+      <w:r>
+        <w:rPr>
+          <w:i/>
+          <w:color w:val="505F73"/>
+          <w:sz w:val="18"/>
+        </w:rPr>
+        <w:t>(Роль (Кем выступает AI), Задача (Что сделать), Контекст (Условия) и Формат итогового ответа.)</w:t>
       </w:r>
     </w:p>
     <w:p>
@@ -804,10 +836,18 @@
       </w:r>
       <w:r>
         <w:rPr>
-          <w:color w:val="1E293B"/>
+          <w:color w:val="0F172A"/>
           <w:sz w:val="19"/>
         </w:rPr>
-        <w:t>&lt;link&gt;</w:t>
+        <w:t xml:space="preserve">Har doim nuqtalarsiz yozilishi kerak. </w:t>
+      </w:r>
+      <w:r>
+        <w:rPr>
+          <w:i/>
+          <w:color w:val="505F73"/>
+          <w:sz w:val="18"/>
+        </w:rPr>
+        <w:t>(В тексте нельзя ставить точки и знаки препинания.)</w:t>
       </w:r>
     </w:p>
     <w:p>
@@ -829,7 +869,7 @@
           <w:color w:val="0F172A"/>
           <w:sz w:val="20"/>
         </w:rPr>
-        <w:t xml:space="preserve">Canvas maydonida koordinatalar boshlang'ich nuqtasi (X: 0, Y: 0) qayerda joylashgan bo'ladi? </w:t>
+        <w:t xml:space="preserve">Nega 'Menga sayt qilib ber' prompti yomon, lekin 'Menga bolalar uchun interaktiv matematika viktorinasi HTML/CSS kodini yozib ber' prompti yaxshi? </w:t>
       </w:r>
       <w:r>
         <w:rPr>
@@ -838,7 +878,7 @@
           <w:color w:val="475569"/>
           <w:sz w:val="19"/>
         </w:rPr>
-        <w:t>(Где находится начальная точка координат (X: 0, Y: 0) на холсте Canvas?)</w:t>
+        <w:t>(Почему промпт 'Сделай мне сайт' плохой, а 'Создай интерактивную викторину по математике на HTML/CSS для 5 класса' — хороший?)</w:t>
       </w:r>
     </w:p>
     <w:p>
@@ -859,7 +899,7 @@
           <w:color w:val="0F172A"/>
           <w:sz w:val="19"/>
         </w:rPr>
-        <w:t xml:space="preserve">Ekran markazida. </w:t>
+        <w:t xml:space="preserve">Chunki ikkinchisi qisqaroq. </w:t>
       </w:r>
       <w:r>
         <w:rPr>
@@ -867,7 +907,7 @@
           <w:color w:val="505F73"/>
           <w:sz w:val="18"/>
         </w:rPr>
-        <w:t>(Точно в центре экрана.)</w:t>
+        <w:t>(Потому что второй промпт гораздо короче первого.)</w:t>
       </w:r>
     </w:p>
     <w:p>
@@ -888,7 +928,7 @@
           <w:color w:val="0F172A"/>
           <w:sz w:val="19"/>
         </w:rPr>
-        <w:t xml:space="preserve">Canvasning eng chap yuqori burchagida. </w:t>
+        <w:t xml:space="preserve">Chunki ikkinchi promptda maqsad, mavzu, auditoriya va kerakli texnologiya aniq ko'rsatilgan. </w:t>
       </w:r>
       <w:r>
         <w:rPr>
@@ -896,7 +936,7 @@
           <w:color w:val="505F73"/>
           <w:sz w:val="18"/>
         </w:rPr>
-        <w:t>(В самом верхнем левом углу холста Canvas.)</w:t>
+        <w:t>(Потому что во втором промпте четко определены цель, предмет, целевая аудитория и стек технологий.)</w:t>
       </w:r>
     </w:p>
     <w:p>
@@ -917,7 +957,7 @@
           <w:color w:val="0F172A"/>
           <w:sz w:val="19"/>
         </w:rPr>
-        <w:t xml:space="preserve">O'ng pastki burchakda. </w:t>
+        <w:t xml:space="preserve">Chunki birinchi promptda xatolar ko'p. </w:t>
       </w:r>
       <w:r>
         <w:rPr>
@@ -925,7 +965,7 @@
           <w:color w:val="505F73"/>
           <w:sz w:val="18"/>
         </w:rPr>
-        <w:t>(В правом нижнем углу.)</w:t>
+        <w:t>(Потому что в первом промпте много орфографических ошибок.)</w:t>
       </w:r>
     </w:p>
     <w:p>
@@ -946,7 +986,7 @@
           <w:color w:val="0F172A"/>
           <w:sz w:val="19"/>
         </w:rPr>
-        <w:t xml:space="preserve">Faqat kompyuter sichqonchasi turgan joyda. </w:t>
+        <w:t xml:space="preserve">Chunki AI bolalarni yoqtirmaydi. </w:t>
       </w:r>
       <w:r>
         <w:rPr>
@@ -954,7 +994,7 @@
           <w:color w:val="505F73"/>
           <w:sz w:val="18"/>
         </w:rPr>
-        <w:t>(В месте, где находится курсор мыши.)</w:t>
+        <w:t>(Потому что нейросети не умеют работать с сайтами.)</w:t>
       </w:r>
     </w:p>
     <w:p>
@@ -975,7 +1015,7 @@
           <w:color w:val="0F172A"/>
           <w:sz w:val="19"/>
         </w:rPr>
-        <w:t xml:space="preserve">Klaviaturaning 'Space' tugmasi ostida. </w:t>
+        <w:t xml:space="preserve">Ikkalasi ham bir xil natija beradi. </w:t>
       </w:r>
       <w:r>
         <w:rPr>
@@ -983,7 +1023,7 @@
           <w:color w:val="505F73"/>
           <w:sz w:val="18"/>
         </w:rPr>
-        <w:t>(Под клавишей 'Space' на клавиатуре.)</w:t>
+        <w:t>(Оба промпта выдадут абсолютно одинаковый результат.)</w:t>
       </w:r>
     </w:p>
     <w:p>
@@ -1005,7 +1045,7 @@
           <w:color w:val="0F172A"/>
           <w:sz w:val="20"/>
         </w:rPr>
-        <w:t xml:space="preserve">JavaScript-da o'yinchining to'plagan ballarini (Score) saqlash uchun qaysi kalit so'z bilan o'zgaruvchi e'lon qilinadi? </w:t>
+        <w:t xml:space="preserve">AI bilan suhbatda 'Rol berish' (Role Prompting) usuli nima uchun ishlatiladi? </w:t>
       </w:r>
       <w:r>
         <w:rPr>
@@ -1014,7 +1054,7 @@
           <w:color w:val="475569"/>
           <w:sz w:val="19"/>
         </w:rPr>
-        <w:t>(С помощью какого ключевого слова в JavaScript объявляется переменная для хранения счета (Score) игры?)</w:t>
+        <w:t>(Зачем в начале промпта задают роль нейросети (Role Prompting, например: 'Ты опытный фронтенд-разработчик')?)</w:t>
       </w:r>
     </w:p>
     <w:p>
@@ -1032,10 +1072,18 @@
       </w:r>
       <w:r>
         <w:rPr>
-          <w:color w:val="1E293B"/>
+          <w:color w:val="0F172A"/>
           <w:sz w:val="19"/>
         </w:rPr>
-        <w:t>function score = 0;</w:t>
+        <w:t xml:space="preserve">AI ning rangini o'zgartirish uchun. </w:t>
+      </w:r>
+      <w:r>
+        <w:rPr>
+          <w:i/>
+          <w:color w:val="505F73"/>
+          <w:sz w:val="18"/>
+        </w:rPr>
+        <w:t>(Чтобы изменить цвет интерфейса чата.)</w:t>
       </w:r>
     </w:p>
     <w:p>
@@ -1053,10 +1101,18 @@
       </w:r>
       <w:r>
         <w:rPr>
-          <w:color w:val="1E293B"/>
+          <w:color w:val="0F172A"/>
           <w:sz w:val="19"/>
         </w:rPr>
-        <w:t>print score;</w:t>
+        <w:t xml:space="preserve">Kompyuter ovozini balandlatish uchun. </w:t>
+      </w:r>
+      <w:r>
+        <w:rPr>
+          <w:i/>
+          <w:color w:val="505F73"/>
+          <w:sz w:val="18"/>
+        </w:rPr>
+        <w:t>(Чтобы увеличить громкость колонок компьютера.)</w:t>
       </w:r>
     </w:p>
     <w:p>
@@ -1074,10 +1130,18 @@
       </w:r>
       <w:r>
         <w:rPr>
-          <w:color w:val="1E293B"/>
+          <w:color w:val="0F172A"/>
           <w:sz w:val="19"/>
         </w:rPr>
-        <w:t>css score: 0;</w:t>
+        <w:t xml:space="preserve">Internet tezligini oshirish uchun. </w:t>
+      </w:r>
+      <w:r>
+        <w:rPr>
+          <w:i/>
+          <w:color w:val="505F73"/>
+          <w:sz w:val="18"/>
+        </w:rPr>
+        <w:t>(Чтобы повысить скорость домашнего интернета.)</w:t>
       </w:r>
     </w:p>
     <w:p>
@@ -1095,10 +1159,18 @@
       </w:r>
       <w:r>
         <w:rPr>
-          <w:color w:val="1E293B"/>
+          <w:color w:val="0F172A"/>
           <w:sz w:val="19"/>
         </w:rPr>
-        <w:t>html score;</w:t>
+        <w:t xml:space="preserve">Faqat o'yin qahramonlarini chizish uchun. </w:t>
+      </w:r>
+      <w:r>
+        <w:rPr>
+          <w:i/>
+          <w:color w:val="505F73"/>
+          <w:sz w:val="18"/>
+        </w:rPr>
+        <w:t>(Исключительно для генерации картинок.)</w:t>
       </w:r>
     </w:p>
     <w:p>
@@ -1116,10 +1188,18 @@
       </w:r>
       <w:r>
         <w:rPr>
-          <w:color w:val="1E293B"/>
+          <w:color w:val="0F172A"/>
           <w:sz w:val="19"/>
         </w:rPr>
-        <w:t>let score = 0;</w:t>
+        <w:t xml:space="preserve">AI ni ma'lum bir mutaxassis (masalan, 'Sen tajribali frontend dasturchisan') sifatida fikrlashga va professional javob berishga yo'naltirish uchun. </w:t>
+      </w:r>
+      <w:r>
+        <w:rPr>
+          <w:i/>
+          <w:color w:val="505F73"/>
+          <w:sz w:val="18"/>
+        </w:rPr>
+        <w:t>(Чтобы настроить модель на профессиональный стиль мышления, правильную терминологию и лучшие отраслевые практики.)</w:t>
       </w:r>
     </w:p>
     <w:p>
@@ -1141,7 +1221,7 @@
           <w:color w:val="0F172A"/>
           <w:sz w:val="20"/>
         </w:rPr>
-        <w:t xml:space="preserve">Qahramonni klaviatura strelkalari bilan boshqarish uchun brauzerning qaysi hodisasi (event) eshitiladi? </w:t>
+        <w:t xml:space="preserve">Sun'iy intellektning 'Gallyutsinatsiyasi' (Hallucination) nima? </w:t>
       </w:r>
       <w:r>
         <w:rPr>
@@ -1150,7 +1230,7 @@
           <w:color w:val="475569"/>
           <w:sz w:val="19"/>
         </w:rPr>
-        <w:t>(Какое браузерное событие (Event) слушают для управления персонажем с помощью клавиатуры?)</w:t>
+        <w:t>(Что в сфере искусственного интеллекта называют 'Галлюцинацией' (Hallucination)?)</w:t>
       </w:r>
     </w:p>
     <w:p>
@@ -1168,10 +1248,18 @@
       </w:r>
       <w:r>
         <w:rPr>
-          <w:color w:val="1E293B"/>
+          <w:color w:val="0F172A"/>
           <w:sz w:val="19"/>
         </w:rPr>
-        <w:t>keydown</w:t>
+        <w:t xml:space="preserve">AI ning bilmagan narsasini xuddi haqiqatdek ishonch bilan to'qib chiqarishi (noto'g'ri fakt aytishi). </w:t>
+      </w:r>
+      <w:r>
+        <w:rPr>
+          <w:i/>
+          <w:color w:val="505F73"/>
+          <w:sz w:val="18"/>
+        </w:rPr>
+        <w:t>(Уверенное сочинение несуществующих фактов, правил или данных, выдаваемых моделью за чистую правду.)</w:t>
       </w:r>
     </w:p>
     <w:p>
@@ -1189,10 +1277,18 @@
       </w:r>
       <w:r>
         <w:rPr>
-          <w:color w:val="1E293B"/>
+          <w:color w:val="0F172A"/>
           <w:sz w:val="19"/>
         </w:rPr>
-        <w:t>onclose</w:t>
+        <w:t xml:space="preserve">AI ning kompyuterni o'chirib qo'yishi. </w:t>
+      </w:r>
+      <w:r>
+        <w:rPr>
+          <w:i/>
+          <w:color w:val="505F73"/>
+          <w:sz w:val="18"/>
+        </w:rPr>
+        <w:t>(Внезапное выключение монитора.)</w:t>
       </w:r>
     </w:p>
     <w:p>
@@ -1210,10 +1306,18 @@
       </w:r>
       <w:r>
         <w:rPr>
-          <w:color w:val="1E293B"/>
+          <w:color w:val="0F172A"/>
           <w:sz w:val="19"/>
         </w:rPr>
-        <w:t>onclick</w:t>
+        <w:t xml:space="preserve">AI ning juda tez ishlashi. </w:t>
+      </w:r>
+      <w:r>
+        <w:rPr>
+          <w:i/>
+          <w:color w:val="505F73"/>
+          <w:sz w:val="18"/>
+        </w:rPr>
+        <w:t>(Сверхбыструю работу видеокарты.)</w:t>
       </w:r>
     </w:p>
     <w:p>
@@ -1231,10 +1335,18 @@
       </w:r>
       <w:r>
         <w:rPr>
-          <w:color w:val="1E293B"/>
+          <w:color w:val="0F172A"/>
           <w:sz w:val="19"/>
         </w:rPr>
-        <w:t>onload</w:t>
+        <w:t xml:space="preserve">AI ning rasm chiza olmasligi. </w:t>
+      </w:r>
+      <w:r>
+        <w:rPr>
+          <w:i/>
+          <w:color w:val="505F73"/>
+          <w:sz w:val="18"/>
+        </w:rPr>
+        <w:t>(Неспособность нейросети генерировать смайлики.)</w:t>
       </w:r>
     </w:p>
     <w:p>
@@ -1252,10 +1364,18 @@
       </w:r>
       <w:r>
         <w:rPr>
-          <w:color w:val="1E293B"/>
+          <w:color w:val="0F172A"/>
           <w:sz w:val="19"/>
         </w:rPr>
-        <w:t>oncopy</w:t>
+        <w:t xml:space="preserve">AI ning internetga ulanishi. </w:t>
+      </w:r>
+      <w:r>
+        <w:rPr>
+          <w:i/>
+          <w:color w:val="505F73"/>
+          <w:sz w:val="18"/>
+        </w:rPr>
+        <w:t>(Автоматическое обновление драйверов.)</w:t>
       </w:r>
     </w:p>
     <w:p>
@@ -1277,7 +1397,7 @@
           <w:color w:val="0F172A"/>
           <w:sz w:val="20"/>
         </w:rPr>
-        <w:t xml:space="preserve">O'yinda silliq animatsiya yaratish va ekranni sekundiga 60 marta yangilash uchun qaysi zamonaviy funksiya chaqiriladi? </w:t>
+        <w:t xml:space="preserve">Murakkab masalalarni yechishda AI ga 'Qadam-baqadam o'yla' (Think step by step / Chain of Thought) deyilsa nima yuz beradi? </w:t>
       </w:r>
       <w:r>
         <w:rPr>
@@ -1286,7 +1406,7 @@
           <w:color w:val="475569"/>
           <w:sz w:val="19"/>
         </w:rPr>
-        <w:t>(Какая функция используется в современных браузерах для плавной анимации игры со скоростью 60 кадров в секунду (FPS)?)</w:t>
+        <w:t>(Что происходит при добавлении в промпт фразы 'Думай шаг за шагом' (Think step by step / Chain of Thought)?)</w:t>
       </w:r>
     </w:p>
     <w:p>
@@ -1304,10 +1424,18 @@
       </w:r>
       <w:r>
         <w:rPr>
-          <w:color w:val="1E293B"/>
+          <w:color w:val="0F172A"/>
           <w:sz w:val="19"/>
         </w:rPr>
-        <w:t>setTimeout10()</w:t>
+        <w:t xml:space="preserve">AI javob berishdan bosh tortadi. </w:t>
+      </w:r>
+      <w:r>
+        <w:rPr>
+          <w:i/>
+          <w:color w:val="505F73"/>
+          <w:sz w:val="18"/>
+        </w:rPr>
+        <w:t>(Нейросеть полностью отказывается отвечать.)</w:t>
       </w:r>
     </w:p>
     <w:p>
@@ -1325,10 +1453,18 @@
       </w:r>
       <w:r>
         <w:rPr>
-          <w:color w:val="1E293B"/>
+          <w:color w:val="0F172A"/>
           <w:sz w:val="19"/>
         </w:rPr>
-        <w:t>stopGame()</w:t>
+        <w:t xml:space="preserve">Kompyuter xotirasi to'lib qoladi. </w:t>
+      </w:r>
+      <w:r>
+        <w:rPr>
+          <w:i/>
+          <w:color w:val="505F73"/>
+          <w:sz w:val="18"/>
+        </w:rPr>
+        <w:t>(Оперативная память компьютера моментально переполняется.)</w:t>
       </w:r>
     </w:p>
     <w:p>
@@ -1346,10 +1482,18 @@
       </w:r>
       <w:r>
         <w:rPr>
-          <w:color w:val="1E293B"/>
+          <w:color w:val="0F172A"/>
           <w:sz w:val="19"/>
         </w:rPr>
-        <w:t>alert()</w:t>
+        <w:t xml:space="preserve">Faqat 1 ta so'zdan iborat javob qaytadi. </w:t>
+      </w:r>
+      <w:r>
+        <w:rPr>
+          <w:i/>
+          <w:color w:val="505F73"/>
+          <w:sz w:val="18"/>
+        </w:rPr>
+        <w:t>(Ответ состоит строго из одного слова.)</w:t>
       </w:r>
     </w:p>
     <w:p>
@@ -1367,10 +1511,18 @@
       </w:r>
       <w:r>
         <w:rPr>
-          <w:color w:val="1E293B"/>
+          <w:color w:val="0F172A"/>
           <w:sz w:val="19"/>
         </w:rPr>
-        <w:t>console.clear()</w:t>
+        <w:t xml:space="preserve">Matn teskari tartibda chiqadi. </w:t>
+      </w:r>
+      <w:r>
+        <w:rPr>
+          <w:i/>
+          <w:color w:val="505F73"/>
+          <w:sz w:val="18"/>
+        </w:rPr>
+        <w:t>(Текст ответа переворачивается задом наперед.)</w:t>
       </w:r>
     </w:p>
     <w:p>
@@ -1388,10 +1540,18 @@
       </w:r>
       <w:r>
         <w:rPr>
-          <w:color w:val="1E293B"/>
+          <w:color w:val="0F172A"/>
           <w:sz w:val="19"/>
         </w:rPr>
-        <w:t>requestAnimationFrame(gameLoop)</w:t>
+        <w:t xml:space="preserve">AI masalani mantiqiy bo'laklarga bo'lib tahlil qiladi va xatoliklar ehtimoli keskin kamayadi. </w:t>
+      </w:r>
+      <w:r>
+        <w:rPr>
+          <w:i/>
+          <w:color w:val="505F73"/>
+          <w:sz w:val="18"/>
+        </w:rPr>
+        <w:t>(Модель разбивает решение сложной задачи на последовательные логические шаги, многократно снижая риск ошибки.)</w:t>
       </w:r>
     </w:p>
     <w:p>
@@ -1413,7 +1573,7 @@
           <w:color w:val="0F172A"/>
           <w:sz w:val="20"/>
         </w:rPr>
-        <w:t xml:space="preserve">Qahramon har bir kadrdan oldin o'zining eski izlarini o'chirishi uchun Canvasda qaysi buyruq bajarilishi shart? </w:t>
+        <w:t xml:space="preserve">AI chatida 'Kontekst' (Context) nima? </w:t>
       </w:r>
       <w:r>
         <w:rPr>
@@ -1422,7 +1582,7 @@
           <w:color w:val="475569"/>
           <w:sz w:val="19"/>
         </w:rPr>
-        <w:t>(Какую команду необходимо вызывать перед рисованием каждого нового кадра, чтобы персонаж не оставлял за собой шлейф (следы)?)</w:t>
+        <w:t>(Что представляет собой 'Контекст' (Context) в окне диалога с искусственным интеллектом?)</w:t>
       </w:r>
     </w:p>
     <w:p>
@@ -1440,10 +1600,18 @@
       </w:r>
       <w:r>
         <w:rPr>
-          <w:color w:val="1E293B"/>
+          <w:color w:val="0F172A"/>
           <w:sz w:val="19"/>
         </w:rPr>
-        <w:t>ctx.save()</w:t>
+        <w:t xml:space="preserve">Kompyuter sichqonchasining o'ng tugmasi. </w:t>
+      </w:r>
+      <w:r>
+        <w:rPr>
+          <w:i/>
+          <w:color w:val="505F73"/>
+          <w:sz w:val="18"/>
+        </w:rPr>
+        <w:t>(Правая кнопка компьютерной мыши.)</w:t>
       </w:r>
     </w:p>
     <w:p>
@@ -1461,10 +1629,18 @@
       </w:r>
       <w:r>
         <w:rPr>
-          <w:color w:val="1E293B"/>
+          <w:color w:val="0F172A"/>
           <w:sz w:val="19"/>
         </w:rPr>
-        <w:t>canvas.remove()</w:t>
+        <w:t xml:space="preserve">Faqat monitordagi piksellar soni. </w:t>
+      </w:r>
+      <w:r>
+        <w:rPr>
+          <w:i/>
+          <w:color w:val="505F73"/>
+          <w:sz w:val="18"/>
+        </w:rPr>
+        <w:t>(Общее количество точек на экране монитора.)</w:t>
       </w:r>
     </w:p>
     <w:p>
@@ -1482,10 +1658,18 @@
       </w:r>
       <w:r>
         <w:rPr>
-          <w:color w:val="1E293B"/>
+          <w:color w:val="0F172A"/>
           <w:sz w:val="19"/>
         </w:rPr>
-        <w:t>ctx.clearRect(0, 0, canvas.width, canvas.height)</w:t>
+        <w:t xml:space="preserve">Suhbat davomida avval yozilgan xabarlar, berilgan qoidalar va ma'lumotlar tarixi. </w:t>
+      </w:r>
+      <w:r>
+        <w:rPr>
+          <w:i/>
+          <w:color w:val="505F73"/>
+          <w:sz w:val="18"/>
+        </w:rPr>
+        <w:t>(История предыдущих сообщений, исходные файлы, правила и инструкции в рамках текущего диалога.)</w:t>
       </w:r>
     </w:p>
     <w:p>
@@ -1503,10 +1687,18 @@
       </w:r>
       <w:r>
         <w:rPr>
-          <w:color w:val="1E293B"/>
+          <w:color w:val="0F172A"/>
           <w:sz w:val="19"/>
         </w:rPr>
-        <w:t>window.close()</w:t>
+        <w:t xml:space="preserve">Fayllarning fayl kengaytmasi. </w:t>
+      </w:r>
+      <w:r>
+        <w:rPr>
+          <w:i/>
+          <w:color w:val="505F73"/>
+          <w:sz w:val="18"/>
+        </w:rPr>
+        <w:t>(Расширение файла на жестком диске.)</w:t>
       </w:r>
     </w:p>
     <w:p>
@@ -1524,10 +1716,18 @@
       </w:r>
       <w:r>
         <w:rPr>
-          <w:color w:val="1E293B"/>
+          <w:color w:val="0F172A"/>
           <w:sz w:val="19"/>
         </w:rPr>
-        <w:t>ctx.stroke()</w:t>
+        <w:t xml:space="preserve">Internet provayderining nomi. </w:t>
+      </w:r>
+      <w:r>
+        <w:rPr>
+          <w:i/>
+          <w:color w:val="505F73"/>
+          <w:sz w:val="18"/>
+        </w:rPr>
+        <w:t>(Название интернет-браузера.)</w:t>
       </w:r>
     </w:p>
     <w:p>
@@ -1549,7 +1749,7 @@
           <w:color w:val="0F172A"/>
           <w:sz w:val="20"/>
         </w:rPr>
-        <w:t xml:space="preserve">O'yinda to'rtburchak qahramon chizish uchun qaysi Canvas metodi ishlatiladi? </w:t>
+        <w:t xml:space="preserve">AI yordamida interaktiv tugma kodi yaratilganda, uni o'z kompyuteringizda qanday tekshirasiz? </w:t>
       </w:r>
       <w:r>
         <w:rPr>
@@ -1558,7 +1758,7 @@
           <w:color w:val="475569"/>
           <w:sz w:val="19"/>
         </w:rPr>
-        <w:t>(Какой метод Canvas используется для отрисовки прямоугольного персонажа или блока?)</w:t>
+        <w:t>(Как проверить работоспособность веб-страницы или интерактивной кнопки, код которой написал AI?)</w:t>
       </w:r>
     </w:p>
     <w:p>
@@ -1576,10 +1776,18 @@
       </w:r>
       <w:r>
         <w:rPr>
-          <w:color w:val="1E293B"/>
+          <w:color w:val="0F172A"/>
           <w:sz w:val="19"/>
         </w:rPr>
-        <w:t>ctx.drawCircle()</w:t>
+        <w:t xml:space="preserve">Kodni qog'ozga ruchka bilan yozib qo'yish orqali. </w:t>
+      </w:r>
+      <w:r>
+        <w:rPr>
+          <w:i/>
+          <w:color w:val="505F73"/>
+          <w:sz w:val="18"/>
+        </w:rPr>
+        <w:t>(Переписать весь код шариковой ручкой в тетрадь.)</w:t>
       </w:r>
     </w:p>
     <w:p>
@@ -1597,10 +1805,18 @@
       </w:r>
       <w:r>
         <w:rPr>
-          <w:color w:val="1E293B"/>
+          <w:color w:val="0F172A"/>
           <w:sz w:val="19"/>
         </w:rPr>
-        <w:t>ctx.fillRect(x, y, width, height)</w:t>
+        <w:t xml:space="preserve">Kodni `.html` kengaytmali faylga saqlab, istalgan brauzerda (Chrome, Edge) ikki marta bosib ochish orqali. </w:t>
+      </w:r>
+      <w:r>
+        <w:rPr>
+          <w:i/>
+          <w:color w:val="505F73"/>
+          <w:sz w:val="18"/>
+        </w:rPr>
+        <w:t>(Сохранить код в файл с расширением `.html` и открыть его двойным кликом в любом браузере (Chrome, Edge).)</w:t>
       </w:r>
     </w:p>
     <w:p>
@@ -1618,10 +1834,18 @@
       </w:r>
       <w:r>
         <w:rPr>
-          <w:color w:val="1E293B"/>
+          <w:color w:val="0F172A"/>
           <w:sz w:val="19"/>
         </w:rPr>
-        <w:t>ctx.fillText()</w:t>
+        <w:t xml:space="preserve">Faqat Word dasturida ochish orqali. </w:t>
+      </w:r>
+      <w:r>
+        <w:rPr>
+          <w:i/>
+          <w:color w:val="505F73"/>
+          <w:sz w:val="18"/>
+        </w:rPr>
+        <w:t>(Открыть файл исключительно в программе Microsoft Word.)</w:t>
       </w:r>
     </w:p>
     <w:p>
@@ -1639,10 +1863,18 @@
       </w:r>
       <w:r>
         <w:rPr>
-          <w:color w:val="1E293B"/>
+          <w:color w:val="0F172A"/>
           <w:sz w:val="19"/>
         </w:rPr>
-        <w:t>ctx.beginPath()</w:t>
+        <w:t xml:space="preserve">Faylni printerga yuborish orqali. </w:t>
+      </w:r>
+      <w:r>
+        <w:rPr>
+          <w:i/>
+          <w:color w:val="505F73"/>
+          <w:sz w:val="18"/>
+        </w:rPr>
+        <w:t>(Отправить файл на печать на принтер.)</w:t>
       </w:r>
     </w:p>
     <w:p>
@@ -1660,10 +1892,18 @@
       </w:r>
       <w:r>
         <w:rPr>
-          <w:color w:val="1E293B"/>
+          <w:color w:val="0F172A"/>
           <w:sz w:val="19"/>
         </w:rPr>
-        <w:t>ctx.createButton()</w:t>
+        <w:t xml:space="preserve">Kodni ovoz chiqarib o'qish orqali. </w:t>
+      </w:r>
+      <w:r>
+        <w:rPr>
+          <w:i/>
+          <w:color w:val="505F73"/>
+          <w:sz w:val="18"/>
+        </w:rPr>
+        <w:t>(Прочитать текст кода вслух в микрофон.)</w:t>
       </w:r>
     </w:p>
     <w:p>
@@ -1685,7 +1925,7 @@
           <w:color w:val="0F172A"/>
           <w:sz w:val="20"/>
         </w:rPr>
-        <w:t xml:space="preserve">Qahramon tikan yoki lazerga tekkanini (to'qnashuvni) aniqlash dasturlashda nima deb ataladi? </w:t>
+        <w:t xml:space="preserve">AI yozib bergan veb-sahifada tugma bosilganda ishlamasa, Vibecoding uslubida nima qilish kerak? </w:t>
       </w:r>
       <w:r>
         <w:rPr>
@@ -1694,7 +1934,7 @@
           <w:color w:val="475569"/>
           <w:sz w:val="19"/>
         </w:rPr>
-        <w:t>(Как в разработке игр называется механизм определения столкновения персонажа с препятствием или шипом?)</w:t>
+        <w:t>(Если код от нейросети не работает или выдает ошибку, как поступить в парадигме Vibecoding?)</w:t>
       </w:r>
     </w:p>
     <w:p>
@@ -1715,7 +1955,7 @@
           <w:color w:val="0F172A"/>
           <w:sz w:val="19"/>
         </w:rPr>
-        <w:t xml:space="preserve">Audio Sintezi </w:t>
+        <w:t xml:space="preserve">Kompyuterni qayta ishga tushirish kerak. </w:t>
       </w:r>
       <w:r>
         <w:rPr>
@@ -1723,7 +1963,7 @@
           <w:color w:val="505F73"/>
           <w:sz w:val="18"/>
         </w:rPr>
-        <w:t>(Аудио-синтез)</w:t>
+        <w:t>(Срочно выдернуть шнур питания из розетки.)</w:t>
       </w:r>
     </w:p>
     <w:p>
@@ -1744,7 +1984,7 @@
           <w:color w:val="0F172A"/>
           <w:sz w:val="19"/>
         </w:rPr>
-        <w:t xml:space="preserve">Screen Recording </w:t>
+        <w:t xml:space="preserve">Barcha fayllarni o'chirib tashlash kerak. </w:t>
       </w:r>
       <w:r>
         <w:rPr>
@@ -1752,7 +1992,7 @@
           <w:color w:val="505F73"/>
           <w:sz w:val="18"/>
         </w:rPr>
-        <w:t>(Запись экрана)</w:t>
+        <w:t>(Удалить все файлы с компьютера.)</w:t>
       </w:r>
     </w:p>
     <w:p>
@@ -1773,7 +2013,7 @@
           <w:color w:val="0F172A"/>
           <w:sz w:val="19"/>
         </w:rPr>
-        <w:t xml:space="preserve">Auto-saving </w:t>
+        <w:t xml:space="preserve">Dasturlashni butunlay tashlash kerak. </w:t>
       </w:r>
       <w:r>
         <w:rPr>
@@ -1781,7 +2021,7 @@
           <w:color w:val="505F73"/>
           <w:sz w:val="18"/>
         </w:rPr>
-        <w:t>(Автосохранение)</w:t>
+        <w:t>(Навсегда бросить программирование.)</w:t>
       </w:r>
     </w:p>
     <w:p>
@@ -1802,7 +2042,7 @@
           <w:color w:val="0F172A"/>
           <w:sz w:val="19"/>
         </w:rPr>
-        <w:t xml:space="preserve">Collision Detection (To'qnashuvni tekshirish) </w:t>
+        <w:t xml:space="preserve">Brauzer konsolidagi (F12) xatolik matnini nusxalab, AI ga 'Bu kod ishlamadi, mana bu xato chiqdi, tuzatib ber' deb yuborish kerak. </w:t>
       </w:r>
       <w:r>
         <w:rPr>
@@ -1810,7 +2050,7 @@
           <w:color w:val="505F73"/>
           <w:sz w:val="18"/>
         </w:rPr>
-        <w:t>(Collision Detection (Определение столкновений))</w:t>
+        <w:t>(Скопировать текст ошибки из консоли браузера (F12) и отправить в AI с запросом: 'Кнопка не нажимается, вот ошибка, исправь код'.)</w:t>
       </w:r>
     </w:p>
     <w:p>
@@ -1831,7 +2071,7 @@
           <w:color w:val="0F172A"/>
           <w:sz w:val="19"/>
         </w:rPr>
-        <w:t xml:space="preserve">Theme Toggle </w:t>
+        <w:t xml:space="preserve">Tugmani qattiqroq bosish kerak. </w:t>
       </w:r>
       <w:r>
         <w:rPr>
@@ -1839,7 +2079,7 @@
           <w:color w:val="505F73"/>
           <w:sz w:val="18"/>
         </w:rPr>
-        <w:t>(Смена темы оформления)</w:t>
+        <w:t>(Нажимать на кнопку мыши с максимальной силой.)</w:t>
       </w:r>
     </w:p>
     <w:p>
@@ -1861,7 +2101,7 @@
           <w:color w:val="0F172A"/>
           <w:sz w:val="20"/>
         </w:rPr>
-        <w:t xml:space="preserve">Qahramon to'siqqa tekkanda uning joni (HP) kamayishi qanday shart bilan yoziladi? </w:t>
+        <w:t xml:space="preserve">Few-Shot Prompting (Misollar bilan o'rgatish) nima? </w:t>
       </w:r>
       <w:r>
         <w:rPr>
@@ -1870,7 +2110,7 @@
           <w:color w:val="475569"/>
           <w:sz w:val="19"/>
         </w:rPr>
-        <w:t>(Как правильно записать условие уменьшения жизней (HP) при столкновении с опасностью?)</w:t>
+        <w:t>(Что такое Few-Shot Prompting (обучение на примерах прямо в запросе)?)</w:t>
       </w:r>
     </w:p>
     <w:p>
@@ -1888,10 +2128,18 @@
       </w:r>
       <w:r>
         <w:rPr>
-          <w:color w:val="1E293B"/>
+          <w:color w:val="0F172A"/>
           <w:sz w:val="19"/>
         </w:rPr>
-        <w:t>if (hp &lt; 0) { hp = 100; }</w:t>
+        <w:t xml:space="preserve">AI ga umuman savol bermaslik. </w:t>
+      </w:r>
+      <w:r>
+        <w:rPr>
+          <w:i/>
+          <w:color w:val="505F73"/>
+          <w:sz w:val="18"/>
+        </w:rPr>
+        <w:t>(Полный отказ от использования текста.)</w:t>
       </w:r>
     </w:p>
     <w:p>
@@ -1909,10 +2157,18 @@
       </w:r>
       <w:r>
         <w:rPr>
-          <w:color w:val="1E293B"/>
+          <w:color w:val="0F172A"/>
           <w:sz w:val="19"/>
         </w:rPr>
-        <w:t>if (isColliding) { hp = hp - 1; }</w:t>
+        <w:t xml:space="preserve">Prompt ichida AI ga 1–2 ta savol-javob namunalarini ko'rsatib, keyingi javobni ham xuddi shu uslubda talab qilish. </w:t>
+      </w:r>
+      <w:r>
+        <w:rPr>
+          <w:i/>
+          <w:color w:val="505F73"/>
+          <w:sz w:val="18"/>
+        </w:rPr>
+        <w:t>(Добавление в текст промпта 1–2 готовых образцов 'вопрос-ответ', чтобы модель сформировала ответ в таком же стиле.)</w:t>
       </w:r>
     </w:p>
     <w:p>
@@ -1930,10 +2186,18 @@
       </w:r>
       <w:r>
         <w:rPr>
-          <w:color w:val="1E293B"/>
+          <w:color w:val="0F172A"/>
           <w:sz w:val="19"/>
         </w:rPr>
-        <w:t>while (true) { hp = 100; }</w:t>
+        <w:t xml:space="preserve">AI ga faqat bitta rasm yuborish. </w:t>
+      </w:r>
+      <w:r>
+        <w:rPr>
+          <w:i/>
+          <w:color w:val="505F73"/>
+          <w:sz w:val="18"/>
+        </w:rPr>
+        <w:t>(Отправка нейросети только одной картинки.)</w:t>
       </w:r>
     </w:p>
     <w:p>
@@ -1954,7 +2218,7 @@
           <w:color w:val="0F172A"/>
           <w:sz w:val="19"/>
         </w:rPr>
-        <w:t xml:space="preserve">let hp = 'o`yin'; </w:t>
+        <w:t xml:space="preserve">Kompyuter ekranini rasmga olish. </w:t>
       </w:r>
       <w:r>
         <w:rPr>
@@ -1962,7 +2226,7 @@
           <w:color w:val="505F73"/>
           <w:sz w:val="18"/>
         </w:rPr>
-        <w:t>(let hp = 'игра';)</w:t>
+        <w:t>(Снимок экрана монитора.)</w:t>
       </w:r>
     </w:p>
     <w:p>
@@ -1980,10 +2244,18 @@
       </w:r>
       <w:r>
         <w:rPr>
-          <w:color w:val="1E293B"/>
+          <w:color w:val="0F172A"/>
           <w:sz w:val="19"/>
         </w:rPr>
-        <w:t>score = hp + 10;</w:t>
+        <w:t xml:space="preserve">Faqat inglizcha lug'atdan foydalanish. </w:t>
+      </w:r>
+      <w:r>
+        <w:rPr>
+          <w:i/>
+          <w:color w:val="505F73"/>
+          <w:sz w:val="18"/>
+        </w:rPr>
+        <w:t>(Использование только англо-русского словаря.)</w:t>
       </w:r>
     </w:p>
     <w:p>
@@ -2005,7 +2277,7 @@
           <w:color w:val="0F172A"/>
           <w:sz w:val="20"/>
         </w:rPr>
-        <w:t xml:space="preserve">O'yinda jon (HP) 0 ga teng bo'lib qolsa, qanday holat yuz berishi kerak? </w:t>
+        <w:t xml:space="preserve">AI yordamida rasm generatsiya qilishda (Midjourney / Bing Image Creator) sifatli natija olish uchun qaysi parametrlar yoziladi? </w:t>
       </w:r>
       <w:r>
         <w:rPr>
@@ -2014,7 +2286,7 @@
           <w:color w:val="475569"/>
           <w:sz w:val="19"/>
         </w:rPr>
-        <w:t>(Что должно происходить в игре, когда количество жизней (HP) игрока опускается до нуля?)</w:t>
+        <w:t>(Какие параметры необходимо описать в промпте для генерации красивой иллюстрации в Midjourney или Bing Creator?)</w:t>
       </w:r>
     </w:p>
     <w:p>
@@ -2035,7 +2307,7 @@
           <w:color w:val="0F172A"/>
           <w:sz w:val="19"/>
         </w:rPr>
-        <w:t xml:space="preserve">Kompyuter o'chishi kerak. </w:t>
+        <w:t xml:space="preserve">Faqat 'Chiroyli rasm qil'. </w:t>
       </w:r>
       <w:r>
         <w:rPr>
@@ -2043,7 +2315,7 @@
           <w:color w:val="505F73"/>
           <w:sz w:val="18"/>
         </w:rPr>
-        <w:t>(Компьютер должен немедленно выключиться.)</w:t>
+        <w:t>(Только короткую фразу 'Сделай красиво'.)</w:t>
       </w:r>
     </w:p>
     <w:p>
@@ -2064,7 +2336,7 @@
           <w:color w:val="0F172A"/>
           <w:sz w:val="19"/>
         </w:rPr>
-        <w:t xml:space="preserve">O'yinchining barcha fayllari o'chirilishi kerak. </w:t>
+        <w:t xml:space="preserve">Faqat fayl hajmi (masalan, 5 megabayt). </w:t>
       </w:r>
       <w:r>
         <w:rPr>
@@ -2072,7 +2344,7 @@
           <w:color w:val="505F73"/>
           <w:sz w:val="18"/>
         </w:rPr>
-        <w:t>(С компьютера должны удалиться все файлы.)</w:t>
+        <w:t>(Исключительно размер файла в мегабайтах.)</w:t>
       </w:r>
     </w:p>
     <w:p>
@@ -2093,7 +2365,7 @@
           <w:color w:val="0F172A"/>
           <w:sz w:val="19"/>
         </w:rPr>
-        <w:t xml:space="preserve">Ballar avtomatik 1 000 000 bo'lishi kerak. </w:t>
+        <w:t xml:space="preserve">Kompyuterning IP-manzili. </w:t>
       </w:r>
       <w:r>
         <w:rPr>
@@ -2101,7 +2373,7 @@
           <w:color w:val="505F73"/>
           <w:sz w:val="18"/>
         </w:rPr>
-        <w:t>(Счетчик очков должен автоматически стать равным 1 000 000.)</w:t>
+        <w:t>(IP-адрес домашнего роутера.)</w:t>
       </w:r>
     </w:p>
     <w:p>
@@ -2122,7 +2394,7 @@
           <w:color w:val="0F172A"/>
           <w:sz w:val="19"/>
         </w:rPr>
-        <w:t xml:space="preserve">O'yin to'xtab, ekranda 'Game Over' (O'yin Tugadi) yozuvi chiqishi va qayta o'ynash tugmasi paydo bo'lishi kerak. </w:t>
+        <w:t xml:space="preserve">Obyekt, uning harakati, joylashgan muhiti, yorug'lik turi (masalan, kiberpank, neon, quyosh botishi) va badiiy uslub (3D, rasm, multfilm). </w:t>
       </w:r>
       <w:r>
         <w:rPr>
@@ -2130,7 +2402,7 @@
           <w:color w:val="505F73"/>
           <w:sz w:val="18"/>
         </w:rPr>
-        <w:t>(Игровой цикл останавливается, на экране появляется надпись 'Game Over' и кнопка 'Перезапуск' (Restart).)</w:t>
+        <w:t>(Объект, окружение, действие, тип освещения (неон, закат, кинематографичный свет) и стиль (3D-рендер, акварель, пиксель-арт).)</w:t>
       </w:r>
     </w:p>
     <w:p>
@@ -2151,7 +2423,7 @@
           <w:color w:val="0F172A"/>
           <w:sz w:val="19"/>
         </w:rPr>
-        <w:t xml:space="preserve">Internet o'chishi kerak. </w:t>
+        <w:t xml:space="preserve">Faqat o'quvchining telefon raqami. </w:t>
       </w:r>
       <w:r>
         <w:rPr>
@@ -2159,7 +2431,7 @@
           <w:color w:val="505F73"/>
           <w:sz w:val="18"/>
         </w:rPr>
-        <w:t>(Должен пропасть доступ в интернет.)</w:t>
+        <w:t>(Номер мобильного телефона пользователя.)</w:t>
       </w:r>
     </w:p>
     <w:p>
@@ -2181,7 +2453,7 @@
           <w:color w:val="0F172A"/>
           <w:sz w:val="20"/>
         </w:rPr>
-        <w:t xml:space="preserve">Qahramon oltin tanga yoki kristall ustidan yurganda ballni 10 taga oshirish kodi qaysi? </w:t>
+        <w:t xml:space="preserve">Rasm generatsiyasida 'Salbiy prompt' (Negative Prompt) nima uchun kerak? </w:t>
       </w:r>
       <w:r>
         <w:rPr>
@@ -2190,7 +2462,7 @@
           <w:color w:val="475569"/>
           <w:sz w:val="19"/>
         </w:rPr>
-        <w:t>(Какой код увеличивает счет игрока на 10 при сборе золотой монеты или кристалла?)</w:t>
+        <w:t>(Для чего в генерации изображений используется 'Отрицательный промпт' (Negative Prompt)?)</w:t>
       </w:r>
     </w:p>
     <w:p>
@@ -2208,10 +2480,18 @@
       </w:r>
       <w:r>
         <w:rPr>
-          <w:color w:val="1E293B"/>
+          <w:color w:val="0F172A"/>
           <w:sz w:val="19"/>
         </w:rPr>
-        <w:t>score += 10;</w:t>
+        <w:t xml:space="preserve">Hosil bo'ladigan rasmda ko'rishni istamaydigan narsalarni (masalan, 'loyqa, xira, ortiqcha qo'llar') chiqarib tashlash uchun. </w:t>
+      </w:r>
+      <w:r>
+        <w:rPr>
+          <w:i/>
+          <w:color w:val="505F73"/>
+          <w:sz w:val="18"/>
+        </w:rPr>
+        <w:t>(Чтобы исключить появление нежелательных деталей на картинке (например: 'размытость, лишние пальцы, водяные знаки').)</w:t>
       </w:r>
     </w:p>
     <w:p>
@@ -2229,10 +2509,18 @@
       </w:r>
       <w:r>
         <w:rPr>
-          <w:color w:val="1E293B"/>
+          <w:color w:val="0F172A"/>
           <w:sz w:val="19"/>
         </w:rPr>
-        <w:t>score = score * 0;</w:t>
+        <w:t xml:space="preserve">AI ning kayfiyatini buzish uchun. </w:t>
+      </w:r>
+      <w:r>
+        <w:rPr>
+          <w:i/>
+          <w:color w:val="505F73"/>
+          <w:sz w:val="18"/>
+        </w:rPr>
+        <w:t>(Чтобы разозлить искусственный интеллект.)</w:t>
       </w:r>
     </w:p>
     <w:p>
@@ -2253,7 +2541,7 @@
           <w:color w:val="0F172A"/>
           <w:sz w:val="19"/>
         </w:rPr>
-        <w:t xml:space="preserve">score = 'o`nta'; </w:t>
+        <w:t xml:space="preserve">Faqat qora rangli rasmlar chizish uchun. </w:t>
       </w:r>
       <w:r>
         <w:rPr>
@@ -2261,7 +2549,7 @@
           <w:color w:val="505F73"/>
           <w:sz w:val="18"/>
         </w:rPr>
-        <w:t>(score = 'десять';)</w:t>
+        <w:t>(Чтобы рисовать только черным цветом.)</w:t>
       </w:r>
     </w:p>
     <w:p>
@@ -2279,10 +2567,18 @@
       </w:r>
       <w:r>
         <w:rPr>
-          <w:color w:val="1E293B"/>
+          <w:color w:val="0F172A"/>
           <w:sz w:val="19"/>
         </w:rPr>
-        <w:t>hp -= 10;</w:t>
+        <w:t xml:space="preserve">Rasmni o'chirib yuborish uchun. </w:t>
+      </w:r>
+      <w:r>
+        <w:rPr>
+          <w:i/>
+          <w:color w:val="505F73"/>
+          <w:sz w:val="18"/>
+        </w:rPr>
+        <w:t>(Чтобы удалить файл с диска.)</w:t>
       </w:r>
     </w:p>
     <w:p>
@@ -2300,10 +2596,18 @@
       </w:r>
       <w:r>
         <w:rPr>
-          <w:color w:val="1E293B"/>
+          <w:color w:val="0F172A"/>
           <w:sz w:val="19"/>
         </w:rPr>
-        <w:t>canvas.width += 10;</w:t>
+        <w:t xml:space="preserve">Rasmni kichiklashtirish uchun. </w:t>
+      </w:r>
+      <w:r>
+        <w:rPr>
+          <w:i/>
+          <w:color w:val="505F73"/>
+          <w:sz w:val="18"/>
+        </w:rPr>
+        <w:t>(Чтобы уменьшить разрешение картинки.)</w:t>
       </w:r>
     </w:p>
     <w:p>
@@ -2325,7 +2629,7 @@
           <w:color w:val="0F172A"/>
           <w:sz w:val="20"/>
         </w:rPr>
-        <w:t xml:space="preserve">O'yinda sakrash effekti hosil bo'lishi uchun qahramonning qaysi koordinatasi o'zgaradi? </w:t>
+        <w:t xml:space="preserve">AI dan olingan ma'lumotni maktab loyihasida ishlatishdan oldin nima qilish shart? </w:t>
       </w:r>
       <w:r>
         <w:rPr>
@@ -2334,7 +2638,7 @@
           <w:color w:val="475569"/>
           <w:sz w:val="19"/>
         </w:rPr>
-        <w:t>(Какая координата изменяется при прыжке персонажа вверх на двумерном экране?)</w:t>
+        <w:t>(Что обязан сделать ученик перед использованием сгенерированного AI текста в школьном проекте?)</w:t>
       </w:r>
     </w:p>
     <w:p>
@@ -2355,7 +2659,7 @@
           <w:color w:val="0F172A"/>
           <w:sz w:val="19"/>
         </w:rPr>
-        <w:t xml:space="preserve">Faqat kengligi (width) </w:t>
+        <w:t xml:space="preserve">Hech narsa qilmasdan to'g'ridan-to'g'ri ko'chirib olish. </w:t>
       </w:r>
       <w:r>
         <w:rPr>
@@ -2363,7 +2667,7 @@
           <w:color w:val="505F73"/>
           <w:sz w:val="18"/>
         </w:rPr>
-        <w:t>(Только ширина (width))</w:t>
+        <w:t>(Скопировать текст не читая и сдать учителю.)</w:t>
       </w:r>
     </w:p>
     <w:p>
@@ -2384,7 +2688,7 @@
           <w:color w:val="0F172A"/>
           <w:sz w:val="19"/>
         </w:rPr>
-        <w:t xml:space="preserve">Faqat rangi </w:t>
+        <w:t xml:space="preserve">Matnni do'stiga pullash. </w:t>
       </w:r>
       <w:r>
         <w:rPr>
@@ -2392,7 +2696,7 @@
           <w:color w:val="505F73"/>
           <w:sz w:val="18"/>
         </w:rPr>
-        <w:t>(Только цвет персонажа)</w:t>
+        <w:t>(Продать текст однокласснику.)</w:t>
       </w:r>
     </w:p>
     <w:p>
@@ -2413,7 +2717,7 @@
           <w:color w:val="0F172A"/>
           <w:sz w:val="19"/>
         </w:rPr>
-        <w:t xml:space="preserve">Canvas balandligi </w:t>
+        <w:t xml:space="preserve">Matnni o'chirib tashlash. </w:t>
       </w:r>
       <w:r>
         <w:rPr>
@@ -2421,7 +2725,7 @@
           <w:color w:val="505F73"/>
           <w:sz w:val="18"/>
         </w:rPr>
-        <w:t>(Высота всего окна браузера)</w:t>
+        <w:t>(Сразу же удалить файл.)</w:t>
       </w:r>
     </w:p>
     <w:p>
@@ -2442,7 +2746,7 @@
           <w:color w:val="0F172A"/>
           <w:sz w:val="19"/>
         </w:rPr>
-        <w:t xml:space="preserve">O'yinchining ismi </w:t>
+        <w:t xml:space="preserve">Faqat matnning rangini o'zgartirish. </w:t>
       </w:r>
       <w:r>
         <w:rPr>
@@ -2450,7 +2754,7 @@
           <w:color w:val="505F73"/>
           <w:sz w:val="18"/>
         </w:rPr>
-        <w:t>(Имя учетной записи игрока)</w:t>
+        <w:t>(Просто поменять цвет шрифта на синий.)</w:t>
       </w:r>
     </w:p>
     <w:p>
@@ -2471,7 +2775,7 @@
           <w:color w:val="0F172A"/>
           <w:sz w:val="19"/>
         </w:rPr>
-        <w:t xml:space="preserve">Y koordinatasi (vertikal bo'yicha yuqoriga kamayadi, keyin gravitatsiya bilan pastga ortadi) </w:t>
+        <w:t xml:space="preserve">Faktlarni tekshirish (Fakt-cheking), tushunib o'qib chiqish va o'z so'zlari bilan boyitish. </w:t>
       </w:r>
       <w:r>
         <w:rPr>
@@ -2479,7 +2783,7 @@
           <w:color w:val="505F73"/>
           <w:sz w:val="18"/>
         </w:rPr>
-        <w:t>(Координата Y (уменьшается при движении вверх и увеличивается под действием гравитации при падении))</w:t>
+        <w:t>(Проверить факты (фактчекинг), вдумчиво прочитать материал и дополнить его своими словами и мыслями.)</w:t>
       </w:r>
     </w:p>
     <w:p>
@@ -2501,7 +2805,7 @@
           <w:color w:val="0F172A"/>
           <w:sz w:val="20"/>
         </w:rPr>
-        <w:t xml:space="preserve">Gravitatsiya (tortish kuchi) kodi har bir freymda qahramonga qanday ta'sir o'tkazadi? </w:t>
+        <w:t xml:space="preserve">AI ga javob formatini aniq belgilash (Output Formatting) qanday bo'ladi? </w:t>
       </w:r>
       <w:r>
         <w:rPr>
@@ -2510,7 +2814,7 @@
           <w:color w:val="475569"/>
           <w:sz w:val="19"/>
         </w:rPr>
-        <w:t>(Как сила гравитации (Gravity) воздействует на персонажа в каждом кадре игрового цикла?)</w:t>
+        <w:t>(Как в промпте явно задать формат вывода информации (Output Formatting)?)</w:t>
       </w:r>
     </w:p>
     <w:p>
@@ -2531,7 +2835,7 @@
           <w:color w:val="0F172A"/>
           <w:sz w:val="19"/>
         </w:rPr>
-        <w:t xml:space="preserve">Qahramonni chapga suradi. </w:t>
+        <w:t xml:space="preserve">AI ga 'O'zing bilganingdek qil' deb yozish. </w:t>
       </w:r>
       <w:r>
         <w:rPr>
@@ -2539,7 +2843,7 @@
           <w:color w:val="505F73"/>
           <w:sz w:val="18"/>
         </w:rPr>
-        <w:t>(Сдвигает персонажа строго влево.)</w:t>
+        <w:t>(Написать модели: 'Сделай как-нибудь сам'.)</w:t>
       </w:r>
     </w:p>
     <w:p>
@@ -2560,7 +2864,7 @@
           <w:color w:val="0F172A"/>
           <w:sz w:val="19"/>
         </w:rPr>
-        <w:t xml:space="preserve">Qahramonni g'oyib qiladi. </w:t>
+        <w:t xml:space="preserve">AI ga qarab qichqirish. </w:t>
       </w:r>
       <w:r>
         <w:rPr>
@@ -2568,7 +2872,7 @@
           <w:color w:val="505F73"/>
           <w:sz w:val="18"/>
         </w:rPr>
-        <w:t>(Делает персонажа полностью невидимым.)</w:t>
+        <w:t>(Громко закричать в микрофон.)</w:t>
       </w:r>
     </w:p>
     <w:p>
@@ -2589,7 +2893,7 @@
           <w:color w:val="0F172A"/>
           <w:sz w:val="19"/>
         </w:rPr>
-        <w:t xml:space="preserve">Qahramonning vertikal tezligiga (`vy`) doimiy son (masalan, 0.5) qo'shib, uni pastga qarab tortadi. </w:t>
+        <w:t xml:space="preserve">'Javobni 3 ustunli jadval ko'rinishida ber' yoki 'Faqat 5 ta raqamlangan bandda yoz' deb buyruq berish. </w:t>
       </w:r>
       <w:r>
         <w:rPr>
@@ -2597,7 +2901,7 @@
           <w:color w:val="505F73"/>
           <w:sz w:val="18"/>
         </w:rPr>
-        <w:t>(Постоянно прибавляет значение к вертикальной скорости (`vy += 0.5`), плавно притягивая персонажа вниз к земле.)</w:t>
+        <w:t>(Добавить четкую инструкцию: 'Оформи ответ в виде таблицы из 3 колонок' или 'Ответь строго списком из 5 пунктов'.)</w:t>
       </w:r>
     </w:p>
     <w:p>
@@ -2618,7 +2922,7 @@
           <w:color w:val="0F172A"/>
           <w:sz w:val="19"/>
         </w:rPr>
-        <w:t xml:space="preserve">O'yin tezligini nolga tushiradi. </w:t>
+        <w:t xml:space="preserve">Klaviaturadan tasodifiy harflarni bosish. </w:t>
       </w:r>
       <w:r>
         <w:rPr>
@@ -2626,7 +2930,7 @@
           <w:color w:val="505F73"/>
           <w:sz w:val="18"/>
         </w:rPr>
-        <w:t>(Снижает скорость процессора до нуля.)</w:t>
+        <w:t>(Нажать случайные клавиши на клавиатуре.)</w:t>
       </w:r>
     </w:p>
     <w:p>
@@ -2647,7 +2951,7 @@
           <w:color w:val="0F172A"/>
           <w:sz w:val="19"/>
         </w:rPr>
-        <w:t xml:space="preserve">Tugmalar rangini o'zgartiradi. </w:t>
+        <w:t xml:space="preserve">Faqat rasm chizishni so'rash. </w:t>
       </w:r>
       <w:r>
         <w:rPr>
@@ -2655,7 +2959,7 @@
           <w:color w:val="505F73"/>
           <w:sz w:val="18"/>
         </w:rPr>
-        <w:t>(Перекрашивает фон в синий цвет.)</w:t>
+        <w:t>(Попросить нарисовать кружок.)</w:t>
       </w:r>
     </w:p>
     <w:p>
@@ -2677,7 +2981,7 @@
           <w:color w:val="0F172A"/>
           <w:sz w:val="20"/>
         </w:rPr>
-        <w:t xml:space="preserve">O'yindagi dushmanning avtomatik ravishda chapga va o'ngga yurishi (patrul qilishi) qanday amalga oshiriladi? </w:t>
+        <w:t xml:space="preserve">Vibecoding jarayonida 'Iteratsiya' (Iteration) nimani anglatadi? </w:t>
       </w:r>
       <w:r>
         <w:rPr>
@@ -2686,7 +2990,7 @@
           <w:color w:val="475569"/>
           <w:sz w:val="19"/>
         </w:rPr>
-        <w:t>(Как реализуется автоматическое патрулирование врага влево и вправо по платформе?)</w:t>
+        <w:t>(Что в культуре Vibecoding означает термин 'Итерация' (Iteration)?)</w:t>
       </w:r>
     </w:p>
     <w:p>
@@ -2707,7 +3011,7 @@
           <w:color w:val="0F172A"/>
           <w:sz w:val="19"/>
         </w:rPr>
-        <w:t xml:space="preserve">Uni o'yinchi klaviaturadan boshqaradi. </w:t>
+        <w:t xml:space="preserve">Kompyuterni format qilishni. </w:t>
       </w:r>
       <w:r>
         <w:rPr>
@@ -2715,7 +3019,7 @@
           <w:color w:val="505F73"/>
           <w:sz w:val="18"/>
         </w:rPr>
-        <w:t>(Врагом управляет второй игрок со стрелочек клавиатуры.)</w:t>
+        <w:t>(Полное форматирование операционной системы.)</w:t>
       </w:r>
     </w:p>
     <w:p>
@@ -2736,7 +3040,7 @@
           <w:color w:val="0F172A"/>
           <w:sz w:val="19"/>
         </w:rPr>
-        <w:t xml:space="preserve">Dushman har 1 soniyada o'chirib qayta chiziladi. </w:t>
+        <w:t xml:space="preserve">Bir xil qo'shiqni qayta-qayta eshitishni. </w:t>
       </w:r>
       <w:r>
         <w:rPr>
@@ -2744,7 +3048,7 @@
           <w:color w:val="505F73"/>
           <w:sz w:val="18"/>
         </w:rPr>
-        <w:t>(Враг удаляется и создается заново каждую секунду.)</w:t>
+        <w:t>(Многократное прослушивание одной песни.)</w:t>
       </w:r>
     </w:p>
     <w:p>
@@ -2765,7 +3069,7 @@
           <w:color w:val="0F172A"/>
           <w:sz w:val="19"/>
         </w:rPr>
-        <w:t xml:space="preserve">Faqat sichqoncha qimirlaganda yuradi. </w:t>
+        <w:t xml:space="preserve">Faqat bitta prompt bilan cheklanishni. </w:t>
       </w:r>
       <w:r>
         <w:rPr>
@@ -2773,7 +3077,7 @@
           <w:color w:val="505F73"/>
           <w:sz w:val="18"/>
         </w:rPr>
-        <w:t>(Враг перемещается только при движении курсора мыши.)</w:t>
+        <w:t>(Ограничение работы строго одним запросом.)</w:t>
       </w:r>
     </w:p>
     <w:p>
@@ -2794,7 +3098,7 @@
           <w:color w:val="0F172A"/>
           <w:sz w:val="19"/>
         </w:rPr>
-        <w:t xml:space="preserve">Dushmanning X tezligi (`vx`) bo'lib, u devorga yoki chegara koordinatasiga yetganda tezlik ishorasi teskariga o'zgartiriladi (`vx = -vx`). </w:t>
+        <w:t xml:space="preserve">Loyihani bittada emas, ketma-ket qadamlar bilan AI ga savol berib, yaxshilab, sayqallab borish jarayonini. </w:t>
       </w:r>
       <w:r>
         <w:rPr>
@@ -2802,7 +3106,7 @@
           <w:color w:val="505F73"/>
           <w:sz w:val="18"/>
         </w:rPr>
-        <w:t>(У врага есть горизонтальная скорость (`vx`), и при касании границы платформы знак скорости инвертируется (`vx = -vx`).)</w:t>
+        <w:t>(Пошаговое улучшение проекта через серию последовательных вопросов к AI: от простого скелета к идеальному интерфейсу.)</w:t>
       </w:r>
     </w:p>
     <w:p>
@@ -2823,7 +3127,7 @@
           <w:color w:val="0F172A"/>
           <w:sz w:val="19"/>
         </w:rPr>
-        <w:t xml:space="preserve">Dushman har doim bir joyda qotib turadi. </w:t>
+        <w:t xml:space="preserve">Dasturni o'chirishni. </w:t>
       </w:r>
       <w:r>
         <w:rPr>
@@ -2831,7 +3135,7 @@
           <w:color w:val="505F73"/>
           <w:sz w:val="18"/>
         </w:rPr>
-        <w:t>(Враг всегда неподвижно стоит на одном месте.)</w:t>
+        <w:t>(Удаление программного кода.)</w:t>
       </w:r>
     </w:p>
     <w:p>
@@ -2853,7 +3157,7 @@
           <w:color w:val="0F172A"/>
           <w:sz w:val="20"/>
         </w:rPr>
-        <w:t xml:space="preserve">Dushmanning o'yinchini ta'qib qilishi (quvishi) uchun unga qanday oddiy 'Sun'iy Intellekt' (AI) mantiqi beriladi? </w:t>
+        <w:t xml:space="preserve">AI yordamida maktab taqdimoti tayyorlashda qaysi prompt eng samarali hisoblanadi? </w:t>
       </w:r>
       <w:r>
         <w:rPr>
@@ -2862,7 +3166,7 @@
           <w:color w:val="475569"/>
           <w:sz w:val="19"/>
         </w:rPr>
-        <w:t>(Какая простая логика искусственного интеллекта заставляет врага преследовать игрока?)</w:t>
+        <w:t>(Какой промпт эффективнее всего создаст структуру для школьной презентации?)</w:t>
       </w:r>
     </w:p>
     <w:p>
@@ -2883,7 +3187,7 @@
           <w:color w:val="0F172A"/>
           <w:sz w:val="19"/>
         </w:rPr>
-        <w:t xml:space="preserve">Dushman ekrandan chiqib ketishi kerak. </w:t>
+        <w:t xml:space="preserve">'Prezentatsiya qil.' </w:t>
       </w:r>
       <w:r>
         <w:rPr>
@@ -2891,7 +3195,7 @@
           <w:color w:val="505F73"/>
           <w:sz w:val="18"/>
         </w:rPr>
-        <w:t>(Враг должен просто вылететь за пределы экрана.)</w:t>
+        <w:t>('Сделай презентацию.')</w:t>
       </w:r>
     </w:p>
     <w:p>
@@ -2912,7 +3216,7 @@
           <w:color w:val="0F172A"/>
           <w:sz w:val="19"/>
         </w:rPr>
-        <w:t xml:space="preserve">Agar o'yinchining X koordinatasi dushmannikidan katta bo'lsa dushman o'ngga yuradi, kichik bo'lsa chapga yuradi. </w:t>
+        <w:t xml:space="preserve">'5-sinf o'quvchilari uchun 'Koinot va Sayyoralar' mavzusida 5 ta slayddan iborat reja, qisqa matnlar va slayd rasmlari uchun g'oyalar yozib ber.' </w:t>
       </w:r>
       <w:r>
         <w:rPr>
@@ -2920,7 +3224,7 @@
           <w:color w:val="505F73"/>
           <w:sz w:val="18"/>
         </w:rPr>
-        <w:t>(Если координата X игрока больше координаты врага — враг идет вправо, если меньше — идет влево.)</w:t>
+        <w:t>('Составь план презентации на 5 слайдов для 5 класса на тему 'Планеты Солнечной системы': текст для каждого слайда и идеи для иллюстраций.')</w:t>
       </w:r>
     </w:p>
     <w:p>
@@ -2941,7 +3245,7 @@
           <w:color w:val="0F172A"/>
           <w:sz w:val="19"/>
         </w:rPr>
-        <w:t xml:space="preserve">Dushman uxlab qoladi. </w:t>
+        <w:t xml:space="preserve">'Menga rasm ko'rsat.' </w:t>
       </w:r>
       <w:r>
         <w:rPr>
@@ -2949,7 +3253,7 @@
           <w:color w:val="505F73"/>
           <w:sz w:val="18"/>
         </w:rPr>
-        <w:t>(Враг должен заснуть.)</w:t>
+        <w:t>('Покажи картинку космоса.')</w:t>
       </w:r>
     </w:p>
     <w:p>
@@ -2970,7 +3274,7 @@
           <w:color w:val="0F172A"/>
           <w:sz w:val="19"/>
         </w:rPr>
-        <w:t xml:space="preserve">Dushman o'z rangini sariqqa o'zgartiradi. </w:t>
+        <w:t xml:space="preserve">'Sayyora nima?' </w:t>
       </w:r>
       <w:r>
         <w:rPr>
@@ -2978,7 +3282,7 @@
           <w:color w:val="505F73"/>
           <w:sz w:val="18"/>
         </w:rPr>
-        <w:t>(Враг перекрашивается в желтый цвет.)</w:t>
+        <w:t>('Что такое планета?')</w:t>
       </w:r>
     </w:p>
     <w:p>
@@ -2999,7 +3303,7 @@
           <w:color w:val="0F172A"/>
           <w:sz w:val="19"/>
         </w:rPr>
-        <w:t xml:space="preserve">O'yin kodini o'chirib tashlaydi. </w:t>
+        <w:t xml:space="preserve">'Faqat inglizcha slayd yoz.' </w:t>
       </w:r>
       <w:r>
         <w:rPr>
@@ -3007,7 +3311,7 @@
           <w:color w:val="505F73"/>
           <w:sz w:val="18"/>
         </w:rPr>
-        <w:t>(Враг стирает код программы.)</w:t>
+        <w:t>('Напиши текст на латыни.')</w:t>
       </w:r>
     </w:p>
     <w:p>
@@ -3029,7 +3333,7 @@
           <w:color w:val="0F172A"/>
           <w:sz w:val="20"/>
         </w:rPr>
-        <w:t xml:space="preserve">O'yinda Boss jangi (yakuniy dushman) oddiy dushmandan nimasi bilan farq qiladi? </w:t>
+        <w:t xml:space="preserve">AI chatida shaxsiy maxfiylikni (Privacy) saqlash uchun nima qilish taqiqlanadi? </w:t>
       </w:r>
       <w:r>
         <w:rPr>
@@ -3038,7 +3342,7 @@
           <w:color w:val="475569"/>
           <w:sz w:val="19"/>
         </w:rPr>
-        <w:t>(Чем битва с Боссом (финальным противником) отличается от схватки с обычным врагом?)</w:t>
+        <w:t>(Какое ключевое правило приватности (Privacy) нельзя нарушать при общении с публичными нейросетями?)</w:t>
       </w:r>
     </w:p>
     <w:p>
@@ -3059,7 +3363,7 @@
           <w:color w:val="0F172A"/>
           <w:sz w:val="19"/>
         </w:rPr>
-        <w:t xml:space="preserve">Uning rangi bo'lmaydi. </w:t>
+        <w:t xml:space="preserve">AI dan matematika formulasini so'rash. </w:t>
       </w:r>
       <w:r>
         <w:rPr>
@@ -3067,7 +3371,7 @@
           <w:color w:val="505F73"/>
           <w:sz w:val="18"/>
         </w:rPr>
-        <w:t>(У Босса нет цвета и формы.)</w:t>
+        <w:t>(Нельзя спрашивать правила правописания.)</w:t>
       </w:r>
     </w:p>
     <w:p>
@@ -3088,7 +3392,7 @@
           <w:color w:val="0F172A"/>
           <w:sz w:val="19"/>
         </w:rPr>
-        <w:t xml:space="preserve">Boss faqat ovozsiz ishlaydi. </w:t>
+        <w:t xml:space="preserve">AI dan inglizcha so'z tarjimasini so'rash. </w:t>
       </w:r>
       <w:r>
         <w:rPr>
@@ -3096,7 +3400,7 @@
           <w:color w:val="505F73"/>
           <w:sz w:val="18"/>
         </w:rPr>
-        <w:t>(Босс работает только при выключенном звуке.)</w:t>
+        <w:t>(Нельзя просить перевести текст на иностранный язык.)</w:t>
       </w:r>
     </w:p>
     <w:p>
@@ -3117,7 +3421,7 @@
           <w:color w:val="0F172A"/>
           <w:sz w:val="19"/>
         </w:rPr>
-        <w:t xml:space="preserve">Boss bilan o'yinni boshlash mumkin emas. </w:t>
+        <w:t xml:space="preserve">AI ga o'yin qoidalarini yozdirish. </w:t>
       </w:r>
       <w:r>
         <w:rPr>
@@ -3125,7 +3429,7 @@
           <w:color w:val="505F73"/>
           <w:sz w:val="18"/>
         </w:rPr>
-        <w:t>(С Боссом невозможно начать игру.)</w:t>
+        <w:t>(Запрещено придумывать сюжеты для сказок.)</w:t>
       </w:r>
     </w:p>
     <w:p>
@@ -3146,7 +3450,7 @@
           <w:color w:val="0F172A"/>
           <w:sz w:val="19"/>
         </w:rPr>
-        <w:t xml:space="preserve">Boss hech qachon ekranda ko'rinmaydi. </w:t>
+        <w:t xml:space="preserve">AI bilan do'stona muloqot qilish. </w:t>
       </w:r>
       <w:r>
         <w:rPr>
@@ -3154,7 +3458,7 @@
           <w:color w:val="505F73"/>
           <w:sz w:val="18"/>
         </w:rPr>
-        <w:t>(Босс никогда не отображается на экране.)</w:t>
+        <w:t>(Нельзя здороваться с чат-ботом.)</w:t>
       </w:r>
     </w:p>
     <w:p>
@@ -3175,7 +3479,7 @@
           <w:color w:val="0F172A"/>
           <w:sz w:val="19"/>
         </w:rPr>
-        <w:t xml:space="preserve">U ancha katta o'lchamga, ko'p jonga (HP shkalasiga) ega bo'ladi va turli hujum fazalarini (masalan, olov otish) ishlatadi. </w:t>
+        <w:t xml:space="preserve">O'z uy manzili, telefon raqami, pasport ma'lumotlari yoki oilaviy parollarni AI ga yozish. </w:t>
       </w:r>
       <w:r>
         <w:rPr>
@@ -3183,7 +3487,7 @@
           <w:color w:val="505F73"/>
           <w:sz w:val="18"/>
         </w:rPr>
-        <w:t>(Босс обладает увеличенными размерами, большой полоской здоровья (HP Bar) и использует разные фазы атак (например, фаерболы).)</w:t>
+        <w:t>(Категорически запрещено передавать свой домашний адрес, телефон, пароли или паспортные данные семьи.)</w:t>
       </w:r>
     </w:p>
     <w:p>
@@ -3205,7 +3509,7 @@
           <w:color w:val="0F172A"/>
           <w:sz w:val="20"/>
         </w:rPr>
-        <w:t xml:space="preserve">O'yinchi rekord ball to'plaganida brauzer yopilgandan keyin ham natija o'chib ketmasligi uchun qayerda saqlanadi? </w:t>
+        <w:t xml:space="preserve">AI yordamida interaktiv mini-kalkulyator yaratishda qaysi texnologiyalar kodi so'raladi? </w:t>
       </w:r>
       <w:r>
         <w:rPr>
@@ -3214,7 +3518,7 @@
           <w:color w:val="475569"/>
           <w:sz w:val="19"/>
         </w:rPr>
-        <w:t>(Где сохраняется рекордный счет (High Score), чтобы он не исчез после закрытия или перезагрузки браузера?)</w:t>
+        <w:t>(Код каких трех базовых веб-технологий запрашивают у AI для создания интерактивного калькулятора?)</w:t>
       </w:r>
     </w:p>
     <w:p>
@@ -3235,7 +3539,7 @@
           <w:color w:val="0F172A"/>
           <w:sz w:val="19"/>
         </w:rPr>
-        <w:t xml:space="preserve">Qog'ozga yozib olinadi. </w:t>
+        <w:t xml:space="preserve">Faqat Photoshop fayli. </w:t>
       </w:r>
       <w:r>
         <w:rPr>
@@ -3243,7 +3547,7 @@
           <w:color w:val="505F73"/>
           <w:sz w:val="18"/>
         </w:rPr>
-        <w:t>(Записывается на листок бумаги.)</w:t>
+        <w:t>(Файлов программы Photoshop.)</w:t>
       </w:r>
     </w:p>
     <w:p>
@@ -3264,7 +3568,7 @@
           <w:color w:val="0F172A"/>
           <w:sz w:val="19"/>
         </w:rPr>
-        <w:t xml:space="preserve">Kompyuter monitorida. </w:t>
+        <w:t xml:space="preserve">Faqat Word fayli. </w:t>
       </w:r>
       <w:r>
         <w:rPr>
@@ -3272,7 +3576,7 @@
           <w:color w:val="505F73"/>
           <w:sz w:val="18"/>
         </w:rPr>
-        <w:t>(Внутри стекла монитора.)</w:t>
+        <w:t>(Документа программы Microsoft Word.)</w:t>
       </w:r>
     </w:p>
     <w:p>
@@ -3293,7 +3597,7 @@
           <w:color w:val="0F172A"/>
           <w:sz w:val="19"/>
         </w:rPr>
-        <w:t xml:space="preserve">Brauzerning `localStorage` doimiy xotirasida (`localStorage.setItem('highScore', score)`). </w:t>
+        <w:t xml:space="preserve">HTML (tuzilishi), CSS (chiroyli dizayni) va JavaScript (hisoblash mantig'i). </w:t>
       </w:r>
       <w:r>
         <w:rPr>
@@ -3301,7 +3605,7 @@
           <w:color w:val="505F73"/>
           <w:sz w:val="18"/>
         </w:rPr>
-        <w:t>(В постоянном локальном хранилище браузера `localStorage` (`localStorage.setItem('highScore', score)`).)</w:t>
+        <w:t>(HTML (структура каркаса), CSS (стильный внешний вид) и JavaScript (вычислительная логика).)</w:t>
       </w:r>
     </w:p>
     <w:p>
@@ -3322,7 +3626,7 @@
           <w:color w:val="0F172A"/>
           <w:sz w:val="19"/>
         </w:rPr>
-        <w:t xml:space="preserve">Klaviatura ichida. </w:t>
+        <w:t xml:space="preserve">Faqat MP3 audio fayli. </w:t>
       </w:r>
       <w:r>
         <w:rPr>
@@ -3330,7 +3634,7 @@
           <w:color w:val="505F73"/>
           <w:sz w:val="18"/>
         </w:rPr>
-        <w:t>(Внутри корпуса клавиатуры.)</w:t>
+        <w:t>(Аудиозаписи формата MP3.)</w:t>
       </w:r>
     </w:p>
     <w:p>
@@ -3351,7 +3655,7 @@
           <w:color w:val="0F172A"/>
           <w:sz w:val="19"/>
         </w:rPr>
-        <w:t xml:space="preserve">Faqat bir martalik `alert()` oynasida. </w:t>
+        <w:t xml:space="preserve">Hech qanday texnologiya kerak emas. </w:t>
       </w:r>
       <w:r>
         <w:rPr>
@@ -3359,7 +3663,7 @@
           <w:color w:val="505F73"/>
           <w:sz w:val="18"/>
         </w:rPr>
-        <w:t>(Только во временном окне `alert()`.)</w:t>
+        <w:t>(Никакие технологии не требуются.)</w:t>
       </w:r>
     </w:p>
     <w:p>
@@ -3381,7 +3685,7 @@
           <w:color w:val="0F172A"/>
           <w:sz w:val="20"/>
         </w:rPr>
-        <w:t xml:space="preserve">'O'z levelingni o'zing qur' (Level Editor) vositasida xarita katakchalari dasturlashda qanday massivda saqlanadi? </w:t>
+        <w:t xml:space="preserve">AI bergan kodni sinashda 'Live Server' vositasi qanday yordam beradi? </w:t>
       </w:r>
       <w:r>
         <w:rPr>
@@ -3390,7 +3694,7 @@
           <w:color w:val="475569"/>
           <w:sz w:val="19"/>
         </w:rPr>
-        <w:t>(В каком виде в коде игры хранится карта уровней для инструмента 'Создай свой уровень' (Level Editor)?)</w:t>
+        <w:t>(Какую пользу приносит расширение 'Live Server' при разработке веб-страниц с AI?)</w:t>
       </w:r>
     </w:p>
     <w:p>
@@ -3411,7 +3715,7 @@
           <w:color w:val="0F172A"/>
           <w:sz w:val="19"/>
         </w:rPr>
-        <w:t xml:space="preserve">2 o'lchamli massiv (grid jadvali: 0 - bo'sh joy, 1 - devor, 2 - tanga). </w:t>
+        <w:t xml:space="preserve">Koddagi o'zgarishlarni saqlashingiz bilan brauzerni avtomatik yangilab, natijani darhol ko'rsatadi. </w:t>
       </w:r>
       <w:r>
         <w:rPr>
@@ -3419,7 +3723,7 @@
           <w:color w:val="505F73"/>
           <w:sz w:val="18"/>
         </w:rPr>
-        <w:t>(В виде двумерного массива (сетка/матрица, где 0 — пусто, 1 — стена, 2 — монета).)</w:t>
+        <w:t>(Мгновенно обновляет страницу в браузере при каждом сохранении файла, сразу показывая результат работы кода.)</w:t>
       </w:r>
     </w:p>
     <w:p>
@@ -3440,7 +3744,7 @@
           <w:color w:val="0F172A"/>
           <w:sz w:val="19"/>
         </w:rPr>
-        <w:t xml:space="preserve">Bitta harf ichida. </w:t>
+        <w:t xml:space="preserve">Kompyuter ekranini tozalaydi. </w:t>
       </w:r>
       <w:r>
         <w:rPr>
@@ -3448,7 +3752,7 @@
           <w:color w:val="505F73"/>
           <w:sz w:val="18"/>
         </w:rPr>
-        <w:t>(Внутри одной отдельной буквы.)</w:t>
+        <w:t>(Очищает экран ноутбука от пыли.)</w:t>
       </w:r>
     </w:p>
     <w:p>
@@ -3469,7 +3773,7 @@
           <w:color w:val="0F172A"/>
           <w:sz w:val="19"/>
         </w:rPr>
-        <w:t xml:space="preserve">Faqat rasm fayli ichida. </w:t>
+        <w:t xml:space="preserve">Internet narxini pasaytiradi. </w:t>
       </w:r>
       <w:r>
         <w:rPr>
@@ -3477,7 +3781,7 @@
           <w:color w:val="505F73"/>
           <w:sz w:val="18"/>
         </w:rPr>
-        <w:t>(Только в формате аудиофайла.)</w:t>
+        <w:t>(Снижает ежемесячную плату за интернет.)</w:t>
       </w:r>
     </w:p>
     <w:p>
@@ -3498,7 +3802,7 @@
           <w:color w:val="0F172A"/>
           <w:sz w:val="19"/>
         </w:rPr>
-        <w:t xml:space="preserve">Audio fayl ichida. </w:t>
+        <w:t xml:space="preserve">Klaviaturadagi xatolarni tuzatadi. </w:t>
       </w:r>
       <w:r>
         <w:rPr>
@@ -3506,7 +3810,7 @@
           <w:color w:val="505F73"/>
           <w:sz w:val="18"/>
         </w:rPr>
-        <w:t>(Карту уровней невозможно сохранить.)</w:t>
+        <w:t>(Исправляет орфографические ошибки в словах.)</w:t>
       </w:r>
     </w:p>
     <w:p>
@@ -3527,7 +3831,7 @@
           <w:color w:val="0F172A"/>
           <w:sz w:val="19"/>
         </w:rPr>
-        <w:t xml:space="preserve">Bunday narsani saqlab bo'lmaydi. </w:t>
+        <w:t xml:space="preserve">Faqat audio eshitishga yordam beradi. </w:t>
       </w:r>
       <w:r>
         <w:rPr>
@@ -3535,7 +3839,7 @@
           <w:color w:val="505F73"/>
           <w:sz w:val="18"/>
         </w:rPr>
-        <w:t>(В виде случайного числа.)</w:t>
+        <w:t>(Включает фоновую музыку.)</w:t>
       </w:r>
     </w:p>
     <w:p>
@@ -3557,7 +3861,7 @@
           <w:color w:val="0F172A"/>
           <w:sz w:val="20"/>
         </w:rPr>
-        <w:t xml:space="preserve">O'yinda tugma bosilganda yoki sakraganda tovush chiqarish uchun qaysi texnologiyadan foydalaniladi? </w:t>
+        <w:t xml:space="preserve">AI ga 'Ushbu kodga tushunarli o'zbekcha izohlar (comments) qo'shib ber' deyilsa, dasturda nima paydo bo'ladi? </w:t>
       </w:r>
       <w:r>
         <w:rPr>
@@ -3566,7 +3870,7 @@
           <w:color w:val="475569"/>
           <w:sz w:val="19"/>
         </w:rPr>
-        <w:t>(Какая технология используется для воспроизведения звуков прыжка и сбора монет в браузерной игре?)</w:t>
+        <w:t>(Что произойдет в исходном коде, если попросить AI: 'Добавь к каждой функции подробные комментарии'?)</w:t>
       </w:r>
     </w:p>
     <w:p>
@@ -3587,7 +3891,7 @@
           <w:color w:val="0F172A"/>
           <w:sz w:val="19"/>
         </w:rPr>
-        <w:t xml:space="preserve">CSS Rang filtri </w:t>
+        <w:t xml:space="preserve">Dastur ishlamay qoladi. </w:t>
       </w:r>
       <w:r>
         <w:rPr>
@@ -3595,7 +3899,7 @@
           <w:color w:val="505F73"/>
           <w:sz w:val="18"/>
         </w:rPr>
-        <w:t>(Цветовой CSS-фильтр)</w:t>
+        <w:t>(Программа полностью перестанет работать.)</w:t>
       </w:r>
     </w:p>
     <w:p>
@@ -3616,7 +3920,7 @@
           <w:color w:val="0F172A"/>
           <w:sz w:val="19"/>
         </w:rPr>
-        <w:t xml:space="preserve">Faqat matnli shriftlar </w:t>
+        <w:t xml:space="preserve">Sayt foniga rasm qo'yiladi. </w:t>
       </w:r>
       <w:r>
         <w:rPr>
@@ -3624,7 +3928,7 @@
           <w:color w:val="505F73"/>
           <w:sz w:val="18"/>
         </w:rPr>
-        <w:t>(Только шрифты Google Fonts)</w:t>
+        <w:t>(На фоне веб-сайта появится видеоклип.)</w:t>
       </w:r>
     </w:p>
     <w:p>
@@ -3645,7 +3949,7 @@
           <w:color w:val="0F172A"/>
           <w:sz w:val="19"/>
         </w:rPr>
-        <w:t xml:space="preserve">Kompyuter mikrofonini yoqish </w:t>
+        <w:t xml:space="preserve">Faqat katta harflar o'chib ketadi. </w:t>
       </w:r>
       <w:r>
         <w:rPr>
@@ -3653,7 +3957,7 @@
           <w:color w:val="505F73"/>
           <w:sz w:val="18"/>
         </w:rPr>
-        <w:t>(Включение микрофона пользователя)</w:t>
+        <w:t>(Сотрутся все заглавные буквы.)</w:t>
       </w:r>
     </w:p>
     <w:p>
@@ -3674,7 +3978,7 @@
           <w:color w:val="0F172A"/>
           <w:sz w:val="19"/>
         </w:rPr>
-        <w:t xml:space="preserve">Printer drayveri </w:t>
+        <w:t xml:space="preserve">Dastur tezligi ikki barobar kamayadi. </w:t>
       </w:r>
       <w:r>
         <w:rPr>
@@ -3682,7 +3986,7 @@
           <w:color w:val="505F73"/>
           <w:sz w:val="18"/>
         </w:rPr>
-        <w:t>(Драйвер офисного сканера)</w:t>
+        <w:t>(Скорость программы упадет в два раза.)</w:t>
       </w:r>
     </w:p>
     <w:p>
@@ -3703,7 +4007,7 @@
           <w:color w:val="0F172A"/>
           <w:sz w:val="19"/>
         </w:rPr>
-        <w:t xml:space="preserve">HTML5 `&lt;audio&gt;` tegi yoki Web Audio API </w:t>
+        <w:t xml:space="preserve">Kod satrlari yonida nima vazifa bajarayotganini tushuntiruvchi yozuvlar (`// bu yerda ball oshadi`) paydo bo'ladi. </w:t>
       </w:r>
       <w:r>
         <w:rPr>
@@ -3711,7 +4015,7 @@
           <w:color w:val="505F73"/>
           <w:sz w:val="18"/>
         </w:rPr>
-        <w:t>(HTML5-тег `&lt;audio&gt;` или Web Audio API)</w:t>
+        <w:t>(Рядом со строчками кода появятся понятные пояснения на человеческом языке (`// здесь увеличивается счетчик`), объясняющие логику.)</w:t>
       </w:r>
     </w:p>
     <w:p>
@@ -3733,7 +4037,7 @@
           <w:color w:val="0F172A"/>
           <w:sz w:val="20"/>
         </w:rPr>
-        <w:t xml:space="preserve">O'yin yozayotganda konsolda qizil xatolik (Error) chiqsa, Vibecoding usulida nima qilish kerak? </w:t>
+        <w:t xml:space="preserve">AI yordamida logo (ramz) yaratishda promptga qanday sifatlar qo'shiladi? </w:t>
       </w:r>
       <w:r>
         <w:rPr>
@@ -3742,7 +4046,7 @@
           <w:color w:val="475569"/>
           <w:sz w:val="19"/>
         </w:rPr>
-        <w:t>(Если при запуске игры в консоли браузера появилась красная ошибка (Error), как поступить в стиле Vibecoding?)</w:t>
+        <w:t>(Какие требования к стилю логотипа следует указать в промпте нейросети-художнику?)</w:t>
       </w:r>
     </w:p>
     <w:p>
@@ -3763,7 +4067,7 @@
           <w:color w:val="0F172A"/>
           <w:sz w:val="19"/>
         </w:rPr>
-        <w:t xml:space="preserve">Kompyuterni derazadan tashlab yuborish kerak. </w:t>
+        <w:t xml:space="preserve">'Iloji boricha ko'p rang va 100 ta detal bo'lsin.' </w:t>
       </w:r>
       <w:r>
         <w:rPr>
@@ -3771,7 +4075,7 @@
           <w:color w:val="505F73"/>
           <w:sz w:val="18"/>
         </w:rPr>
-        <w:t>(Срочно выключить компьютер из розетки.)</w:t>
+        <w:t>('Используй как можно больше мелких деталей и 50 разных цветов.')</w:t>
       </w:r>
     </w:p>
     <w:p>
@@ -3792,7 +4096,7 @@
           <w:color w:val="0F172A"/>
           <w:sz w:val="19"/>
         </w:rPr>
-        <w:t xml:space="preserve">Dasturlashni butunlay to'xtatish kerak. </w:t>
+        <w:t xml:space="preserve">'Faqat qorong'i va tushunarsiz bo'lsin.' </w:t>
       </w:r>
       <w:r>
         <w:rPr>
@@ -3800,7 +4104,7 @@
           <w:color w:val="505F73"/>
           <w:sz w:val="18"/>
         </w:rPr>
-        <w:t>(Навсегда бросить программирование.)</w:t>
+        <w:t>('Сделай все размытым и темным.')</w:t>
       </w:r>
     </w:p>
     <w:p>
@@ -3821,7 +4125,7 @@
           <w:color w:val="0F172A"/>
           <w:sz w:val="19"/>
         </w:rPr>
-        <w:t xml:space="preserve">Xatolik matnini (Stack trace) nusxalab, AI ga berish va 'Nega bu xato chiqdi va qanday to'g'rilayman?' deb so'rash kerak. </w:t>
+        <w:t xml:space="preserve">'Minimalistik, zamonaviy, vektorli, oq fonda, aniq geometrik shakllar va 2 ta uyg'un rang.' </w:t>
       </w:r>
       <w:r>
         <w:rPr>
@@ -3829,7 +4133,7 @@
           <w:color w:val="505F73"/>
           <w:sz w:val="18"/>
         </w:rPr>
-        <w:t>(Скопировать текст ошибки (Stack trace), передать его в AI и спросить: 'В чем причина и как исправить этот баг?')</w:t>
+        <w:t>('Минималистичный, векторный, современный стиль, на чистом белом фоне, с четкими геометрическими формами и 2 гармоничными цветами.')</w:t>
       </w:r>
     </w:p>
     <w:p>
@@ -3850,7 +4154,7 @@
           <w:color w:val="0F172A"/>
           <w:sz w:val="19"/>
         </w:rPr>
-        <w:t xml:space="preserve">Xatoni e'tiborsiz qoldirish kerak. </w:t>
+        <w:t xml:space="preserve">'Faqat matnsiz bo'lsin.' </w:t>
       </w:r>
       <w:r>
         <w:rPr>
@@ -3858,7 +4162,7 @@
           <w:color w:val="505F73"/>
           <w:sz w:val="18"/>
         </w:rPr>
-        <w:t>(Сделать вид, что ошибки не существует.)</w:t>
+        <w:t>('Логотип без форм и цветов.')</w:t>
       </w:r>
     </w:p>
     <w:p>
@@ -3879,7 +4183,7 @@
           <w:color w:val="0F172A"/>
           <w:sz w:val="19"/>
         </w:rPr>
-        <w:t xml:space="preserve">Klaviaturaning hamma tugmalarini birdaniga bosish kerak. </w:t>
+        <w:t xml:space="preserve">'Faqat o'lchami 1 piksel bo'lsin.' </w:t>
       </w:r>
       <w:r>
         <w:rPr>
@@ -3887,7 +4191,7 @@
           <w:color w:val="505F73"/>
           <w:sz w:val="18"/>
         </w:rPr>
-        <w:t>(Нажать все клавиши на клавиатуре одновременно.)</w:t>
+        <w:t>('Размер ровно 1 пиксель.')</w:t>
       </w:r>
     </w:p>
     <w:p>
@@ -3909,7 +4213,7 @@
           <w:color w:val="0F172A"/>
           <w:sz w:val="20"/>
         </w:rPr>
-        <w:t xml:space="preserve">CSS stillari o'yinda qanday vazifani bajaradi? </w:t>
+        <w:t xml:space="preserve">Bir nechta AI vositalarini birga ishlatish (Workflow) qanday bo'ladi? </w:t>
       </w:r>
       <w:r>
         <w:rPr>
@@ -3918,7 +4222,7 @@
           <w:color w:val="475569"/>
           <w:sz w:val="19"/>
         </w:rPr>
-        <w:t>(Какую ключевую роль играют стили CSS при создании веб-игры?)</w:t>
+        <w:t>(В чем заключается создание комплексного рабочего процесса (AI Workflow)?)</w:t>
       </w:r>
     </w:p>
     <w:p>
@@ -3939,7 +4243,7 @@
           <w:color w:val="0F172A"/>
           <w:sz w:val="19"/>
         </w:rPr>
-        <w:t xml:space="preserve">O'yin logikasini hisoblaydi. </w:t>
+        <w:t xml:space="preserve">Faqat bitta brauzer yorlig'ini ochish. </w:t>
       </w:r>
       <w:r>
         <w:rPr>
@@ -3947,7 +4251,7 @@
           <w:color w:val="505F73"/>
           <w:sz w:val="18"/>
         </w:rPr>
-        <w:t>(Выполняют математические расчеты физики.)</w:t>
+        <w:t>(В открытии всего одной вкладки браузера.)</w:t>
       </w:r>
     </w:p>
     <w:p>
@@ -3968,7 +4272,7 @@
           <w:color w:val="0F172A"/>
           <w:sz w:val="19"/>
         </w:rPr>
-        <w:t xml:space="preserve">O'yin maydonini markazga joylash, chiroyli ramkalar, neon ranglar, tugmalar dizayni va zamonaviy ko'rinish berish. </w:t>
+        <w:t xml:space="preserve">ChatGPT dan g'oya va matn olish -&gt; Midjourney da rasm chizdirish -&gt; Claude/Cursor da veb-sahifa kodini yaratish. </w:t>
       </w:r>
       <w:r>
         <w:rPr>
@@ -3976,7 +4280,7 @@
           <w:color w:val="505F73"/>
           <w:sz w:val="18"/>
         </w:rPr>
-        <w:t>(Центрируют холст Canvas, задают неоновые рамки, стилизуют кнопки, табло очков и создают стильный дизайн.)</w:t>
+        <w:t>(В объединении сильных сторон разных сервисов: идея в ChatGPT -&gt; арт в Midjourney -&gt; генерация веб-кода в Claude/Cursor.)</w:t>
       </w:r>
     </w:p>
     <w:p>
@@ -3997,7 +4301,7 @@
           <w:color w:val="0F172A"/>
           <w:sz w:val="19"/>
         </w:rPr>
-        <w:t xml:space="preserve">Faqat internet tezligini oshiradi. </w:t>
+        <w:t xml:space="preserve">Barcha AI vositalarini o'chirib tashlash. </w:t>
       </w:r>
       <w:r>
         <w:rPr>
@@ -4005,7 +4309,7 @@
           <w:color w:val="505F73"/>
           <w:sz w:val="18"/>
         </w:rPr>
-        <w:t>(Увеличивают скорость интернет-провайдера.)</w:t>
+        <w:t>(В удалении всех программ с компьютера.)</w:t>
       </w:r>
     </w:p>
     <w:p>
@@ -4026,7 +4330,7 @@
           <w:color w:val="0F172A"/>
           <w:sz w:val="19"/>
         </w:rPr>
-        <w:t xml:space="preserve">Kompyuter viruslarini yo'qotadi. </w:t>
+        <w:t xml:space="preserve">Faqat qog'ozda ishlash. </w:t>
       </w:r>
       <w:r>
         <w:rPr>
@@ -4034,7 +4338,7 @@
           <w:color w:val="505F73"/>
           <w:sz w:val="18"/>
         </w:rPr>
-        <w:t>(Удаляют вирусы с жесткого диска.)</w:t>
+        <w:t>(В отказе от использования интернета.)</w:t>
       </w:r>
     </w:p>
     <w:p>
@@ -4055,7 +4359,7 @@
           <w:color w:val="0F172A"/>
           <w:sz w:val="19"/>
         </w:rPr>
-        <w:t xml:space="preserve">Faqat ovoz balandligini boshqaradi. </w:t>
+        <w:t xml:space="preserve">Faqat kalkulyatordan foydalanish. </w:t>
       </w:r>
       <w:r>
         <w:rPr>
@@ -4063,7 +4367,7 @@
           <w:color w:val="505F73"/>
           <w:sz w:val="18"/>
         </w:rPr>
-        <w:t>(Регулируют громкость колонок.)</w:t>
+        <w:t>(В решении задач только на калькуляторе.)</w:t>
       </w:r>
     </w:p>
     <w:p>
@@ -4085,7 +4389,7 @@
           <w:color w:val="0F172A"/>
           <w:sz w:val="20"/>
         </w:rPr>
-        <w:t xml:space="preserve">O'yinda 'Qayta boshlash' (Restart) tugmasi bosilganda nimalar amalga oshirilishi kerak? </w:t>
+        <w:t xml:space="preserve">Yaratilgan interaktiv loyihani butun dunyoga ko'rsatish uchun uni qayerga bepul joylash (Deploy) mumkin? </w:t>
       </w:r>
       <w:r>
         <w:rPr>
@@ -4094,7 +4398,7 @@
           <w:color w:val="475569"/>
           <w:sz w:val="19"/>
         </w:rPr>
-        <w:t>(Что должно происходить при нажатии кнопки 'Начать заново' (Restart)?)</w:t>
+        <w:t>(Куда можно за секунды бесплатно опубликовать (задеплоить) созданный веб-проект, чтобы открыть его на телефоне по QR-коду?)</w:t>
       </w:r>
     </w:p>
     <w:p>
@@ -4115,7 +4419,7 @@
           <w:color w:val="0F172A"/>
           <w:sz w:val="19"/>
         </w:rPr>
-        <w:t xml:space="preserve">Qahramon koordinatalari, jon miqdori (HP) va ballarni boshlang'ich holatga qaytarib, o'yin tsiklini yangidan ishga tushirish. </w:t>
+        <w:t xml:space="preserve">Vercel, Netlify yoki GitHub Pages platformalariga bir necha soniyada yuklab havola olish mumkin. </w:t>
       </w:r>
       <w:r>
         <w:rPr>
@@ -4123,7 +4427,7 @@
           <w:color w:val="505F73"/>
           <w:sz w:val="18"/>
         </w:rPr>
-        <w:t>(Сброс координат героя, жизней и счета к начальным значениям и перезапуск игрового цикла.)</w:t>
+        <w:t>(На хостинг-платформы Vercel, Netlify или GitHub Pages, получив готовую публичную ссылку (URL).)</w:t>
       </w:r>
     </w:p>
     <w:p>
@@ -4144,7 +4448,7 @@
           <w:color w:val="0F172A"/>
           <w:sz w:val="19"/>
         </w:rPr>
-        <w:t xml:space="preserve">Saytni butunlay o'chirib tashlash. </w:t>
+        <w:t xml:space="preserve">Kompyuterning 'Savat' (Recycle Bin) papkasiga. </w:t>
       </w:r>
       <w:r>
         <w:rPr>
@@ -4152,7 +4456,7 @@
           <w:color w:val="505F73"/>
           <w:sz w:val="18"/>
         </w:rPr>
-        <w:t>(Полное удаление сайта из интернета.)</w:t>
+        <w:t>(В корзину рабочего стола Windows.)</w:t>
       </w:r>
     </w:p>
     <w:p>
@@ -4173,7 +4477,7 @@
           <w:color w:val="0F172A"/>
           <w:sz w:val="19"/>
         </w:rPr>
-        <w:t xml:space="preserve">Faqat fon rasmini o'zgartirish. </w:t>
+        <w:t xml:space="preserve">Faqat fleshkaga ko'chirib uyda saqlash kerak. </w:t>
       </w:r>
       <w:r>
         <w:rPr>
@@ -4181,7 +4485,7 @@
           <w:color w:val="505F73"/>
           <w:sz w:val="18"/>
         </w:rPr>
-        <w:t>(Только изменение цвета заднего фона.)</w:t>
+        <w:t>(Только скопировать на старую дискету.)</w:t>
       </w:r>
     </w:p>
     <w:p>
@@ -4202,7 +4506,7 @@
           <w:color w:val="0F172A"/>
           <w:sz w:val="19"/>
         </w:rPr>
-        <w:t xml:space="preserve">Kompyuter ekranini qoraytirish. </w:t>
+        <w:t xml:space="preserve">Faqat printerdan qog'ozga chiqarish kerak. </w:t>
       </w:r>
       <w:r>
         <w:rPr>
@@ -4210,7 +4514,7 @@
           <w:color w:val="505F73"/>
           <w:sz w:val="18"/>
         </w:rPr>
-        <w:t>(Отключение экрана монитора.)</w:t>
+        <w:t>(Распечатать на бумаге формата А4.)</w:t>
       </w:r>
     </w:p>
     <w:p>
@@ -4231,7 +4535,7 @@
           <w:color w:val="0F172A"/>
           <w:sz w:val="19"/>
         </w:rPr>
-        <w:t xml:space="preserve">O'yin nomini o'zgartirish. </w:t>
+        <w:t xml:space="preserve">Saytni internetga joylash mumkin emas. </w:t>
       </w:r>
       <w:r>
         <w:rPr>
@@ -4239,7 +4543,7 @@
           <w:color w:val="505F73"/>
           <w:sz w:val="18"/>
         </w:rPr>
-        <w:t>(Смена языка операционной системы.)</w:t>
+        <w:t>(Публикация сайтов в интернете невозможна.)</w:t>
       </w:r>
     </w:p>
     <w:p>
@@ -4261,7 +4565,7 @@
           <w:color w:val="0F172A"/>
           <w:sz w:val="20"/>
         </w:rPr>
-        <w:t xml:space="preserve">Yaratilgan o'yinni do'stlarga yuborish va telefonda o'ynash uchun qanday yakuniy bosqich (Deploy) bajariladi? </w:t>
+        <w:t xml:space="preserve">Vibecoding bilan shug'ullanuvchi 5–6-sinf o'quvchisining eng muhim ko'nikmasi nima? </w:t>
       </w:r>
       <w:r>
         <w:rPr>
@@ -4270,7 +4574,7 @@
           <w:color w:val="475569"/>
           <w:sz w:val="19"/>
         </w:rPr>
-        <w:t>(Как опубликовать (задеплоить) готовую игру в интернет, чтобы отправить ссылку друзьям и играть на смартфоне?)</w:t>
+        <w:t>(Какое главное качество отличает успешного юного Vibecoder-а 5–6 класса?)</w:t>
       </w:r>
     </w:p>
     <w:p>
@@ -4291,7 +4595,7 @@
           <w:color w:val="0F172A"/>
           <w:sz w:val="19"/>
         </w:rPr>
-        <w:t xml:space="preserve">Kodni qog'ozga ko'chirib yozish. </w:t>
+        <w:t xml:space="preserve">Kodni ko'r-ko'rona ko'chirish. </w:t>
       </w:r>
       <w:r>
         <w:rPr>
@@ -4299,7 +4603,7 @@
           <w:color w:val="505F73"/>
           <w:sz w:val="18"/>
         </w:rPr>
-        <w:t>(Переписать весь код от руки в тетрадь.)</w:t>
+        <w:t>(Слепое копирование чужих текстов без понимания.)</w:t>
       </w:r>
     </w:p>
     <w:p>
@@ -4320,7 +4624,7 @@
           <w:color w:val="0F172A"/>
           <w:sz w:val="19"/>
         </w:rPr>
-        <w:t xml:space="preserve">Kompyuterni do'stining uyiga ko'tarib borish. </w:t>
+        <w:t xml:space="preserve">Kun bo'yi ijtimoiy tarmoqlarda video ko'rish. </w:t>
       </w:r>
       <w:r>
         <w:rPr>
@@ -4328,7 +4632,7 @@
           <w:color w:val="505F73"/>
           <w:sz w:val="18"/>
         </w:rPr>
-        <w:t>(Принести свой системный блок домой к другу.)</w:t>
+        <w:t>(Бессмысленное листание коротких видеороликов весь день.)</w:t>
       </w:r>
     </w:p>
     <w:p>
@@ -4349,7 +4653,7 @@
           <w:color w:val="0F172A"/>
           <w:sz w:val="19"/>
         </w:rPr>
-        <w:t xml:space="preserve">Faqat o'z kompyuterida o'ynash. </w:t>
+        <w:t xml:space="preserve">Kompyuter ekranini o'chirib qo'yish. </w:t>
       </w:r>
       <w:r>
         <w:rPr>
@@ -4357,7 +4661,7 @@
           <w:color w:val="505F73"/>
           <w:sz w:val="18"/>
         </w:rPr>
-        <w:t>(Играть только в одиночку со своего ПК.)</w:t>
+        <w:t>(Боязнь задавать вопросы компьютеру.)</w:t>
       </w:r>
     </w:p>
     <w:p>
@@ -4378,7 +4682,7 @@
           <w:color w:val="0F172A"/>
           <w:sz w:val="19"/>
         </w:rPr>
-        <w:t xml:space="preserve">Loyihani Vercel yoki GitHub Pages xizmatiga yuklab, hammaga ochiq havola (URL) va QR kod yaratish. </w:t>
+        <w:t xml:space="preserve">G'oyani aniq ifodalash, AI ga to'g'ri prompt berish, xatolarni tuzatish va yangi narsalarni yaratishga qiziqish. </w:t>
       </w:r>
       <w:r>
         <w:rPr>
@@ -4386,7 +4690,7 @@
           <w:color w:val="505F73"/>
           <w:sz w:val="18"/>
         </w:rPr>
-        <w:t>(Загрузить проект на бесплатный хостинг (Vercel или GitHub Pages) и получить рабочую ссылку (URL) и QR-код.)</w:t>
+        <w:t>(Умение четко формулировать свои идеи, грамотно задавать промпты AI, исправлять ошибки и стремление создавать полезные проекты.)</w:t>
       </w:r>
     </w:p>
     <w:p>
@@ -4407,7 +4711,7 @@
           <w:color w:val="0F172A"/>
           <w:sz w:val="19"/>
         </w:rPr>
-        <w:t xml:space="preserve">Faylni butunlay yashirib qo'yish. </w:t>
+        <w:t xml:space="preserve">Faqat ingliz tili lug'atini yodlash. </w:t>
       </w:r>
       <w:r>
         <w:rPr>
@@ -4415,7 +4719,7 @@
           <w:color w:val="505F73"/>
           <w:sz w:val="18"/>
         </w:rPr>
-        <w:t>(Спрятать файл на флешке в ящик стола.)</w:t>
+        <w:t>(Механическое заучивание терминов наизусть.)</w:t>
       </w:r>
     </w:p>
     <w:p>
@@ -4640,14 +4944,14 @@
               <w:rPr>
                 <w:b/>
               </w:rPr>
-              <w:t xml:space="preserve">Vibecoding Mohiyati </w:t>
+              <w:t xml:space="preserve">Vibecoding Tushunchasi </w:t>
             </w:r>
             <w:r>
               <w:rPr>
                 <w:i/>
                 <w:color w:val="64748B"/>
               </w:rPr>
-              <w:t>(Суть Vibecoding)</w:t>
+              <w:t>(Концепция Vibecoding)</w:t>
             </w:r>
           </w:p>
         </w:tc>
@@ -4670,14 +4974,14 @@
           </w:tcPr>
           <w:p>
             <w:r>
-              <w:t xml:space="preserve">Vibecoding — insonning ijodiy g'oyasi va AI ning kod yozish tezligini birlashtirib, tezkor prototiplar va loyihalar yaratishdir. </w:t>
+              <w:t xml:space="preserve">Vibecoding — insonning ijodiy g'oyasi va AI ning kod yozish tezligini birlashtirib, tayyor dasturlar yaratishdir. </w:t>
             </w:r>
             <w:r>
               <w:rPr>
                 <w:i/>
                 <w:color w:val="64748B"/>
               </w:rPr>
-              <w:t>(Vibecoding объединяет творческую идею человека со скоростью написания кода нейросетью для быстрого создания проектов.)</w:t>
+              <w:t>(Vibecoding объединяет творческий замысел человека со скоростью написания кода нейросетями.)</w:t>
             </w:r>
           </w:p>
         </w:tc>
@@ -4762,14 +5066,14 @@
               <w:rPr>
                 <w:b/>
               </w:rPr>
-              <w:t xml:space="preserve">Aniq Prompt Yozish </w:t>
+              <w:t xml:space="preserve">Prompt Tushunchasi </w:t>
             </w:r>
             <w:r>
               <w:rPr>
                 <w:i/>
                 <w:color w:val="64748B"/>
               </w:rPr>
-              <w:t>(Написание Четкого Промпта)</w:t>
+              <w:t>(Понятие Промпта)</w:t>
             </w:r>
           </w:p>
         </w:tc>
@@ -4791,14 +5095,14 @@
           </w:tcPr>
           <w:p>
             <w:r>
-              <w:t xml:space="preserve">Sifatli promptda aniq rol, texnologiya (Canvas), qahramon xususiyatlari, boshqaruv va o'yin qoidalari batafsil ko'rsatiladi. </w:t>
+              <w:t xml:space="preserve">Prompt — foydalanuvchi sun'iy intellektga beradigan matnli yo'riqnoma, buyruq yoki savoldir. </w:t>
             </w:r>
             <w:r>
               <w:rPr>
                 <w:i/>
                 <w:color w:val="64748B"/>
               </w:rPr>
-              <w:t>(Качественный промпт содержит конкретную роль, технологию (Canvas), параметры персонажа, механику управления и правила игры.)</w:t>
+              <w:t>(Промпт — это текст, вопрос или команда, определяющая поведение и результат работы искусственного интеллекта.)</w:t>
             </w:r>
           </w:p>
         </w:tc>
@@ -4886,14 +5190,14 @@
               <w:rPr>
                 <w:b/>
               </w:rPr>
-              <w:t xml:space="preserve">HTML5 Canvas Tegi </w:t>
+              <w:t xml:space="preserve">Yaxshi Prompt Tuzilishi </w:t>
             </w:r>
             <w:r>
               <w:rPr>
                 <w:i/>
                 <w:color w:val="64748B"/>
               </w:rPr>
-              <w:t>(Тег HTML5 Canvas)</w:t>
+              <w:t>(Структура Качественного Промпта)</w:t>
             </w:r>
           </w:p>
         </w:tc>
@@ -4916,14 +5220,14 @@
           </w:tcPr>
           <w:p>
             <w:r>
-              <w:t xml:space="preserve">&lt;canvas&gt; tegi JavaScript yordamida dinamik grafikalar, qahramonlar va animatsiyalar chiziladigan raqamli doska hisoblanadi. </w:t>
+              <w:t xml:space="preserve">Kuchli promptda 4 element bo'ladi: Rol, Aniq vazifa, Qo'shimcha shartlar (kontekst) va Kutilgan format. </w:t>
             </w:r>
             <w:r>
               <w:rPr>
                 <w:i/>
                 <w:color w:val="64748B"/>
               </w:rPr>
-              <w:t>(Тег &lt;canvas&gt; служит цифровым холстом, на котором с помощью JavaScript динамически рисуются персонажи и анимации.)</w:t>
+              <w:t>(Эффективный промпт содержит четкую роль эксперта, конкретную цель, ограничения и формат ответа.)</w:t>
             </w:r>
           </w:p>
         </w:tc>
@@ -5008,14 +5312,14 @@
               <w:rPr>
                 <w:b/>
               </w:rPr>
-              <w:t xml:space="preserve">Canvas Koordinatalar Tizimi </w:t>
+              <w:t xml:space="preserve">Aniq vs Noaniq Prompt </w:t>
             </w:r>
             <w:r>
               <w:rPr>
                 <w:i/>
                 <w:color w:val="64748B"/>
               </w:rPr>
-              <w:t>(Система Координат Canvas)</w:t>
+              <w:t>(Точные vs Размытые Промпты)</w:t>
             </w:r>
           </w:p>
         </w:tc>
@@ -5037,14 +5341,14 @@
           </w:tcPr>
           <w:p>
             <w:r>
-              <w:t xml:space="preserve">Kompyuter grafikasida X o'qi chapdan o'ngga qarab o'sadi, Y o'qi esa yuqoridan pastga qarab o'sadi. (0,0) chap yuqori burchakda. </w:t>
+              <w:t xml:space="preserve">Noaniq promptda AI taxmin qilishga majbur bo'ladi; aniq prompt esa kutilgan natijani birinchi urinishda beradi. </w:t>
             </w:r>
             <w:r>
               <w:rPr>
                 <w:i/>
                 <w:color w:val="64748B"/>
               </w:rPr>
-              <w:t>(В компьютерной графике ось X идет слева направо, а ось Y — сверху вниз. Точка (0,0) находится в верхнем левом углу.)</w:t>
+              <w:t>(Размытый промпт заставляет AI наугад придумывать детали, а точный промпт дает идеальный результат с первого раза.)</w:t>
             </w:r>
           </w:p>
         </w:tc>
@@ -5132,14 +5436,14 @@
               <w:rPr>
                 <w:b/>
               </w:rPr>
-              <w:t xml:space="preserve">O'zgaruvchilar (Variables) </w:t>
+              <w:t xml:space="preserve">Rol Berish (Role Prompting) </w:t>
             </w:r>
             <w:r>
               <w:rPr>
                 <w:i/>
                 <w:color w:val="64748B"/>
               </w:rPr>
-              <w:t>(Переменные (Variables))</w:t>
+              <w:t>(Задание Роли (Role Prompting))</w:t>
             </w:r>
           </w:p>
         </w:tc>
@@ -5162,14 +5466,14 @@
           </w:tcPr>
           <w:p>
             <w:r>
-              <w:t xml:space="preserve">`let score = 0;` o'yin davomida o'zgarib turadigan qiymatlarni (ball, jon, tezlik) xotirada saqlash uchun xizmat qiladi. </w:t>
+              <w:t xml:space="preserve">Rol berilganda AI o'sha sohaning terminologiyasi va eng yaxshi amaliyotlaridan foydalanib javob qaytaradi. </w:t>
             </w:r>
             <w:r>
               <w:rPr>
                 <w:i/>
                 <w:color w:val="64748B"/>
               </w:rPr>
-              <w:t>(`let score = 0;` создает переменную в оперативной памяти для хранения изменяющихся данных (очки, жизни, скорость).)</w:t>
+              <w:t>(Ролевой контекст активирует нужные профессиональные паттерны в базе знаний нейросети.)</w:t>
             </w:r>
           </w:p>
         </w:tc>
@@ -5254,14 +5558,14 @@
               <w:rPr>
                 <w:b/>
               </w:rPr>
-              <w:t xml:space="preserve">Klaviatura Hodisalari </w:t>
+              <w:t xml:space="preserve">AI Gallyutsinatsiyasi </w:t>
             </w:r>
             <w:r>
               <w:rPr>
                 <w:i/>
                 <w:color w:val="64748B"/>
               </w:rPr>
-              <w:t>(События Клавиатуры)</w:t>
+              <w:t>(Галлюцинации Нейросетей)</w:t>
             </w:r>
           </w:p>
         </w:tc>
@@ -5283,14 +5587,14 @@
           </w:tcPr>
           <w:p>
             <w:r>
-              <w:t xml:space="preserve">`keydown` hodisasi foydalanuvchi klaviaturadagi tugmani bosgan paytda ishga tushadi va qahramon harakatini faollashtiradi. </w:t>
+              <w:t xml:space="preserve">Gallyutsinatsiya — modelning mavjud bo'lmagan ma'lumot yoki qoidalarni haqiqatdek taqdim etishi, shuning uchun natijani tekshirish shart. </w:t>
             </w:r>
             <w:r>
               <w:rPr>
                 <w:i/>
                 <w:color w:val="64748B"/>
               </w:rPr>
-              <w:t>(Событие `keydown` срабатывает в момент нажатия любой клавиши на клавиатуре и запускает движение героя.)</w:t>
+              <w:t>(Галлюцинация — это генерация ложной информации, поэтому ответы AI всегда требуют проверки человеком.)</w:t>
             </w:r>
           </w:p>
         </w:tc>
@@ -5378,14 +5682,14 @@
               <w:rPr>
                 <w:b/>
               </w:rPr>
-              <w:t xml:space="preserve">O'yin Tsikli (Game Loop) </w:t>
+              <w:t xml:space="preserve">Chain-of-Thought (Bosqichma-bosqich fikrlash) </w:t>
             </w:r>
             <w:r>
               <w:rPr>
                 <w:i/>
                 <w:color w:val="64748B"/>
               </w:rPr>
-              <w:t>(Игровой Цикл (Game Loop))</w:t>
+              <w:t>(Пошаговое Рассуждение (Chain-of-Thought))</w:t>
             </w:r>
           </w:p>
         </w:tc>
@@ -5408,14 +5712,14 @@
           </w:tcPr>
           <w:p>
             <w:r>
-              <w:t xml:space="preserve">`requestAnimationFrame` brauzerning monitor yangilanish tezligiga (odatda 60 FPS) mos ravishda silliq harakatni ta'minlaydi. </w:t>
+              <w:t xml:space="preserve">Bosqichma-bosqich fikrlash AI ga oraliq xulosalar chiqarishga imkon beradi va to'g'ri yakuniy javobni kafolatlaydi. </w:t>
             </w:r>
             <w:r>
               <w:rPr>
                 <w:i/>
                 <w:color w:val="64748B"/>
               </w:rPr>
-              <w:t>(`requestAnimationFrame` синхронизирует перерисовку кадров с частотой монитора для максимально плавного движения.)</w:t>
+              <w:t>(Цепочка рассуждений позволяет AI делать промежуточные выводы и приходить к безошибочному решению.)</w:t>
             </w:r>
           </w:p>
         </w:tc>
@@ -5500,14 +5804,14 @@
               <w:rPr>
                 <w:b/>
               </w:rPr>
-              <w:t xml:space="preserve">Kadrni Tozalash </w:t>
+              <w:t xml:space="preserve">Kontekst Tushunchasi </w:t>
             </w:r>
             <w:r>
               <w:rPr>
                 <w:i/>
                 <w:color w:val="64748B"/>
               </w:rPr>
-              <w:t>(Очистка Кадра)</w:t>
+              <w:t>(Понятие Контекста)</w:t>
             </w:r>
           </w:p>
         </w:tc>
@@ -5529,14 +5833,14 @@
           </w:tcPr>
           <w:p>
             <w:r>
-              <w:t xml:space="preserve">Agar `ctx.clearRect` ishlatilmasa, qahramon harakatlanganda uning eski chizilgan rasmlari ekranda qolib ketadi (iz qoldiradi). </w:t>
+              <w:t xml:space="preserve">Kontekst — AI eslab turadigan suhbat tarixi. Yangi savol berilganda AI oldingi javoblarni kontekstdan oladi. </w:t>
             </w:r>
             <w:r>
               <w:rPr>
                 <w:i/>
                 <w:color w:val="64748B"/>
               </w:rPr>
-              <w:t>(`ctx.clearRect` стирает содержимое холста перед отрисовкой нового кадра, исключая размазывание графики.)</w:t>
+              <w:t>(Контекст — это оперативная память диалога, благодаря которой AI помнит тему беседы и предыдущие задачи.)</w:t>
             </w:r>
           </w:p>
         </w:tc>
@@ -5624,14 +5928,14 @@
               <w:rPr>
                 <w:b/>
               </w:rPr>
-              <w:t xml:space="preserve">Shakllar Chizish </w:t>
+              <w:t xml:space="preserve">AI Kodini Ishga Tushirish </w:t>
             </w:r>
             <w:r>
               <w:rPr>
                 <w:i/>
                 <w:color w:val="64748B"/>
               </w:rPr>
-              <w:t>(Рисование Фигур)</w:t>
+              <w:t>(Запуск Кода от AI)</w:t>
             </w:r>
           </w:p>
         </w:tc>
@@ -5654,14 +5958,14 @@
           </w:tcPr>
           <w:p>
             <w:r>
-              <w:t xml:space="preserve">`fillRect(x, y, w, h)` metodi berilgan koordinatalarda to'ldirilgan to'rtburchak chizadi. </w:t>
+              <w:t xml:space="preserve">HTML/CSS/JS fayllari mustaqil veb-sahifa bo'lib, har qanday brauzerda maxsus dastursiz ham darhol ochiladi. </w:t>
             </w:r>
             <w:r>
               <w:rPr>
                 <w:i/>
                 <w:color w:val="64748B"/>
               </w:rPr>
-              <w:t>(Метод `fillRect(x, y, w, h)` рисует закрашенный прямоугольник по заданным координатам и размерам.)</w:t>
+              <w:t>(Файлы HTML открываются стандартным браузером на любом компьютере и смартфоне без дополнительного ПО.)</w:t>
             </w:r>
           </w:p>
         </w:tc>
@@ -5746,14 +6050,14 @@
               <w:rPr>
                 <w:b/>
               </w:rPr>
-              <w:t xml:space="preserve">To'qnashuv (Collision) </w:t>
+              <w:t xml:space="preserve">AI Bilan Debugging (Tuzatish) </w:t>
             </w:r>
             <w:r>
               <w:rPr>
                 <w:i/>
                 <w:color w:val="64748B"/>
               </w:rPr>
-              <w:t>(Коллизии (Столкновения))</w:t>
+              <w:t>(AI-Отладка (Debugging))</w:t>
             </w:r>
           </w:p>
         </w:tc>
@@ -5775,14 +6079,14 @@
           </w:tcPr>
           <w:p>
             <w:r>
-              <w:t xml:space="preserve">Collision Detection — ikki obyektning koordinatalari bir-birining ustiga tushganini matematik hisoblash mexanizmidir. </w:t>
+              <w:t xml:space="preserve">Vibecoding madaniyatida xatolik matnini AI ga qayta taqdim etish eng tezkor va samarali tuzatish yo'lidir. </w:t>
             </w:r>
             <w:r>
               <w:rPr>
                 <w:i/>
                 <w:color w:val="64748B"/>
               </w:rPr>
-              <w:t>(Collision Detection — это математический расчет пересечения границ двух объектов на игровом поле.)</w:t>
+              <w:t>(В культуре Vibecoding передача точного текста ошибки в AI является самым быстрым способом получения рабочего фикса.)</w:t>
             </w:r>
           </w:p>
         </w:tc>
@@ -5870,14 +6174,14 @@
               <w:rPr>
                 <w:b/>
               </w:rPr>
-              <w:t xml:space="preserve">Shart Operatorlari (if/else) </w:t>
+              <w:t xml:space="preserve">Few-Shot Prompting </w:t>
             </w:r>
             <w:r>
               <w:rPr>
                 <w:i/>
                 <w:color w:val="64748B"/>
               </w:rPr>
-              <w:t>(Условные Операторы (if/else))</w:t>
+              <w:t>(Few-Shot Prompting)</w:t>
             </w:r>
           </w:p>
         </w:tc>
@@ -5900,14 +6204,14 @@
           </w:tcPr>
           <w:p>
             <w:r>
-              <w:t xml:space="preserve">`if (isColliding) { hp = hp - 1; }` — agar to'qnashuv yuz bersa, joriy jon miqdoridan 1 ta ayirib tashlaydi. </w:t>
+              <w:t xml:space="preserve">Few-shot usulida namuna ko'rsatilganda AI siz kutgan aniq format va uslubni darhol tushunadi. </w:t>
             </w:r>
             <w:r>
               <w:rPr>
                 <w:i/>
                 <w:color w:val="64748B"/>
               </w:rPr>
-              <w:t>(Если обнаружено столкновение (`isColliding`), то от текущего значения здоровья отнимается единица.)</w:t>
+              <w:t>(Примеры прямо в промпте наглядно задают нейросети формат, структуру и тон ответа без долгих объяснений.)</w:t>
             </w:r>
           </w:p>
         </w:tc>
@@ -5992,14 +6296,14 @@
               <w:rPr>
                 <w:b/>
               </w:rPr>
-              <w:t xml:space="preserve">Game Over Holati </w:t>
+              <w:t xml:space="preserve">Rasm Generatsiyasi Promptlari </w:t>
             </w:r>
             <w:r>
               <w:rPr>
                 <w:i/>
                 <w:color w:val="64748B"/>
               </w:rPr>
-              <w:t>(Состояние Game Over)</w:t>
+              <w:t>(Промпты для Генерации Изображений)</w:t>
             </w:r>
           </w:p>
         </w:tc>
@@ -6021,14 +6325,14 @@
           </w:tcPr>
           <w:p>
             <w:r>
-              <w:t xml:space="preserve">HP nolga teng bo'lganda o'yin tsikli to'xtatiladi va qayta boshlash imkoniyati bilan yakuniy natija ko'rsatiladi. </w:t>
+              <w:t xml:space="preserve">Vizual promptlarda yorug'lik, uslub, atmosfera va detallar qanchalik aniq yozilsa, rasm shunchalik chiroyli chiqadi. </w:t>
             </w:r>
             <w:r>
               <w:rPr>
                 <w:i/>
                 <w:color w:val="64748B"/>
               </w:rPr>
-              <w:t>(При нулевом HP игра завершается, фиксируется финальный счет и пользователю предлагается повторить попытку.)</w:t>
+              <w:t>(Чем точнее описаны стиль, свет, ракурс и композиция, тем привлекательнее получается сгенерированное изображение.)</w:t>
             </w:r>
           </w:p>
         </w:tc>
@@ -6116,14 +6420,14 @@
               <w:rPr>
                 <w:b/>
               </w:rPr>
-              <w:t xml:space="preserve">Ballarni Oshirish </w:t>
+              <w:t xml:space="preserve">Negative Prompt Tushunchasi </w:t>
             </w:r>
             <w:r>
               <w:rPr>
                 <w:i/>
                 <w:color w:val="64748B"/>
               </w:rPr>
-              <w:t>(Увеличение Счета)</w:t>
+              <w:t>(Отрицательный Промпт (Negative))</w:t>
             </w:r>
           </w:p>
         </w:tc>
@@ -6146,14 +6450,14 @@
           </w:tcPr>
           <w:p>
             <w:r>
-              <w:t xml:space="preserve">`score += 10` amali joriy ballga 10 qo'shib, o'zgaruvchining yangi qiymatini xotirada yangilaydi. </w:t>
+              <w:t xml:space="preserve">Negative prompt orqali keraksiz elementlar filtrlanadi, bu esa tasvir sifatini oshiradi. </w:t>
             </w:r>
             <w:r>
               <w:rPr>
                 <w:i/>
                 <w:color w:val="64748B"/>
               </w:rPr>
-              <w:t>(Оператор `score += 10` прибавляет 10 к текущему значению переменной счета и сохраняет результат.)</w:t>
+              <w:t>(Отрицательный промпт фильтрует артефакты и нежелательные объекты, повышая чистоту композиции.)</w:t>
             </w:r>
           </w:p>
         </w:tc>
@@ -6238,14 +6542,14 @@
               <w:rPr>
                 <w:b/>
               </w:rPr>
-              <w:t xml:space="preserve">Sakrash Mexanikasi </w:t>
+              <w:t xml:space="preserve">Fakt-cheking va Mas'uliyat </w:t>
             </w:r>
             <w:r>
               <w:rPr>
                 <w:i/>
                 <w:color w:val="64748B"/>
               </w:rPr>
-              <w:t>(Механика Прыжка)</w:t>
+              <w:t>(Фактчекинг и Ответственность)</w:t>
             </w:r>
           </w:p>
         </w:tc>
@@ -6267,14 +6571,14 @@
           </w:tcPr>
           <w:p>
             <w:r>
-              <w:t xml:space="preserve">Sakrash vertikal harakat bo'lib, Y o'qi bo'yicha yuqoriga ko'tarilish va gravitatsiya kuchi ta'sirida yerga qaytish orqali hosil qilinadi. </w:t>
+              <w:t xml:space="preserve">AI yordamchi vositadir; o'quvchi ma'lumotning to'g'riligini doimo darslik yoki ishonchli manbalardan tekshirishi kerak. </w:t>
             </w:r>
             <w:r>
               <w:rPr>
                 <w:i/>
                 <w:color w:val="64748B"/>
               </w:rPr>
-              <w:t>(Прыжок — это вертикальное перемещение по оси Y: сначала вверх (уменьшение Y), затем падение вниз под силой тяжести.)</w:t>
+              <w:t>(AI — умный ассистент, но ответственность за достоверность информации всегда лежит на человеке.)</w:t>
             </w:r>
           </w:p>
         </w:tc>
@@ -6362,14 +6666,14 @@
               <w:rPr>
                 <w:b/>
               </w:rPr>
-              <w:t xml:space="preserve">Gravitatsiya Fizikasi </w:t>
+              <w:t xml:space="preserve">Natija Formatini Belgilash </w:t>
             </w:r>
             <w:r>
               <w:rPr>
                 <w:i/>
                 <w:color w:val="64748B"/>
               </w:rPr>
-              <w:t>(Физика Гравитации)</w:t>
+              <w:t>(Фиксация Формата Ответа)</w:t>
             </w:r>
           </w:p>
         </w:tc>
@@ -6392,14 +6696,14 @@
           </w:tcPr>
           <w:p>
             <w:r>
-              <w:t xml:space="preserve">Gravitatsiya kuchi vertikal tezlikni pastga tomon oshirib boradi, natijada qahramon polga (yerga) realistik tushadi. </w:t>
+              <w:t xml:space="preserve">Formatni belgilash orqali ortiqcha gaplarsiz darhol jadval, ro'yxat yoki toza kod olish mumkin. </w:t>
             </w:r>
             <w:r>
               <w:rPr>
                 <w:i/>
                 <w:color w:val="64748B"/>
               </w:rPr>
-              <w:t>(Гравитация непрерывно увеличивает вертикальную скорость падения, создавая реалистичное приземление на платформу.)</w:t>
+              <w:t>(Четкое указание формата отсекает лишние рассуждения и выдает готовую структурированную таблицу или список.)</w:t>
             </w:r>
           </w:p>
         </w:tc>
@@ -6484,14 +6788,14 @@
               <w:rPr>
                 <w:b/>
               </w:rPr>
-              <w:t xml:space="preserve">Dushman Patrul AI </w:t>
+              <w:t xml:space="preserve">Iterativ Rivojlanish </w:t>
             </w:r>
             <w:r>
               <w:rPr>
                 <w:i/>
                 <w:color w:val="64748B"/>
               </w:rPr>
-              <w:t>(Патрулирование Врага (AI))</w:t>
+              <w:t>(Итеративная Разработка)</w:t>
             </w:r>
           </w:p>
         </w:tc>
@@ -6513,14 +6817,14 @@
           </w:tcPr>
           <w:p>
             <w:r>
-              <w:t xml:space="preserve">Tezlik ishorasini teskariga burish (`vx = -vx`) orqali dushman chegara nuqtalarida o'z yo'nalishini avtomatik o'zgartirib turadi. </w:t>
+              <w:t xml:space="preserve">Vibecoding doimiy muloqotdir: avval sodda skelet olinadi, keyin ranglar, keyin funksiyalar qo'shiladi. </w:t>
             </w:r>
             <w:r>
               <w:rPr>
                 <w:i/>
                 <w:color w:val="64748B"/>
               </w:rPr>
-              <w:t>(Смена знака скорости (`vx = -vx`) заставляет врага разворачиваться при достижении края платформы или препятствия.)</w:t>
+              <w:t>(Vibecoding — это непрерывный диалог: сначала генерируется база, затем добавляются стили, логика и анимация.)</w:t>
             </w:r>
           </w:p>
         </w:tc>
@@ -6608,14 +6912,14 @@
               <w:rPr>
                 <w:b/>
               </w:rPr>
-              <w:t xml:space="preserve">Ta'qib AI Mantiqi </w:t>
+              <w:t xml:space="preserve">AI Bilan Prezentatsiya </w:t>
             </w:r>
             <w:r>
               <w:rPr>
                 <w:i/>
                 <w:color w:val="64748B"/>
               </w:rPr>
-              <w:t>(Логика Преследования AI)</w:t>
+              <w:t>(Презентации с Помощью AI)</w:t>
             </w:r>
           </w:p>
         </w:tc>
@@ -6638,14 +6942,14 @@
           </w:tcPr>
           <w:p>
             <w:r>
-              <w:t xml:space="preserve">Qahramon koordinatasi bilan dushman koordinatasini solishtirish orqali dushman doimo qahramon tomon yo'naladi. </w:t>
+              <w:t xml:space="preserve">Mavzu, slaydlar soni va har bir slayd tarkibi ko'rsatilgan prompt tayyor va tartibli prezentatsiya beradi. </w:t>
             </w:r>
             <w:r>
               <w:rPr>
                 <w:i/>
                 <w:color w:val="64748B"/>
               </w:rPr>
-              <w:t>(Сравнение координат игрока и врага позволяет боту постоянно двигаться в направлении цели.)</w:t>
+              <w:t>(Указание темы, числа слайдов и аудитории позволяет получить готовую структуру для каждого экрана.)</w:t>
             </w:r>
           </w:p>
         </w:tc>
@@ -6730,14 +7034,14 @@
               <w:rPr>
                 <w:b/>
               </w:rPr>
-              <w:t xml:space="preserve">Boss Jangi Mexanikasi </w:t>
+              <w:t xml:space="preserve">AI da Maxfiylik Xavfsizligi </w:t>
             </w:r>
             <w:r>
               <w:rPr>
                 <w:i/>
                 <w:color w:val="64748B"/>
               </w:rPr>
-              <w:t>(Механика Битвы с Боссом)</w:t>
+              <w:t>(Приватность и Безопасность)</w:t>
             </w:r>
           </w:p>
         </w:tc>
@@ -6759,14 +7063,14 @@
           </w:tcPr>
           <w:p>
             <w:r>
-              <w:t xml:space="preserve">Boss murakkab o'yin obyekti bo'lib, katta HP sig'imi va bir necha fazali xatti-harakatlarga ega bo'ladi. </w:t>
+              <w:t xml:space="preserve">Hech qachon shaxsiy maxfiy ma'lumotlarni ochiq AI botlariga kiritmaslik kerak. </w:t>
             </w:r>
             <w:r>
               <w:rPr>
                 <w:i/>
                 <w:color w:val="64748B"/>
               </w:rPr>
-              <w:t>(Босс представляет собой усиленного противника с большим запасом HP и разнообразными фазами поведения.)</w:t>
+              <w:t>(Персональные и конфиденциальные данные никогда не должны попадать в публичные чаты с AI.)</w:t>
             </w:r>
           </w:p>
         </w:tc>
@@ -6854,14 +7158,14 @@
               <w:rPr>
                 <w:b/>
               </w:rPr>
-              <w:t xml:space="preserve">LocalStorage da Saqlash </w:t>
+              <w:t xml:space="preserve">HTML, CSS, JS Triadasi </w:t>
             </w:r>
             <w:r>
               <w:rPr>
                 <w:i/>
                 <w:color w:val="64748B"/>
               </w:rPr>
-              <w:t>(Хранение в LocalStorage)</w:t>
+              <w:t>(Триада HTML, CSS и JS)</w:t>
             </w:r>
           </w:p>
         </w:tc>
@@ -6884,14 +7188,14 @@
           </w:tcPr>
           <w:p>
             <w:r>
-              <w:t xml:space="preserve">`localStorage` ma'lumotlarni brauzer xotirasida saqlab qoladi, sahifa qayta yangilanganda ham natija o'chmaydi. </w:t>
+              <w:t xml:space="preserve">Veb-loyihalarda HTML karkas, CSS tashqi ko'rinish, JavaScript esa harakat va hisob-kitobni ta'minlaydi. </w:t>
             </w:r>
             <w:r>
               <w:rPr>
                 <w:i/>
                 <w:color w:val="64748B"/>
               </w:rPr>
-              <w:t>(`localStorage` позволяет браузеру сохранять текстовые данные на диске между сессиями пользователя.)</w:t>
+              <w:t>(HTML формирует элементы страницы, CSS задает цвета и отступы, а JavaScript выполняет расчеты.)</w:t>
             </w:r>
           </w:p>
         </w:tc>
@@ -6976,14 +7280,14 @@
               <w:rPr>
                 <w:b/>
               </w:rPr>
-              <w:t xml:space="preserve">Level Xaritasi va Grid </w:t>
+              <w:t xml:space="preserve">Live Server Vositalari </w:t>
             </w:r>
             <w:r>
               <w:rPr>
                 <w:i/>
                 <w:color w:val="64748B"/>
               </w:rPr>
-              <w:t>(Карта Уровня и Сетка (Grid))</w:t>
+              <w:t>(Инструмент Live Server)</w:t>
             </w:r>
           </w:p>
         </w:tc>
@@ -7005,14 +7309,14 @@
           </w:tcPr>
           <w:p>
             <w:r>
-              <w:t xml:space="preserve">2D massiv (matritsa) xarita bloklarini qator va ustunlar bo'yicha qulay raqamlar bilan ifodalash imkonini beradi. </w:t>
+              <w:t xml:space="preserve">Live Server har bir `Ctrl+S` bosilganda natijani brauzerda qayta yuklamasdan jonli ko'rsatadi. </w:t>
             </w:r>
             <w:r>
               <w:rPr>
                 <w:i/>
                 <w:color w:val="64748B"/>
               </w:rPr>
-              <w:t>(Двумерный массив (матрица) наглядно кодирует клетки игрового поля по строкам и столбцам.)</w:t>
+              <w:t>(Live Server экономит время: каждое сохранение кода (`Ctrl+S`) сразу отображается в окне браузера.)</w:t>
             </w:r>
           </w:p>
         </w:tc>
@@ -7100,14 +7404,14 @@
               <w:rPr>
                 <w:b/>
               </w:rPr>
-              <w:t xml:space="preserve">O'yin Ovoz Efekti </w:t>
+              <w:t xml:space="preserve">Kodni Izohlash (Comments) </w:t>
             </w:r>
             <w:r>
               <w:rPr>
                 <w:i/>
                 <w:color w:val="64748B"/>
               </w:rPr>
-              <w:t>(Игровые Звуковые Эффекты)</w:t>
+              <w:t>(Комментарии в Коде)</w:t>
             </w:r>
           </w:p>
         </w:tc>
@@ -7130,14 +7434,14 @@
           </w:tcPr>
           <w:p>
             <w:r>
-              <w:t xml:space="preserve">Veb o'yinlarida tovushlar `&lt;audio&gt;` elementlari yoki brauzerning Web Audio API audio-konteksti orqali chalinadi. </w:t>
+              <w:t xml:space="preserve">Izohlar dasturchiga va boshqalarga kodning qanday ishlashini o'rganishda yordam beradi. </w:t>
             </w:r>
             <w:r>
               <w:rPr>
                 <w:i/>
                 <w:color w:val="64748B"/>
               </w:rPr>
-              <w:t>(Звуковые эффекты проигрываются через HTML5 Audio элементы либо синтезируются через Web Audio API.)</w:t>
+              <w:t>(Комментарии помогают разработчику и другим людям быстро разобраться, как работает каждая часть программы.)</w:t>
             </w:r>
           </w:p>
         </w:tc>
@@ -7222,14 +7526,14 @@
               <w:rPr>
                 <w:b/>
               </w:rPr>
-              <w:t xml:space="preserve">AI Bilan Debugging </w:t>
+              <w:t xml:space="preserve">Logo Dizayni Promptlari </w:t>
             </w:r>
             <w:r>
               <w:rPr>
                 <w:i/>
                 <w:color w:val="64748B"/>
               </w:rPr>
-              <w:t>(AI-Debugging Ошибок)</w:t>
+              <w:t>(Промпты для Логотипов)</w:t>
             </w:r>
           </w:p>
         </w:tc>
@@ -7251,14 +7555,14 @@
           </w:tcPr>
           <w:p>
             <w:r>
-              <w:t xml:space="preserve">Vibecoding madaniyatida AI ga aniq xatolik matnini uzatish eng tezkor va o'rgatuvchi tuzatish yo'lidir. </w:t>
+              <w:t xml:space="preserve">Professional logotiplar sodda, minimalistik va taniqli bo'lishi kerak. Bu talablar promptda aytiladi. </w:t>
             </w:r>
             <w:r>
               <w:rPr>
                 <w:i/>
                 <w:color w:val="64748B"/>
               </w:rPr>
-              <w:t>(В культуре Vibecoding передача точного текста ошибки в AI является самым быстрым и обучающим способом решения проблемы.)</w:t>
+              <w:t>(Хороший логотип узнаваем и лаконичен. Минимализм и чистый фон — стандарты современного брендинга.)</w:t>
             </w:r>
           </w:p>
         </w:tc>
@@ -7346,14 +7650,14 @@
               <w:rPr>
                 <w:b/>
               </w:rPr>
-              <w:t xml:space="preserve">CSS va O'yin Vizuali </w:t>
+              <w:t xml:space="preserve">AI Workflow (Ish Jarayoni) </w:t>
             </w:r>
             <w:r>
               <w:rPr>
                 <w:i/>
                 <w:color w:val="64748B"/>
               </w:rPr>
-              <w:t>(CSS и Визуальный Стиль)</w:t>
+              <w:t>(Комплексный AI Workflow)</w:t>
             </w:r>
           </w:p>
         </w:tc>
@@ -7376,14 +7680,14 @@
           </w:tcPr>
           <w:p>
             <w:r>
-              <w:t xml:space="preserve">CSS (Cascading Style Sheets) o'yin interfeysini jozibador, responsiv va zamonaviy ko'rinishga keltirish uchun mas'uldir. </w:t>
+              <w:t xml:space="preserve">Eng zo'r vibecoderlar har bir vazifa uchun eng kuchli AI vositasini tanlab, ularni bitta zanjirga birlashtiradi. </w:t>
             </w:r>
             <w:r>
               <w:rPr>
                 <w:i/>
                 <w:color w:val="64748B"/>
               </w:rPr>
-              <w:t>(CSS отвечает за внешнее оформление, шрифты, отступы и привлекательный современный интерфейс игры.)</w:t>
+              <w:t>(Эффективный vibecoder использует лучший инструмент под каждую подзадачу, собирая их в единую цепочку.)</w:t>
             </w:r>
           </w:p>
         </w:tc>
@@ -7468,14 +7772,14 @@
               <w:rPr>
                 <w:b/>
               </w:rPr>
-              <w:t xml:space="preserve">O'yinni Qayta Yuklash </w:t>
+              <w:t xml:space="preserve">Veb Deploy Qilish </w:t>
             </w:r>
             <w:r>
               <w:rPr>
                 <w:i/>
                 <w:color w:val="64748B"/>
               </w:rPr>
-              <w:t>(Перезапуск Игры (Restart))</w:t>
+              <w:t>(Публикация (Deploy))</w:t>
             </w:r>
           </w:p>
         </w:tc>
@@ -7497,14 +7801,14 @@
           </w:tcPr>
           <w:p>
             <w:r>
-              <w:t xml:space="preserve">Restart funksiyasi o'yin holatini (state) tozalab, o'yinchiga darhol yangi urinish beradi. </w:t>
+              <w:t xml:space="preserve">Vercel va Netlify loyihalarni global internetda ishga tushirish uchun havola (URL) va QR kod beradi. </w:t>
             </w:r>
             <w:r>
               <w:rPr>
                 <w:i/>
                 <w:color w:val="64748B"/>
               </w:rPr>
-              <w:t>(Функция Restart сбрасывает состояние игры (State) к исходным параметрам и начинает новый раунд.)</w:t>
+              <w:t>(Платформы Vercel и Netlify дают глобальную ссылку и QR-код для демонстрации проекта друзьям и родителям.)</w:t>
             </w:r>
           </w:p>
         </w:tc>
@@ -7592,14 +7896,14 @@
               <w:rPr>
                 <w:b/>
               </w:rPr>
-              <w:t xml:space="preserve">Veb Deploy va Ulashish </w:t>
+              <w:t xml:space="preserve">Vibecoder Ko'nikmalari </w:t>
             </w:r>
             <w:r>
               <w:rPr>
                 <w:i/>
                 <w:color w:val="64748B"/>
               </w:rPr>
-              <w:t>(Деплой и Публикация Игры)</w:t>
+              <w:t>(Навыки Vibecoder-а)</w:t>
             </w:r>
           </w:p>
         </w:tc>
@@ -7622,14 +7926,14 @@
           </w:tcPr>
           <w:p>
             <w:r>
-              <w:t xml:space="preserve">Vercel yoki GitHub Pages orqali bir necha soniyada o'yin global internetga chiqadi va har qanday telefonda QR kod orqali ochiladi. </w:t>
+              <w:t xml:space="preserve">Vibecoding — bu ijodkorlik, mantiqiy fikrlash va AI vositalaridan to'g'ri foydalanib natija ko'rsatish san'atidir. </w:t>
             </w:r>
             <w:r>
               <w:rPr>
                 <w:i/>
                 <w:color w:val="64748B"/>
               </w:rPr>
-              <w:t>(Сервисы Vercel и GitHub Pages публикуют веб-проекты за считанные секунды, делая их доступными по всему миру.)</w:t>
+              <w:t>(Vibecoding развивает продуктовое мышление: от зарождения идеи в голове до ее воплощения в коде вместе с AI.)</w:t>
             </w:r>
           </w:p>
         </w:tc>

</xml_diff>

<commit_message>
feat(5-6): rewrite Grade 5-6 test to general game dev and cyber safety concepts without presentation memorization
</commit_message>
<xml_diff>
--- a/tests/TEST_5-6_SINF_VIBECODING.docx
+++ b/tests/TEST_5-6_SINF_VIBECODING.docx
@@ -341,7 +341,7 @@
           <w:color w:val="0F172A"/>
           <w:sz w:val="20"/>
         </w:rPr>
-        <w:t xml:space="preserve">1-darsga ko'ra, Sun'iy intellekt (AI) nima va u bizga qanday yordam beradi? </w:t>
+        <w:t xml:space="preserve">Sun'iy intellekt (AI) nima va u insonlarga nima uchun kerak? </w:t>
       </w:r>
       <w:r>
         <w:rPr>
@@ -350,7 +350,7 @@
           <w:color w:val="475569"/>
           <w:sz w:val="19"/>
         </w:rPr>
-        <w:t>(Согласно Уроку 1, что такое Искусственный Интеллект (ИИ) и как он нам помогает?)</w:t>
+        <w:t>(Что такое искусственный интеллект (ИИ) и зачем он нужен людям?)</w:t>
       </w:r>
     </w:p>
     <w:p>
@@ -371,7 +371,7 @@
           <w:color w:val="0F172A"/>
           <w:sz w:val="19"/>
         </w:rPr>
-        <w:t xml:space="preserve">U inson kabi tirik mavjudot bo'lib, o'zi mustaqil ovqatlanadi. </w:t>
+        <w:t xml:space="preserve">Inson kabi o'zi mustaqil ovqatlanadigan tirik robot. </w:t>
       </w:r>
       <w:r>
         <w:rPr>
@@ -379,7 +379,7 @@
           <w:color w:val="505F73"/>
           <w:sz w:val="18"/>
         </w:rPr>
-        <w:t>(Это живое существо, как человек, которое само кушает.)</w:t>
+        <w:t>(Живой робот, который сам питается едой как человек.)</w:t>
       </w:r>
     </w:p>
     <w:p>
@@ -400,7 +400,7 @@
           <w:color w:val="0F172A"/>
           <w:sz w:val="19"/>
         </w:rPr>
-        <w:t xml:space="preserve">U oddiy devor soati. </w:t>
+        <w:t xml:space="preserve">Oddiy devor soati. </w:t>
       </w:r>
       <w:r>
         <w:rPr>
@@ -408,7 +408,7 @@
           <w:color w:val="505F73"/>
           <w:sz w:val="18"/>
         </w:rPr>
-        <w:t>(Это обычные простые часы на стене.)</w:t>
+        <w:t>(Обычные настенные часы.)</w:t>
       </w:r>
     </w:p>
     <w:p>
@@ -429,7 +429,7 @@
           <w:color w:val="0F172A"/>
           <w:sz w:val="19"/>
         </w:rPr>
-        <w:t xml:space="preserve">U aqlli kompyuter dasturi bo'lib, bizga matn yozish, rasm chizish va o'yin yaratishda yordam beradi. </w:t>
+        <w:t xml:space="preserve">Inson bergan savollarga javob beradigan, matn va rasmlar yaratishda yordam beradigan aqlli kompyuter dasturi. </w:t>
       </w:r>
       <w:r>
         <w:rPr>
@@ -437,7 +437,7 @@
           <w:color w:val="505F73"/>
           <w:sz w:val="18"/>
         </w:rPr>
-        <w:t>(Это умная компьютерная программа, которая помогает нам писать тексты, рисовать и создавать игры.)</w:t>
+        <w:t>(Умная компьютерная программа, помогающая отвечать на вопросы, создавать тексты и картинки.)</w:t>
       </w:r>
     </w:p>
     <w:p>
@@ -458,7 +458,7 @@
           <w:color w:val="0F172A"/>
           <w:sz w:val="19"/>
         </w:rPr>
-        <w:t xml:space="preserve">U kompyuterni buzadigan zararli virus. </w:t>
+        <w:t xml:space="preserve">Faqatgina kompyuter monitorining elektr simi. </w:t>
       </w:r>
       <w:r>
         <w:rPr>
@@ -466,7 +466,7 @@
           <w:color w:val="505F73"/>
           <w:sz w:val="18"/>
         </w:rPr>
-        <w:t>(Это вредоносный вирус, ломающий компьютер.)</w:t>
+        <w:t>(Всего лишь провод питания компьютерного монитора.)</w:t>
       </w:r>
     </w:p>
     <w:p>
@@ -487,7 +487,7 @@
           <w:color w:val="0F172A"/>
           <w:sz w:val="19"/>
         </w:rPr>
-        <w:t xml:space="preserve">U faqat telefonning batareyasini quvvatlaydigan sim. </w:t>
+        <w:t xml:space="preserve">Kompyuterni buzadigan xavfli virus. </w:t>
       </w:r>
       <w:r>
         <w:rPr>
@@ -495,7 +495,7 @@
           <w:color w:val="505F73"/>
           <w:sz w:val="18"/>
         </w:rPr>
-        <w:t>(Это провод, который только заряжает аккумулятор телефона.)</w:t>
+        <w:t>(Опасный компьютерный вирус, ломающий программы.)</w:t>
       </w:r>
     </w:p>
     <w:p>
@@ -517,7 +517,7 @@
           <w:color w:val="0F172A"/>
           <w:sz w:val="20"/>
         </w:rPr>
-        <w:t xml:space="preserve">2-darsda AI yordamida o'yin qahramoniga (NPC) xarakter berish uchun nima qilish kerak? </w:t>
+        <w:t xml:space="preserve">Sun'iy intellektga biror narsa chizdirish yoki yozdirish uchun beriladigan buyruq qanday ataladi? </w:t>
       </w:r>
       <w:r>
         <w:rPr>
@@ -526,7 +526,7 @@
           <w:color w:val="475569"/>
           <w:sz w:val="19"/>
         </w:rPr>
-        <w:t>(Что нужно сделать на Уроке 2 в промпте, чтобы задать характер игровому персонажу (NPC)?)</w:t>
+        <w:t>(Как называется команда или инструкция, которую мы пишем искусственному интеллекту?)</w:t>
       </w:r>
     </w:p>
     <w:p>
@@ -547,7 +547,7 @@
           <w:color w:val="0F172A"/>
           <w:sz w:val="19"/>
         </w:rPr>
-        <w:t xml:space="preserve">Klaviatura simini uzib qo'yish kerak. </w:t>
+        <w:t xml:space="preserve">Klaviatura drayveri </w:t>
       </w:r>
       <w:r>
         <w:rPr>
@@ -555,7 +555,7 @@
           <w:color w:val="505F73"/>
           <w:sz w:val="18"/>
         </w:rPr>
-        <w:t>(Нужно выдернуть шнур клавиатуры.)</w:t>
+        <w:t>(Драйвер клавиатуры)</w:t>
       </w:r>
     </w:p>
     <w:p>
@@ -576,7 +576,7 @@
           <w:color w:val="0F172A"/>
           <w:sz w:val="19"/>
         </w:rPr>
-        <w:t xml:space="preserve">Kompyuter ekranini o'chirib qo'yish kerak. </w:t>
+        <w:t xml:space="preserve">Wi-Fi paroli </w:t>
       </w:r>
       <w:r>
         <w:rPr>
@@ -584,7 +584,7 @@
           <w:color w:val="505F73"/>
           <w:sz w:val="18"/>
         </w:rPr>
-        <w:t>(Нужно просто выключить монитор компьютера.)</w:t>
+        <w:t>(Пароль от Wi-Fi)</w:t>
       </w:r>
     </w:p>
     <w:p>
@@ -605,7 +605,7 @@
           <w:color w:val="0F172A"/>
           <w:sz w:val="19"/>
         </w:rPr>
-        <w:t xml:space="preserve">O'yin qahramoniga faqat raqamlarni aytish kerak. </w:t>
+        <w:t xml:space="preserve">Kompyuter qutisi </w:t>
       </w:r>
       <w:r>
         <w:rPr>
@@ -613,7 +613,7 @@
           <w:color w:val="505F73"/>
           <w:sz w:val="18"/>
         </w:rPr>
-        <w:t>(Нужно заставить персонажа называть только цифры.)</w:t>
+        <w:t>(Корпус компьютера)</w:t>
       </w:r>
     </w:p>
     <w:p>
@@ -634,7 +634,7 @@
           <w:color w:val="0F172A"/>
           <w:sz w:val="19"/>
         </w:rPr>
-        <w:t xml:space="preserve">Promptda uning ismi, kasbi, qanday gapirishi (quvnoq yoki botir) va maqsadini yozib berish kerak. </w:t>
+        <w:t xml:space="preserve">Prompt (so'rov yoki ko'rsatma) </w:t>
       </w:r>
       <w:r>
         <w:rPr>
@@ -642,7 +642,7 @@
           <w:color w:val="505F73"/>
           <w:sz w:val="18"/>
         </w:rPr>
-        <w:t>(В промпте нужно четко описать его имя, профессию, настроение (веселый или храбрый) и его цель.)</w:t>
+        <w:t>(Промпт (запрос или инструкция))</w:t>
       </w:r>
     </w:p>
     <w:p>
@@ -663,7 +663,7 @@
           <w:color w:val="0F172A"/>
           <w:sz w:val="19"/>
         </w:rPr>
-        <w:t xml:space="preserve">Faqat bitta nuqta qo'yib yuborish kifoya. </w:t>
+        <w:t xml:space="preserve">Sichqoncha tugmasi </w:t>
       </w:r>
       <w:r>
         <w:rPr>
@@ -671,7 +671,7 @@
           <w:color w:val="505F73"/>
           <w:sz w:val="18"/>
         </w:rPr>
-        <w:t>(Достаточно отправить одну точку.)</w:t>
+        <w:t>(Кнопка мыши)</w:t>
       </w:r>
     </w:p>
     <w:p>
@@ -693,7 +693,7 @@
           <w:color w:val="0F172A"/>
           <w:sz w:val="20"/>
         </w:rPr>
-        <w:t xml:space="preserve">3-darsdagi 'Game Lore' (O'yin afsonasi) nima? </w:t>
+        <w:t xml:space="preserve">AI yordamida o'yin yoki dastur yaratish (Vibecoding) ning asosiy maqsadi nima? </w:t>
       </w:r>
       <w:r>
         <w:rPr>
@@ -702,7 +702,7 @@
           <w:color w:val="475569"/>
           <w:sz w:val="19"/>
         </w:rPr>
-        <w:t>(Что такое 'Game Lore' (Лор и предыстория игры) из Урока 3?)</w:t>
+        <w:t>(В чем главная цель создания игр и программ с помощью ИИ (Vibecoding)?)</w:t>
       </w:r>
     </w:p>
     <w:p>
@@ -723,7 +723,7 @@
           <w:color w:val="0F172A"/>
           <w:sz w:val="19"/>
         </w:rPr>
-        <w:t xml:space="preserve">O'yinchining internetini o'chirish usuli. </w:t>
+        <w:t xml:space="preserve">Internetni butunlay o'chirib qo'yish. </w:t>
       </w:r>
       <w:r>
         <w:rPr>
@@ -731,7 +731,7 @@
           <w:color w:val="505F73"/>
           <w:sz w:val="18"/>
         </w:rPr>
-        <w:t>(Способ отключить интернет игроку.)</w:t>
+        <w:t>(Навсегда отключить интернет.)</w:t>
       </w:r>
     </w:p>
     <w:p>
@@ -752,7 +752,7 @@
           <w:color w:val="0F172A"/>
           <w:sz w:val="19"/>
         </w:rPr>
-        <w:t xml:space="preserve">O'yinni darhol o'chirib tashlash usuli. </w:t>
+        <w:t xml:space="preserve">Faqat tayyor o'yinlarni o'ynab, dars qilmaslik. </w:t>
       </w:r>
       <w:r>
         <w:rPr>
@@ -760,7 +760,7 @@
           <w:color w:val="505F73"/>
           <w:sz w:val="18"/>
         </w:rPr>
-        <w:t>(Способ мгновенно стереть игру с диска.)</w:t>
+        <w:t>(Только играть в готовые игры и не учиться.)</w:t>
       </w:r>
     </w:p>
     <w:p>
@@ -781,7 +781,7 @@
           <w:color w:val="0F172A"/>
           <w:sz w:val="19"/>
         </w:rPr>
-        <w:t xml:space="preserve">O'yin dunyosining qiziqarli hikoyasi, qahramonning siri va sarguzashtli tarixi. </w:t>
+        <w:t xml:space="preserve">O'z g'oyalaringni AI yordamida tezroq va osonroq qiziqarli o'yinga aylantirish. </w:t>
       </w:r>
       <w:r>
         <w:rPr>
@@ -789,7 +789,7 @@
           <w:color w:val="505F73"/>
           <w:sz w:val="18"/>
         </w:rPr>
-        <w:t>(Увлекательная история игрового мира, тайна главного героя и смысл его приключений.)</w:t>
+        <w:t>(Быстрее и проще превращать свои творческие идеи в интересные игры с помощью ИИ.)</w:t>
       </w:r>
     </w:p>
     <w:p>
@@ -810,7 +810,7 @@
           <w:color w:val="0F172A"/>
           <w:sz w:val="19"/>
         </w:rPr>
-        <w:t xml:space="preserve">Faqat kompyuter sichqonchasini tezroq qilish usuli. </w:t>
+        <w:t xml:space="preserve">Kompyuter ekranini bo'yab qo'yish. </w:t>
       </w:r>
       <w:r>
         <w:rPr>
@@ -818,7 +818,7 @@
           <w:color w:val="505F73"/>
           <w:sz w:val="18"/>
         </w:rPr>
-        <w:t>(Исключительно способ ускорения мышки.)</w:t>
+        <w:t>(Раскрасить экран компьютера красками.)</w:t>
       </w:r>
     </w:p>
     <w:p>
@@ -839,7 +839,7 @@
           <w:color w:val="0F172A"/>
           <w:sz w:val="19"/>
         </w:rPr>
-        <w:t xml:space="preserve">O'yinda faqat bitta rang ishlatish qoidasi. </w:t>
+        <w:t xml:space="preserve">Klaviatura tugmalarini yulib olish. </w:t>
       </w:r>
       <w:r>
         <w:rPr>
@@ -847,7 +847,7 @@
           <w:color w:val="505F73"/>
           <w:sz w:val="18"/>
         </w:rPr>
-        <w:t>(Правило использовать в игре только один цвет.)</w:t>
+        <w:t>(Оторвать клавиши на клавиатуре.)</w:t>
       </w:r>
     </w:p>
     <w:p>
@@ -869,7 +869,7 @@
           <w:color w:val="0F172A"/>
           <w:sz w:val="20"/>
         </w:rPr>
-        <w:t xml:space="preserve">4-darsda o'yin uchun boshlang'ich rasm (Concept Art) chizdirishda qaysi uslubni tanlash mumkin? </w:t>
+        <w:t xml:space="preserve">Kompyuter o'yinlarida qahramonni harakatlantirish uchun odatda nimalardan foydalaniladi? </w:t>
       </w:r>
       <w:r>
         <w:rPr>
@@ -878,7 +878,7 @@
           <w:color w:val="475569"/>
           <w:sz w:val="19"/>
         </w:rPr>
-        <w:t>(Какой стиль можно выбрать на Уроке 4 при генерации концепт-арта (Concept Art) для игры?)</w:t>
+        <w:t>(Что обычно используется для управления движением персонажа в компьютерной игре?)</w:t>
       </w:r>
     </w:p>
     <w:p>
@@ -899,7 +899,7 @@
           <w:color w:val="0F172A"/>
           <w:sz w:val="19"/>
         </w:rPr>
-        <w:t xml:space="preserve">Faqat qora dog'lar uslubi. </w:t>
+        <w:t xml:space="preserve">Faqat kompyuter sovutgich fanidan. </w:t>
       </w:r>
       <w:r>
         <w:rPr>
@@ -907,7 +907,7 @@
           <w:color w:val="505F73"/>
           <w:sz w:val="18"/>
         </w:rPr>
-        <w:t>(Стиль размытых черных клякс.)</w:t>
+        <w:t>(Вентилятор охлаждения компьютера.)</w:t>
       </w:r>
     </w:p>
     <w:p>
@@ -928,7 +928,7 @@
           <w:color w:val="0F172A"/>
           <w:sz w:val="19"/>
         </w:rPr>
-        <w:t xml:space="preserve">Pixel Art, Cyberpunk, 3D multfilm yoki Anime uslublari. </w:t>
+        <w:t xml:space="preserve">Klaviatura tugmalari (strelkalar yoki W, A, S, D) va sichqonchadan. </w:t>
       </w:r>
       <w:r>
         <w:rPr>
@@ -936,7 +936,7 @@
           <w:color w:val="505F73"/>
           <w:sz w:val="18"/>
         </w:rPr>
-        <w:t>(Стили Pixel Art, Киберпанк, 3D мультфильм или Аниме.)</w:t>
+        <w:t>(Клавиши на клавиатуре (стрелки или W, A, S, D) и мышь.)</w:t>
       </w:r>
     </w:p>
     <w:p>
@@ -957,7 +957,7 @@
           <w:color w:val="0F172A"/>
           <w:sz w:val="19"/>
         </w:rPr>
-        <w:t xml:space="preserve">Faqat ko'rinmas shaffof uslub. </w:t>
+        <w:t xml:space="preserve">Ovoz karnayining ovoz balandligidan. </w:t>
       </w:r>
       <w:r>
         <w:rPr>
@@ -965,7 +965,7 @@
           <w:color w:val="505F73"/>
           <w:sz w:val="18"/>
         </w:rPr>
-        <w:t>(Только полностью невидимый прозрачный стиль.)</w:t>
+        <w:t>(Регулятор громкости колонок.)</w:t>
       </w:r>
     </w:p>
     <w:p>
@@ -986,7 +986,7 @@
           <w:color w:val="0F172A"/>
           <w:sz w:val="19"/>
         </w:rPr>
-        <w:t xml:space="preserve">Hech qanday uslubni tanlab bo'lmaydi. </w:t>
+        <w:t xml:space="preserve">Monitorning elektr vilkasidan. </w:t>
       </w:r>
       <w:r>
         <w:rPr>
@@ -994,7 +994,7 @@
           <w:color w:val="505F73"/>
           <w:sz w:val="18"/>
         </w:rPr>
-        <w:t>(Никакой стиль выбрать невозможно.)</w:t>
+        <w:t>(Электрическая вилка монитора.)</w:t>
       </w:r>
     </w:p>
     <w:p>
@@ -1015,7 +1015,7 @@
           <w:color w:val="0F172A"/>
           <w:sz w:val="19"/>
         </w:rPr>
-        <w:t xml:space="preserve">Faqat bo'sh oq qog'oz uslubi. </w:t>
+        <w:t xml:space="preserve">Faqatgina printerdan. </w:t>
       </w:r>
       <w:r>
         <w:rPr>
@@ -1023,7 +1023,7 @@
           <w:color w:val="505F73"/>
           <w:sz w:val="18"/>
         </w:rPr>
-        <w:t>(Только стиль чистого белого листа.)</w:t>
+        <w:t>(Только принтер для бумаги.)</w:t>
       </w:r>
     </w:p>
     <w:p>
@@ -1045,7 +1045,7 @@
           <w:color w:val="0F172A"/>
           <w:sz w:val="20"/>
         </w:rPr>
-        <w:t xml:space="preserve">5-darsda 'Deepfake' (sun'iy intellekt chizgan soxta surat) larni qanday payqash mumkin? </w:t>
+        <w:t xml:space="preserve">O'yinlarda qahramonning 'Jonlari' (HP yoki yurakchalar) nima uchun kerak? </w:t>
       </w:r>
       <w:r>
         <w:rPr>
@@ -1054,7 +1054,7 @@
           <w:color w:val="475569"/>
           <w:sz w:val="19"/>
         </w:rPr>
-        <w:t>(По какому признаку на Уроке 5 можно разоблачить 'Дипфейк' (картинку, нарисованную нейросетью)?)</w:t>
+        <w:t>(Для чего в играх нужны «Жизни» (HP или сердечки) персонажа?)</w:t>
       </w:r>
     </w:p>
     <w:p>
@@ -1075,7 +1075,7 @@
           <w:color w:val="0F172A"/>
           <w:sz w:val="19"/>
         </w:rPr>
-        <w:t xml:space="preserve">Surat tiniq ko'ringanidan. </w:t>
+        <w:t xml:space="preserve">Faqat kompyuterni o'chirib qo'yish uchun. </w:t>
       </w:r>
       <w:r>
         <w:rPr>
@@ -1083,7 +1083,7 @@
           <w:color w:val="505F73"/>
           <w:sz w:val="18"/>
         </w:rPr>
-        <w:t>(По тому, что картинка очень четкая.)</w:t>
+        <w:t>(Только для выключения компьютера.)</w:t>
       </w:r>
     </w:p>
     <w:p>
@@ -1104,7 +1104,7 @@
           <w:color w:val="0F172A"/>
           <w:sz w:val="19"/>
         </w:rPr>
-        <w:t xml:space="preserve">Suratda mashina borligidan. </w:t>
+        <w:t xml:space="preserve">O'yin xaritasi rangini o'zgartirish uchun. </w:t>
       </w:r>
       <w:r>
         <w:rPr>
@@ -1112,7 +1112,7 @@
           <w:color w:val="505F73"/>
           <w:sz w:val="18"/>
         </w:rPr>
-        <w:t>(По тому, что на картинке нарисована машина.)</w:t>
+        <w:t>(Чтобы менять цвет игровой карты.)</w:t>
       </w:r>
     </w:p>
     <w:p>
@@ -1133,7 +1133,7 @@
           <w:color w:val="0F172A"/>
           <w:sz w:val="19"/>
         </w:rPr>
-        <w:t xml:space="preserve">Suratda osmon ko'k rangda bo'lishidan. </w:t>
+        <w:t xml:space="preserve">Kompyuter batareyasini zaryadlash uchun. </w:t>
       </w:r>
       <w:r>
         <w:rPr>
@@ -1141,7 +1141,7 @@
           <w:color w:val="505F73"/>
           <w:sz w:val="18"/>
         </w:rPr>
-        <w:t>(По тому, что небо на картинке голубого цвета.)</w:t>
+        <w:t>(Для зарядки аккумулятора ноутбука.)</w:t>
       </w:r>
     </w:p>
     <w:p>
@@ -1162,7 +1162,7 @@
           <w:color w:val="0F172A"/>
           <w:sz w:val="19"/>
         </w:rPr>
-        <w:t xml:space="preserve">Surat fayli nomidan. </w:t>
+        <w:t xml:space="preserve">Monitor ekranini yorqinroq qilish uchun. </w:t>
       </w:r>
       <w:r>
         <w:rPr>
@@ -1170,7 +1170,7 @@
           <w:color w:val="505F73"/>
           <w:sz w:val="18"/>
         </w:rPr>
-        <w:t>(По названию файла фотографии.)</w:t>
+        <w:t>(Чтобы сделать экран монитора ярче.)</w:t>
       </w:r>
     </w:p>
     <w:p>
@@ -1191,7 +1191,7 @@
           <w:color w:val="0F172A"/>
           <w:sz w:val="19"/>
         </w:rPr>
-        <w:t xml:space="preserve">Qo'ldagi barmoqlar soni g'alati (masalan 6 ta) bo'lib qolishi yoki ko'zlardagi akslar tabiiy bo'lmasligidan. </w:t>
+        <w:t xml:space="preserve">Qahramon to'siqqa tekkanda kamayib, nechta imkoniyati qolganini ko'rsatish uchun. </w:t>
       </w:r>
       <w:r>
         <w:rPr>
@@ -1199,7 +1199,7 @@
           <w:color w:val="505F73"/>
           <w:sz w:val="18"/>
         </w:rPr>
-        <w:t>(По странному количеству пальцев на руках (например, 6 пальцев) или неестественным бликам в глазах.)</w:t>
+        <w:t>(Чтобы показывать, сколько попыток осталось у героя при столкновении с препятствиями.)</w:t>
       </w:r>
     </w:p>
     <w:p>
@@ -1221,7 +1221,7 @@
           <w:color w:val="0F172A"/>
           <w:sz w:val="20"/>
         </w:rPr>
-        <w:t xml:space="preserve">6-darsdagi 'Demo Day' taqdimotida bolalar nima haqida gapirib berishadi? </w:t>
+        <w:t xml:space="preserve">O'yindagi to'siqlar (masalan: tikanlar, teshiklar, dushmanlar) nima maqsadda qo'yiladi? </w:t>
       </w:r>
       <w:r>
         <w:rPr>
@@ -1230,7 +1230,7 @@
           <w:color w:val="475569"/>
           <w:sz w:val="19"/>
         </w:rPr>
-        <w:t>(О чем рассказывают ребята во время презентации на 'Demo Day' (Урок 6)?)</w:t>
+        <w:t>(Зачем в игру добавляют препятствия (например: шипы, ловушки, врагов)?)</w:t>
       </w:r>
     </w:p>
     <w:p>
@@ -1251,7 +1251,7 @@
           <w:color w:val="0F172A"/>
           <w:sz w:val="19"/>
         </w:rPr>
-        <w:t xml:space="preserve">Kompyuter ekranining narxi haqida. </w:t>
+        <w:t xml:space="preserve">O'yinchining internet tezligini tushirish uchun. </w:t>
       </w:r>
       <w:r>
         <w:rPr>
@@ -1259,7 +1259,7 @@
           <w:color w:val="505F73"/>
           <w:sz w:val="18"/>
         </w:rPr>
-        <w:t>(О стоимости монитора компьютера.)</w:t>
+        <w:t>(Чтобы снизить скорость интернета.)</w:t>
       </w:r>
     </w:p>
     <w:p>
@@ -1280,7 +1280,7 @@
           <w:color w:val="0F172A"/>
           <w:sz w:val="19"/>
         </w:rPr>
-        <w:t xml:space="preserve">Faqat klaviatura tugmalari soni haqida. </w:t>
+        <w:t xml:space="preserve">Kompyuter xotirasini to'ldirish uchun. </w:t>
       </w:r>
       <w:r>
         <w:rPr>
@@ -1288,7 +1288,7 @@
           <w:color w:val="505F73"/>
           <w:sz w:val="18"/>
         </w:rPr>
-        <w:t>(Только о количестве кнопок на клавиатуре.)</w:t>
+        <w:t>(Чтобы забить память компьютера.)</w:t>
       </w:r>
     </w:p>
     <w:p>
@@ -1309,7 +1309,7 @@
           <w:color w:val="0F172A"/>
           <w:sz w:val="19"/>
         </w:rPr>
-        <w:t xml:space="preserve">Ertalab nima ovqat yeyilgani haqida. </w:t>
+        <w:t xml:space="preserve">O'yinni buzib tashlash uchun. </w:t>
       </w:r>
       <w:r>
         <w:rPr>
@@ -1317,7 +1317,7 @@
           <w:color w:val="505F73"/>
           <w:sz w:val="18"/>
         </w:rPr>
-        <w:t>(О том, что они кушали сегодня на завтрак.)</w:t>
+        <w:t>(Чтобы сломать игру.)</w:t>
       </w:r>
     </w:p>
     <w:p>
@@ -1338,7 +1338,7 @@
           <w:color w:val="0F172A"/>
           <w:sz w:val="19"/>
         </w:rPr>
-        <w:t xml:space="preserve">Hech narsa gapirmasdan jim turishadi. </w:t>
+        <w:t xml:space="preserve">Ekranni qora rangga bo'yash uchun. </w:t>
       </w:r>
       <w:r>
         <w:rPr>
@@ -1346,7 +1346,7 @@
           <w:color w:val="505F73"/>
           <w:sz w:val="18"/>
         </w:rPr>
-        <w:t>(Они просто молчат и ничего не говорят.)</w:t>
+        <w:t>(Чтобы покрасить экран в черный цвет.)</w:t>
       </w:r>
     </w:p>
     <w:p>
@@ -1367,7 +1367,7 @@
           <w:color w:val="0F172A"/>
           <w:sz w:val="19"/>
         </w:rPr>
-        <w:t xml:space="preserve">O'z o'yini qanday atalishi, unda nima qilish kerakligi va qahramonning vazifasi haqida. </w:t>
+        <w:t xml:space="preserve">O'yin qiziqarli va chaqqonlikni talab qiladigan sarguzasht bo'lishi uchun. </w:t>
       </w:r>
       <w:r>
         <w:rPr>
@@ -1375,7 +1375,7 @@
           <w:color w:val="505F73"/>
           <w:sz w:val="18"/>
         </w:rPr>
-        <w:t>(О названии своей игры, о том, что в ней нужно делать и какая миссия у главного героя.)</w:t>
+        <w:t>(Чтобы игра была интересной, увлекательной и требовала ловкости.)</w:t>
       </w:r>
     </w:p>
     <w:p>
@@ -1397,7 +1397,7 @@
           <w:color w:val="0F172A"/>
           <w:sz w:val="20"/>
         </w:rPr>
-        <w:t xml:space="preserve">7-darsda o'rganilgan 3D modellar kompyuterda nimalardan yasaladi? </w:t>
+        <w:t xml:space="preserve">Qahramon o'yinda tanga, yulduzcha yoki kristall yig'sa nima sodir bo'ladi? </w:t>
       </w:r>
       <w:r>
         <w:rPr>
@@ -1406,7 +1406,7 @@
           <w:color w:val="475569"/>
           <w:sz w:val="19"/>
         </w:rPr>
-        <w:t>(Из чего состоят 3D модели в компьютере, которые мы изучали на Уроке 7?)</w:t>
+        <w:t>(Что происходит, когда персонаж собирает монеты, звездочки или кристаллы?)</w:t>
       </w:r>
     </w:p>
     <w:p>
@@ -1427,7 +1427,7 @@
           <w:color w:val="0F172A"/>
           <w:sz w:val="19"/>
         </w:rPr>
-        <w:t xml:space="preserve">Faqat qog'oz varaqlaridan. </w:t>
+        <w:t xml:space="preserve">Klaviatura tugmalari ishlamay qoladi. </w:t>
       </w:r>
       <w:r>
         <w:rPr>
@@ -1435,7 +1435,7 @@
           <w:color w:val="505F73"/>
           <w:sz w:val="18"/>
         </w:rPr>
-        <w:t>(Только из бумажных страниц тетради.)</w:t>
+        <w:t>(Перестают работать клавиши клавиатуры.)</w:t>
       </w:r>
     </w:p>
     <w:p>
@@ -1456,7 +1456,7 @@
           <w:color w:val="0F172A"/>
           <w:sz w:val="19"/>
         </w:rPr>
-        <w:t xml:space="preserve">Mesh (to'r) deb ataluvchi nuqtalar va shakllar to'plamidan. </w:t>
+        <w:t xml:space="preserve">O'yinchining ochkolari (Score) ko'payadi va yangi rekord o'rnatiladi. </w:t>
       </w:r>
       <w:r>
         <w:rPr>
@@ -1464,7 +1464,7 @@
           <w:color w:val="505F73"/>
           <w:sz w:val="18"/>
         </w:rPr>
-        <w:t>(Из полигональной сетки (Mesh) — набора точек, граней и геометрических фигур.)</w:t>
+        <w:t>(Увеличиваются очки (Score) игрока и ставится новый рекорд.)</w:t>
       </w:r>
     </w:p>
     <w:p>
@@ -1485,7 +1485,7 @@
           <w:color w:val="0F172A"/>
           <w:sz w:val="19"/>
         </w:rPr>
-        <w:t xml:space="preserve">Faqat audio quloqchinlardan. </w:t>
+        <w:t xml:space="preserve">Monitor ekrani teskari aylanib qoladi. </w:t>
       </w:r>
       <w:r>
         <w:rPr>
@@ -1493,7 +1493,7 @@
           <w:color w:val="505F73"/>
           <w:sz w:val="18"/>
         </w:rPr>
-        <w:t>(Исключительно из наушников.)</w:t>
+        <w:t>(Экран монитора переворачивается.)</w:t>
       </w:r>
     </w:p>
     <w:p>
@@ -1514,7 +1514,7 @@
           <w:color w:val="0F172A"/>
           <w:sz w:val="19"/>
         </w:rPr>
-        <w:t xml:space="preserve">Faqatgina oddiy suv tomchilaridan. </w:t>
+        <w:t xml:space="preserve">Kompyuter drayverlari o'chib ketadi. </w:t>
       </w:r>
       <w:r>
         <w:rPr>
@@ -1522,7 +1522,7 @@
           <w:color w:val="505F73"/>
           <w:sz w:val="18"/>
         </w:rPr>
-        <w:t>(Исключительно из капель воды.)</w:t>
+        <w:t>(Стираются драйверы компьютера.)</w:t>
       </w:r>
     </w:p>
     <w:p>
@@ -1543,7 +1543,7 @@
           <w:color w:val="0F172A"/>
           <w:sz w:val="19"/>
         </w:rPr>
-        <w:t xml:space="preserve">Faqat elektr simlaridan. </w:t>
+        <w:t xml:space="preserve">O'yin fayllari avtomatik o'chiriladi. </w:t>
       </w:r>
       <w:r>
         <w:rPr>
@@ -1551,7 +1551,7 @@
           <w:color w:val="505F73"/>
           <w:sz w:val="18"/>
         </w:rPr>
-        <w:t>(Только из электрических проводов.)</w:t>
+        <w:t>(Файлы игры автоматически удаляются.)</w:t>
       </w:r>
     </w:p>
     <w:p>
@@ -1573,7 +1573,7 @@
           <w:color w:val="0F172A"/>
           <w:sz w:val="20"/>
         </w:rPr>
-        <w:t xml:space="preserve">8-darsda 'Level Design' (O'yin xaritasi) da qahramon yurishi uchun nimalar joylashtiriladi? </w:t>
+        <w:t xml:space="preserve">O'yinda 'Game Over' yozuvi chiqqanda bu nimani anglatadi? </w:t>
       </w:r>
       <w:r>
         <w:rPr>
@@ -1582,7 +1582,7 @@
           <w:color w:val="475569"/>
           <w:sz w:val="19"/>
         </w:rPr>
-        <w:t>(Что размещается на карте уровня (Level Design) на Уроке 8, чтобы игроку было интересно играть?)</w:t>
+        <w:t>(Что означает надпись «Game Over» в игре?)</w:t>
       </w:r>
     </w:p>
     <w:p>
@@ -1603,7 +1603,7 @@
           <w:color w:val="0F172A"/>
           <w:sz w:val="19"/>
         </w:rPr>
-        <w:t xml:space="preserve">Kompyuter drayverlari. </w:t>
+        <w:t xml:space="preserve">Internet umrbod o'chirilganini. </w:t>
       </w:r>
       <w:r>
         <w:rPr>
@@ -1611,7 +1611,7 @@
           <w:color w:val="505F73"/>
           <w:sz w:val="18"/>
         </w:rPr>
-        <w:t>(Драйверы компьютера.)</w:t>
+        <w:t>(Интернет отключился навсегда.)</w:t>
       </w:r>
     </w:p>
     <w:p>
@@ -1632,7 +1632,7 @@
           <w:color w:val="0F172A"/>
           <w:sz w:val="19"/>
         </w:rPr>
-        <w:t xml:space="preserve">Faqat maktab qoidalari. </w:t>
+        <w:t xml:space="preserve">O'yinchi darsga kechikkanini. </w:t>
       </w:r>
       <w:r>
         <w:rPr>
@@ -1640,7 +1640,7 @@
           <w:color w:val="505F73"/>
           <w:sz w:val="18"/>
         </w:rPr>
-        <w:t>(Только правила школы.)</w:t>
+        <w:t>(Игрок опоздал на урок.)</w:t>
       </w:r>
     </w:p>
     <w:p>
@@ -1661,7 +1661,7 @@
           <w:color w:val="0F172A"/>
           <w:sz w:val="19"/>
         </w:rPr>
-        <w:t xml:space="preserve">Sakrash uchun platformalar, yig'iladigan tangalar va qochish kerak bo'lgan to'siqlar. </w:t>
+        <w:t xml:space="preserve">Qahramonning barcha jonlari tugaganini va o'yinni qaytadan boshlash mumkinligini. </w:t>
       </w:r>
       <w:r>
         <w:rPr>
@@ -1669,7 +1669,7 @@
           <w:color w:val="505F73"/>
           <w:sz w:val="18"/>
         </w:rPr>
-        <w:t>(Платформы для прыжков, собираемые золотые монетки и опасные препятствия.)</w:t>
+        <w:t>(У героя закончились жизни, и можно начать уровень заново.)</w:t>
       </w:r>
     </w:p>
     <w:p>
@@ -1690,7 +1690,7 @@
           <w:color w:val="0F172A"/>
           <w:sz w:val="19"/>
         </w:rPr>
-        <w:t xml:space="preserve">Faqat raqamlar ro'yxati. </w:t>
+        <w:t xml:space="preserve">Klaviatura tozalanishi kerakligini. </w:t>
       </w:r>
       <w:r>
         <w:rPr>
@@ -1698,7 +1698,7 @@
           <w:color w:val="505F73"/>
           <w:sz w:val="18"/>
         </w:rPr>
-        <w:t>(Только список цифр.)</w:t>
+        <w:t>(Клавиатуру нужно помыть.)</w:t>
       </w:r>
     </w:p>
     <w:p>
@@ -1719,7 +1719,7 @@
           <w:color w:val="0F172A"/>
           <w:sz w:val="19"/>
         </w:rPr>
-        <w:t xml:space="preserve">Faqat bo'sh qora ekran. </w:t>
+        <w:t xml:space="preserve">Kompyuter buzilib, yangisini sotib olish kerakligini. </w:t>
       </w:r>
       <w:r>
         <w:rPr>
@@ -1727,7 +1727,7 @@
           <w:color w:val="505F73"/>
           <w:sz w:val="18"/>
         </w:rPr>
-        <w:t>(Только пустой черный экран.)</w:t>
+        <w:t>(Компьютер сломался и нужно купить новый.)</w:t>
       </w:r>
     </w:p>
     <w:p>
@@ -1749,7 +1749,7 @@
           <w:color w:val="0F172A"/>
           <w:sz w:val="20"/>
         </w:rPr>
-        <w:t xml:space="preserve">9-darsda o'yinlardagi SFX (Sound Effects) nima? </w:t>
+        <w:t xml:space="preserve">O'yinlarda tovush effektlari (sakrash ovozi, tanga jiringlashi, musiqa) nima uchun kerak? </w:t>
       </w:r>
       <w:r>
         <w:rPr>
@@ -1758,7 +1758,7 @@
           <w:color w:val="475569"/>
           <w:sz w:val="19"/>
         </w:rPr>
-        <w:t>(Что такое звуковые эффекты SFX (Sound Effects) в играх (Урок 9)?)</w:t>
+        <w:t>(Зачем в играх нужны звуковые эффекты (звук прыжка, звон монет, фоновая музыка)?)</w:t>
       </w:r>
     </w:p>
     <w:p>
@@ -1779,7 +1779,7 @@
           <w:color w:val="0F172A"/>
           <w:sz w:val="19"/>
         </w:rPr>
-        <w:t xml:space="preserve">Telefonning zaryad olayotgan ovozi. </w:t>
+        <w:t xml:space="preserve">Faqat batareyani tezroq tugatish uchun. </w:t>
       </w:r>
       <w:r>
         <w:rPr>
@@ -1787,7 +1787,7 @@
           <w:color w:val="505F73"/>
           <w:sz w:val="18"/>
         </w:rPr>
-        <w:t>(Звук подключения зарядного устройства.)</w:t>
+        <w:t>(Только чтобы быстрее разрядить батарею.)</w:t>
       </w:r>
     </w:p>
     <w:p>
@@ -1808,7 +1808,7 @@
           <w:color w:val="0F172A"/>
           <w:sz w:val="19"/>
         </w:rPr>
-        <w:t xml:space="preserve">Kompyuter fanining shovqini. </w:t>
+        <w:t xml:space="preserve">Ekranning rangini o'zgartirish uchun. </w:t>
       </w:r>
       <w:r>
         <w:rPr>
@@ -1816,7 +1816,7 @@
           <w:color w:val="505F73"/>
           <w:sz w:val="18"/>
         </w:rPr>
-        <w:t>(Шум вентилятора внутри ноутбука.)</w:t>
+        <w:t>(Чтобы поменять цвет экрана.)</w:t>
       </w:r>
     </w:p>
     <w:p>
@@ -1837,7 +1837,7 @@
           <w:color w:val="0F172A"/>
           <w:sz w:val="19"/>
         </w:rPr>
-        <w:t xml:space="preserve">Faqat televizor yangiliklari ovozi. </w:t>
+        <w:t xml:space="preserve">Kompyuter fanini tezroq aylantirish uchun. </w:t>
       </w:r>
       <w:r>
         <w:rPr>
@@ -1845,7 +1845,7 @@
           <w:color w:val="505F73"/>
           <w:sz w:val="18"/>
         </w:rPr>
-        <w:t>(Только голос диктора в новостях.)</w:t>
+        <w:t>(Чтобы быстрее крутился вентилятор ноутбука.)</w:t>
       </w:r>
     </w:p>
     <w:p>
@@ -1866,7 +1866,7 @@
           <w:color w:val="0F172A"/>
           <w:sz w:val="19"/>
         </w:rPr>
-        <w:t xml:space="preserve">Kompyuterni o'chirish ovozi. </w:t>
+        <w:t xml:space="preserve">O'yinni yanada qiziqarli, quvnoq va jonli qilish uchun. </w:t>
       </w:r>
       <w:r>
         <w:rPr>
@@ -1874,7 +1874,7 @@
           <w:color w:val="505F73"/>
           <w:sz w:val="18"/>
         </w:rPr>
-        <w:t>(Звук выключения компьютера.)</w:t>
+        <w:t>(Чтобы сделать игру более увлекательной, веселой и живой.)</w:t>
       </w:r>
     </w:p>
     <w:p>
@@ -1895,7 +1895,7 @@
           <w:color w:val="0F172A"/>
           <w:sz w:val="19"/>
         </w:rPr>
-        <w:t xml:space="preserve">Qahramon sakraganda, tanga yig'ganda yoki to'siqqa tekkanda chiqadigan qisqa tovushlar. </w:t>
+        <w:t xml:space="preserve">Qo'shnilarni bezovta qilish uchun. </w:t>
       </w:r>
       <w:r>
         <w:rPr>
@@ -1903,7 +1903,7 @@
           <w:color w:val="505F73"/>
           <w:sz w:val="18"/>
         </w:rPr>
-        <w:t>(Короткие веселые звуки действий: прыжок героя, звон собранной монетки или звук касания ловушки.)</w:t>
+        <w:t>(Чтобы разбудить соседей.)</w:t>
       </w:r>
     </w:p>
     <w:p>
@@ -1925,7 +1925,7 @@
           <w:color w:val="0F172A"/>
           <w:sz w:val="20"/>
         </w:rPr>
-        <w:t xml:space="preserve">10-darsda o'yindagi qahramonlar (NPC) bilan suhbatda turli javob tanlansa nima bo'ladi? </w:t>
+        <w:t xml:space="preserve">O'yinlarda kompyuter boshqaradigan boshqa qahramonlar (NPC) nima vazifani bajaradi? </w:t>
       </w:r>
       <w:r>
         <w:rPr>
@@ -1934,7 +1934,7 @@
           <w:color w:val="475569"/>
           <w:sz w:val="19"/>
         </w:rPr>
-        <w:t>(Что происходит на Уроке 10 в диалоге с NPC, если выбрать другой вариант ответа?)</w:t>
+        <w:t>(Какую роль в играх выполняют персонажи, управляемые компьютером (NPC)?)</w:t>
       </w:r>
     </w:p>
     <w:p>
@@ -1955,7 +1955,7 @@
           <w:color w:val="0F172A"/>
           <w:sz w:val="19"/>
         </w:rPr>
-        <w:t xml:space="preserve">Hech narsa o'zgarmaydi. </w:t>
+        <w:t xml:space="preserve">O'yin fayllarini yashirib qo'yadi. </w:t>
       </w:r>
       <w:r>
         <w:rPr>
@@ -1963,7 +1963,7 @@
           <w:color w:val="505F73"/>
           <w:sz w:val="18"/>
         </w:rPr>
-        <w:t>(Вообще ничего не меняется.)</w:t>
+        <w:t>(Прячут файлы игры.)</w:t>
       </w:r>
     </w:p>
     <w:p>
@@ -1984,7 +1984,7 @@
           <w:color w:val="0F172A"/>
           <w:sz w:val="19"/>
         </w:rPr>
-        <w:t xml:space="preserve">Qahramon boshqacha javob beradi va o'yinda yangi qiziqarli topshiriq (kvest) ochiladi. </w:t>
+        <w:t xml:space="preserve">Bosh qahramonga maslahat beradi, suhbatlashadi yoki yangi topshiriq (kvest) beradi. </w:t>
       </w:r>
       <w:r>
         <w:rPr>
@@ -1992,7 +1992,7 @@
           <w:color w:val="505F73"/>
           <w:sz w:val="18"/>
         </w:rPr>
-        <w:t>(Персонаж отвечает по-другому, и открывается новое интересное задание (квест).)</w:t>
+        <w:t>(Подсказывают главному герою, разговаривают с ним или дают новые задания (квесты).)</w:t>
       </w:r>
     </w:p>
     <w:p>
@@ -2013,7 +2013,7 @@
           <w:color w:val="0F172A"/>
           <w:sz w:val="19"/>
         </w:rPr>
-        <w:t xml:space="preserve">Kompyuter ekrani qorayib qoladi. </w:t>
+        <w:t xml:space="preserve">Internet simini uzib qo'yadi. </w:t>
       </w:r>
       <w:r>
         <w:rPr>
@@ -2021,7 +2021,7 @@
           <w:color w:val="505F73"/>
           <w:sz w:val="18"/>
         </w:rPr>
-        <w:t>(Экран монитора полностью темнеет.)</w:t>
+        <w:t>(Отключают интернет-кабель.)</w:t>
       </w:r>
     </w:p>
     <w:p>
@@ -2042,7 +2042,7 @@
           <w:color w:val="0F172A"/>
           <w:sz w:val="19"/>
         </w:rPr>
-        <w:t xml:space="preserve">O'yin darhol o'chib ketadi. </w:t>
+        <w:t xml:space="preserve">Kompyuterni o'chirib qo'yadi. </w:t>
       </w:r>
       <w:r>
         <w:rPr>
@@ -2050,7 +2050,7 @@
           <w:color w:val="505F73"/>
           <w:sz w:val="18"/>
         </w:rPr>
-        <w:t>(Игра сразу же стирается с компьютера.)</w:t>
+        <w:t>(Выключают компьютер.)</w:t>
       </w:r>
     </w:p>
     <w:p>
@@ -2071,7 +2071,7 @@
           <w:color w:val="0F172A"/>
           <w:sz w:val="19"/>
         </w:rPr>
-        <w:t xml:space="preserve">Barcha ballar o'chib ketadi. </w:t>
+        <w:t xml:space="preserve">Faqat kompyuter soatini o'zgartiradi. </w:t>
       </w:r>
       <w:r>
         <w:rPr>
@@ -2079,7 +2079,7 @@
           <w:color w:val="505F73"/>
           <w:sz w:val="18"/>
         </w:rPr>
-        <w:t>(Все набранные очки исчезают.)</w:t>
+        <w:t>(Только меняют системное время.)</w:t>
       </w:r>
     </w:p>
     <w:p>
@@ -2101,7 +2101,7 @@
           <w:color w:val="0F172A"/>
           <w:sz w:val="20"/>
         </w:rPr>
-        <w:t xml:space="preserve">11-darsda ekranning yuqori qismidagi HUD panelida nimalar ko'rinib turadi? </w:t>
+        <w:t xml:space="preserve">O'yinlarda qahramonning yugurishi yoki sakrashi qanday qilib harakatlanayotgandek ko'rinadi? </w:t>
       </w:r>
       <w:r>
         <w:rPr>
@@ -2110,7 +2110,7 @@
           <w:color w:val="475569"/>
           <w:sz w:val="19"/>
         </w:rPr>
-        <w:t>(Что обычно отображается на панели HUD в верхней части экрана (Урок 11)?)</w:t>
+        <w:t>(Каким образом бег или прыжок персонажа в игре выглядит движущимся?)</w:t>
       </w:r>
     </w:p>
     <w:p>
@@ -2131,7 +2131,7 @@
           <w:color w:val="0F172A"/>
           <w:sz w:val="19"/>
         </w:rPr>
-        <w:t xml:space="preserve">Faqat do'kon reklamasi. </w:t>
+        <w:t xml:space="preserve">Klaviatura o'zi qahramonni itarib yuboradi. </w:t>
       </w:r>
       <w:r>
         <w:rPr>
@@ -2139,7 +2139,7 @@
           <w:color w:val="505F73"/>
           <w:sz w:val="18"/>
         </w:rPr>
-        <w:t>(Только реклама из магазинов.)</w:t>
+        <w:t>(Клавиатура сама толкает персонажа.)</w:t>
       </w:r>
     </w:p>
     <w:p>
@@ -2160,7 +2160,7 @@
           <w:color w:val="0F172A"/>
           <w:sz w:val="19"/>
         </w:rPr>
-        <w:t xml:space="preserve">Faqat ob-havo ma'lumoti. </w:t>
+        <w:t xml:space="preserve">Rasmlar juda tez ketma-ket almashib, ko'zimizga harakatdek ko'rinadi (Animatsiya). </w:t>
       </w:r>
       <w:r>
         <w:rPr>
@@ -2168,7 +2168,7 @@
           <w:color w:val="505F73"/>
           <w:sz w:val="18"/>
         </w:rPr>
-        <w:t>(Только прогноз погоды.)</w:t>
+        <w:t>(Картинки очень быстро сменяют друг друга, создавая иллюзию движения (Анимация).)</w:t>
       </w:r>
     </w:p>
     <w:p>
@@ -2189,7 +2189,7 @@
           <w:color w:val="0F172A"/>
           <w:sz w:val="19"/>
         </w:rPr>
-        <w:t xml:space="preserve">Kompyuterning qattiq diski rasmi. </w:t>
+        <w:t xml:space="preserve">Faqat kompyuter kamerasi orqali ko'rinadi. </w:t>
       </w:r>
       <w:r>
         <w:rPr>
@@ -2197,7 +2197,7 @@
           <w:color w:val="505F73"/>
           <w:sz w:val="18"/>
         </w:rPr>
-        <w:t>(Рисунок жесткого диска компьютера.)</w:t>
+        <w:t>(Это видно только через камеру компьютера.)</w:t>
       </w:r>
     </w:p>
     <w:p>
@@ -2218,7 +2218,7 @@
           <w:color w:val="0F172A"/>
           <w:sz w:val="19"/>
         </w:rPr>
-        <w:t xml:space="preserve">Faqat maktab binosi surati. </w:t>
+        <w:t xml:space="preserve">Bu haqiqiy tirik odamning ekranga kirib olishidir. </w:t>
       </w:r>
       <w:r>
         <w:rPr>
@@ -2226,7 +2226,7 @@
           <w:color w:val="505F73"/>
           <w:sz w:val="18"/>
         </w:rPr>
-        <w:t>(Фотография здания школы.)</w:t>
+        <w:t>(Настоящий живой человек залезает внутрь экрана.)</w:t>
       </w:r>
     </w:p>
     <w:p>
@@ -2247,7 +2247,7 @@
           <w:color w:val="0F172A"/>
           <w:sz w:val="19"/>
         </w:rPr>
-        <w:t xml:space="preserve">Qahramonning joni (HP yurakchalari), to'plangan tangalari va o'yin vaqti. </w:t>
+        <w:t xml:space="preserve">Monitorning o'zi jismonan harakat qiladi. </w:t>
       </w:r>
       <w:r>
         <w:rPr>
@@ -2255,7 +2255,7 @@
           <w:color w:val="505F73"/>
           <w:sz w:val="18"/>
         </w:rPr>
-        <w:t>(Жизни героя (сердечки HP), количество собранных монеток и время игры.)</w:t>
+        <w:t>(Сам монитор физически двигается.)</w:t>
       </w:r>
     </w:p>
     <w:p>
@@ -2277,7 +2277,7 @@
           <w:color w:val="0F172A"/>
           <w:sz w:val="20"/>
         </w:rPr>
-        <w:t xml:space="preserve">12-darsdagi 'Game Jam' marafonida bolalar nima qilishadi? </w:t>
+        <w:t xml:space="preserve">O'yin yaratuvchi dasturchi nima ish qiladi? </w:t>
       </w:r>
       <w:r>
         <w:rPr>
@@ -2286,7 +2286,7 @@
           <w:color w:val="475569"/>
           <w:sz w:val="19"/>
         </w:rPr>
-        <w:t>(Чем занимаются ученики на марафоне 'Game Jam' (Урок 12)?)</w:t>
+        <w:t>(Чем занимается программист при создании игр?)</w:t>
       </w:r>
     </w:p>
     <w:p>
@@ -2307,7 +2307,7 @@
           <w:color w:val="0F172A"/>
           <w:sz w:val="19"/>
         </w:rPr>
-        <w:t xml:space="preserve">Kun bo'yi faqat uxlab yotishadi. </w:t>
+        <w:t xml:space="preserve">Faqat monitor ekranidagi changlarni artadi. </w:t>
       </w:r>
       <w:r>
         <w:rPr>
@@ -2315,7 +2315,7 @@
           <w:color w:val="505F73"/>
           <w:sz w:val="18"/>
         </w:rPr>
-        <w:t>(Спят целый день на уроке.)</w:t>
+        <w:t>(Только протирает пыль с экрана монитора.)</w:t>
       </w:r>
     </w:p>
     <w:p>
@@ -2336,7 +2336,7 @@
           <w:color w:val="0F172A"/>
           <w:sz w:val="19"/>
         </w:rPr>
-        <w:t xml:space="preserve">Boshqa o'quvchilarning sichqonchasini yashirib qo'yishadi. </w:t>
+        <w:t xml:space="preserve">Maktab qo'ng'irog'ini chaladi. </w:t>
       </w:r>
       <w:r>
         <w:rPr>
@@ -2344,7 +2344,7 @@
           <w:color w:val="505F73"/>
           <w:sz w:val="18"/>
         </w:rPr>
-        <w:t>(Прячут мышки других учеников в классе.)</w:t>
+        <w:t>(Звонит в школьный колокольчик.)</w:t>
       </w:r>
     </w:p>
     <w:p>
@@ -2365,7 +2365,7 @@
           <w:color w:val="0F172A"/>
           <w:sz w:val="19"/>
         </w:rPr>
-        <w:t xml:space="preserve">Qisqa vaqt ichida o'z g'oyalari bo'yicha kichik o'yin yasab ko'rishadi. </w:t>
+        <w:t xml:space="preserve">Kompyuter tushunadigan qoidalar va kodlar yozib, o'yin qanday ishlashini belgilaydi. </w:t>
       </w:r>
       <w:r>
         <w:rPr>
@@ -2373,7 +2373,7 @@
           <w:color w:val="505F73"/>
           <w:sz w:val="18"/>
         </w:rPr>
-        <w:t>(За короткое время создают свою собственную маленькую работающую игру.)</w:t>
+        <w:t>(Пишет правила и команды на языке компьютера, определяя, как работает игра.)</w:t>
       </w:r>
     </w:p>
     <w:p>
@@ -2394,7 +2394,7 @@
           <w:color w:val="0F172A"/>
           <w:sz w:val="19"/>
         </w:rPr>
-        <w:t xml:space="preserve">Faqat tayyor internet videolarini tomosha qilishadi. </w:t>
+        <w:t xml:space="preserve">Faqat do'konda kompyuter sotadi. </w:t>
       </w:r>
       <w:r>
         <w:rPr>
@@ -2402,7 +2402,7 @@
           <w:color w:val="505F73"/>
           <w:sz w:val="18"/>
         </w:rPr>
-        <w:t>(Просто смотрят видеоролики в интернете.)</w:t>
+        <w:t>(Только продает компьютеры в магазине.)</w:t>
       </w:r>
     </w:p>
     <w:p>
@@ -2423,7 +2423,7 @@
           <w:color w:val="0F172A"/>
           <w:sz w:val="19"/>
         </w:rPr>
-        <w:t xml:space="preserve">Kompyuter klaviaturalarini bo'yashadi. </w:t>
+        <w:t xml:space="preserve">Kompyuter detallarini bolg'a bilan uradi. </w:t>
       </w:r>
       <w:r>
         <w:rPr>
@@ -2431,7 +2431,7 @@
           <w:color w:val="505F73"/>
           <w:sz w:val="18"/>
         </w:rPr>
-        <w:t>(Раскрашивают кнопки клавиатуры красками.)</w:t>
+        <w:t>(Стучит молотком по деталям компьютера.)</w:t>
       </w:r>
     </w:p>
     <w:p>
@@ -2453,7 +2453,7 @@
           <w:color w:val="0F172A"/>
           <w:sz w:val="20"/>
         </w:rPr>
-        <w:t xml:space="preserve">13-darsdagi 'Game Loop' (O'yin tsikli) o'yinda nima vazifani bajaradi? </w:t>
+        <w:t xml:space="preserve">O'yinda qahramon birdan devor ichiga kirib ketishi yoki ball qo'shilmay qolishi nima deb ataladi? </w:t>
       </w:r>
       <w:r>
         <w:rPr>
@@ -2462,7 +2462,7 @@
           <w:color w:val="475569"/>
           <w:sz w:val="19"/>
         </w:rPr>
-        <w:t>(Какую работу выполняет игровой цикл 'Game Loop' (Урок 13)?)</w:t>
+        <w:t>(Как называется ситуация, когда персонаж застревает в стене или очки не начисляются?)</w:t>
       </w:r>
     </w:p>
     <w:p>
@@ -2483,7 +2483,7 @@
           <w:color w:val="0F172A"/>
           <w:sz w:val="19"/>
         </w:rPr>
-        <w:t xml:space="preserve">Faqat o'yin tugaganida ishlaydi. </w:t>
+        <w:t xml:space="preserve">O'yin mukofoti </w:t>
       </w:r>
       <w:r>
         <w:rPr>
@@ -2491,7 +2491,7 @@
           <w:color w:val="505F73"/>
           <w:sz w:val="18"/>
         </w:rPr>
-        <w:t>(Работает только тогда, когда игра уже закрыта.)</w:t>
+        <w:t>(Главная награда в игре)</w:t>
       </w:r>
     </w:p>
     <w:p>
@@ -2512,7 +2512,7 @@
           <w:color w:val="0F172A"/>
           <w:sz w:val="19"/>
         </w:rPr>
-        <w:t xml:space="preserve">Faqat kompyuter ekranini o'chiradi. </w:t>
+        <w:t xml:space="preserve">Antivirus yangilanishi </w:t>
       </w:r>
       <w:r>
         <w:rPr>
@@ -2520,7 +2520,7 @@
           <w:color w:val="505F73"/>
           <w:sz w:val="18"/>
         </w:rPr>
-        <w:t>(Только выключает монитор компьютера.)</w:t>
+        <w:t>(Обновление антивируса)</w:t>
       </w:r>
     </w:p>
     <w:p>
@@ -2541,7 +2541,7 @@
           <w:color w:val="0F172A"/>
           <w:sz w:val="19"/>
         </w:rPr>
-        <w:t xml:space="preserve">Har doim qahramon qayerga yurganini tekshirib, ekrandagi o'yinni yangilab turadi. </w:t>
+        <w:t xml:space="preserve">Bug (dasturdagi xatolik) </w:t>
       </w:r>
       <w:r>
         <w:rPr>
@@ -2549,7 +2549,7 @@
           <w:color w:val="505F73"/>
           <w:sz w:val="18"/>
         </w:rPr>
-        <w:t>(Постоянно проверяет, куда движется герой, и плавно обновляет картинку на экране.)</w:t>
+        <w:t>(Баг (ошибка в программном коде))</w:t>
       </w:r>
     </w:p>
     <w:p>
@@ -2570,7 +2570,7 @@
           <w:color w:val="0F172A"/>
           <w:sz w:val="19"/>
         </w:rPr>
-        <w:t xml:space="preserve">O'yinni boshlanishi bilanoq yopib qo'yadi. </w:t>
+        <w:t xml:space="preserve">Yangi kompyuter modeli </w:t>
       </w:r>
       <w:r>
         <w:rPr>
@@ -2578,7 +2578,7 @@
           <w:color w:val="505F73"/>
           <w:sz w:val="18"/>
         </w:rPr>
-        <w:t>(Закрывает игру сразу после запуска.)</w:t>
+        <w:t>(Новая модель компьютера)</w:t>
       </w:r>
     </w:p>
     <w:p>
@@ -2599,7 +2599,7 @@
           <w:color w:val="0F172A"/>
           <w:sz w:val="19"/>
         </w:rPr>
-        <w:t xml:space="preserve">O'yindagi barcha ballarni nollashtiradi. </w:t>
+        <w:t xml:space="preserve">Internet tezligi </w:t>
       </w:r>
       <w:r>
         <w:rPr>
@@ -2607,7 +2607,7 @@
           <w:color w:val="505F73"/>
           <w:sz w:val="18"/>
         </w:rPr>
-        <w:t>(Сбрасывает все очки до нуля.)</w:t>
+        <w:t>(Скорость интернета)</w:t>
       </w:r>
     </w:p>
     <w:p>
@@ -2629,7 +2629,7 @@
           <w:color w:val="0F172A"/>
           <w:sz w:val="20"/>
         </w:rPr>
-        <w:t xml:space="preserve">14-darsda qahramon o'tkir tikanga yoki qizil lazerga tegib ketsa nima bo'ladi? </w:t>
+        <w:t xml:space="preserve">O'yinda xatolik (bug) paydo bo'lsa, qanday yo'l tutish to'g'ri? </w:t>
       </w:r>
       <w:r>
         <w:rPr>
@@ -2638,7 +2638,7 @@
           <w:color w:val="475569"/>
           <w:sz w:val="19"/>
         </w:rPr>
-        <w:t>(Что происходит на Уроке 14, когда персонаж задевает острые шипы или лазер?)</w:t>
+        <w:t>(Что правильно делать, если в игре возникла ошибка (баг)?)</w:t>
       </w:r>
     </w:p>
     <w:p>
@@ -2659,7 +2659,7 @@
           <w:color w:val="0F172A"/>
           <w:sz w:val="19"/>
         </w:rPr>
-        <w:t xml:space="preserve">Qahramonning joni birdan 1000 ga yetadi. </w:t>
+        <w:t xml:space="preserve">Kompyuterni yerga tashlab yuborish. </w:t>
       </w:r>
       <w:r>
         <w:rPr>
@@ -2667,7 +2667,7 @@
           <w:color w:val="505F73"/>
           <w:sz w:val="18"/>
         </w:rPr>
-        <w:t>(Количество жизней героя резко возрастает до 1000.)</w:t>
+        <w:t>(Бросить компьютер на пол.)</w:t>
       </w:r>
     </w:p>
     <w:p>
@@ -2688,7 +2688,7 @@
           <w:color w:val="0F172A"/>
           <w:sz w:val="19"/>
         </w:rPr>
-        <w:t xml:space="preserve">O'yin avtomatik yutiladi. </w:t>
+        <w:t xml:space="preserve">O'yinni o'chirish va boshqa hech qachon kompyuter ishlatmaslik. </w:t>
       </w:r>
       <w:r>
         <w:rPr>
@@ -2696,7 +2696,7 @@
           <w:color w:val="505F73"/>
           <w:sz w:val="18"/>
         </w:rPr>
-        <w:t>(Игра автоматически объявляется выигранной.)</w:t>
+        <w:t>(Удалить игру и больше никогда не пользоваться компьютером.)</w:t>
       </w:r>
     </w:p>
     <w:p>
@@ -2717,7 +2717,7 @@
           <w:color w:val="0F172A"/>
           <w:sz w:val="19"/>
         </w:rPr>
-        <w:t xml:space="preserve">Qahramonning bitta joni (HP yurakchasi) kamayadi. </w:t>
+        <w:t xml:space="preserve">Qaysi kod xato yozilganini tekshirib, xatoni tuzatish (debugging qilish). </w:t>
       </w:r>
       <w:r>
         <w:rPr>
@@ -2725,7 +2725,7 @@
           <w:color w:val="505F73"/>
           <w:sz w:val="18"/>
         </w:rPr>
-        <w:t>(Персонаж теряет одну жизнь (одно сердечко HP).)</w:t>
+        <w:t>(Проверить строки кода, найти ошибку и исправить её (сделать дебаггинг).)</w:t>
       </w:r>
     </w:p>
     <w:p>
@@ -2746,7 +2746,7 @@
           <w:color w:val="0F172A"/>
           <w:sz w:val="19"/>
         </w:rPr>
-        <w:t xml:space="preserve">Kompyuter o'chib qoladi. </w:t>
+        <w:t xml:space="preserve">Klaviaturani suv bilan yuvish. </w:t>
       </w:r>
       <w:r>
         <w:rPr>
@@ -2754,7 +2754,7 @@
           <w:color w:val="505F73"/>
           <w:sz w:val="18"/>
         </w:rPr>
-        <w:t>(Компьютер полностью выключается.)</w:t>
+        <w:t>(Помыть клавиатуру под краном с водой.)</w:t>
       </w:r>
     </w:p>
     <w:p>
@@ -2775,7 +2775,7 @@
           <w:color w:val="0F172A"/>
           <w:sz w:val="19"/>
         </w:rPr>
-        <w:t xml:space="preserve">O'yin tezligi 100 baravar sekinlashadi. </w:t>
+        <w:t xml:space="preserve">Barcha do'stlar bilan urishib qolish. </w:t>
       </w:r>
       <w:r>
         <w:rPr>
@@ -2783,7 +2783,7 @@
           <w:color w:val="505F73"/>
           <w:sz w:val="18"/>
         </w:rPr>
-        <w:t>(Игра замедляется в 100 раз.)</w:t>
+        <w:t>(Поссориться со всеми друзьями.)</w:t>
       </w:r>
     </w:p>
     <w:p>
@@ -2805,7 +2805,7 @@
           <w:color w:val="0F172A"/>
           <w:sz w:val="20"/>
         </w:rPr>
-        <w:t xml:space="preserve">15-darsda qahramon yaltirab turgan oltin kristallga yetib borsa nima bo'ladi? </w:t>
+        <w:t xml:space="preserve">O'yinlarda '1-bosqich', '2-bosqich' kabi darajalar (Levels) nima uchun tuziladi? </w:t>
       </w:r>
       <w:r>
         <w:rPr>
@@ -2814,7 +2814,7 @@
           <w:color w:val="475569"/>
           <w:sz w:val="19"/>
         </w:rPr>
-        <w:t>(Что происходит на Уроке 15, когда герой добегает до сверкающего золотого кристалла?)</w:t>
+        <w:t>(Зачем в играх делают уровни (1-й уровень, 2-й уровень)?)</w:t>
       </w:r>
     </w:p>
     <w:p>
@@ -2835,7 +2835,7 @@
           <w:color w:val="0F172A"/>
           <w:sz w:val="19"/>
         </w:rPr>
-        <w:t xml:space="preserve">Ochko ko'payadi, chiroyli tovush chiqadi va kristall xaritadan olinadi. </w:t>
+        <w:t xml:space="preserve">Kompyuter elektr energiyasini kamroq iste'mol qilishi uchun. </w:t>
       </w:r>
       <w:r>
         <w:rPr>
@@ -2843,7 +2843,7 @@
           <w:color w:val="505F73"/>
           <w:sz w:val="18"/>
         </w:rPr>
-        <w:t>(Начисляются очки, звучит приятный звук, и кристалл забирается с карты.)</w:t>
+        <w:t>(Чтобы компьютер тратил меньше электричества.)</w:t>
       </w:r>
     </w:p>
     <w:p>
@@ -2864,7 +2864,7 @@
           <w:color w:val="0F172A"/>
           <w:sz w:val="19"/>
         </w:rPr>
-        <w:t xml:space="preserve">Qahramon o'yin maydonidan tushib ketadi. </w:t>
+        <w:t xml:space="preserve">Faqat monitor rangini o'chirish uchun. </w:t>
       </w:r>
       <w:r>
         <w:rPr>
@@ -2872,7 +2872,7 @@
           <w:color w:val="505F73"/>
           <w:sz w:val="18"/>
         </w:rPr>
-        <w:t>(Персонаж проваливается сквозь землю.)</w:t>
+        <w:t>(Только чтобы погасить цвет монитора.)</w:t>
       </w:r>
     </w:p>
     <w:p>
@@ -2893,7 +2893,7 @@
           <w:color w:val="0F172A"/>
           <w:sz w:val="19"/>
         </w:rPr>
-        <w:t xml:space="preserve">Kristall butun ekranni qoplab oladi. </w:t>
+        <w:t xml:space="preserve">Klaviatura charchab qolmasligi uchun. </w:t>
       </w:r>
       <w:r>
         <w:rPr>
@@ -2901,7 +2901,7 @@
           <w:color w:val="505F73"/>
           <w:sz w:val="18"/>
         </w:rPr>
-        <w:t>(Кристалл закрывает собой весь экран.)</w:t>
+        <w:t>(Чтобы клавиатура не уставала.)</w:t>
       </w:r>
     </w:p>
     <w:p>
@@ -2922,7 +2922,7 @@
           <w:color w:val="0F172A"/>
           <w:sz w:val="19"/>
         </w:rPr>
-        <w:t xml:space="preserve">O'yindagi hamma narsa muzlab qoladi. </w:t>
+        <w:t xml:space="preserve">Sichqoncha batareyasini tejash uchun. </w:t>
       </w:r>
       <w:r>
         <w:rPr>
@@ -2930,7 +2930,7 @@
           <w:color w:val="505F73"/>
           <w:sz w:val="18"/>
         </w:rPr>
-        <w:t>(Все объекты в игре замерзают.)</w:t>
+        <w:t>(Чтобы сберечь батарейку мышки.)</w:t>
       </w:r>
     </w:p>
     <w:p>
@@ -2951,7 +2951,7 @@
           <w:color w:val="0F172A"/>
           <w:sz w:val="19"/>
         </w:rPr>
-        <w:t xml:space="preserve">O'yin to'xtab qoladi. </w:t>
+        <w:t xml:space="preserve">O'yinchi har bir bosqichda yangi to'siqlarni yengib, qiziqib o'ynashi uchun. </w:t>
       </w:r>
       <w:r>
         <w:rPr>
@@ -2959,7 +2959,7 @@
           <w:color w:val="505F73"/>
           <w:sz w:val="18"/>
         </w:rPr>
-        <w:t>(Игра зависает.)</w:t>
+        <w:t>(Чтобы игрок преодолевал новые испытания и игра оставалась увлекательной.)</w:t>
       </w:r>
     </w:p>
     <w:p>
@@ -2981,7 +2981,7 @@
           <w:color w:val="0F172A"/>
           <w:sz w:val="20"/>
         </w:rPr>
-        <w:t xml:space="preserve">16-darsda Boss jangida 'Lazer Qalqoni' qahramonga qanday yordam beradi? </w:t>
+        <w:t xml:space="preserve">O'yin yoki maktab akkauntingiz uchun qaysi parol eng xavfsiz va mustahkam hisoblanadi? </w:t>
       </w:r>
       <w:r>
         <w:rPr>
@@ -2990,7 +2990,7 @@
           <w:color w:val="475569"/>
           <w:sz w:val="19"/>
         </w:rPr>
-        <w:t>(Как 'Лазерный Щит' помогает герою во время битвы с Боссом (Урок 16)?)</w:t>
+        <w:t>(Какой пароль является самым безопасным и надежным для вашего игрового аккаунта?)</w:t>
       </w:r>
     </w:p>
     <w:p>
@@ -3008,18 +3008,10 @@
       </w:r>
       <w:r>
         <w:rPr>
-          <w:color w:val="0F172A"/>
+          <w:color w:val="1E293B"/>
           <w:sz w:val="19"/>
         </w:rPr>
-        <w:t xml:space="preserve">Qahramonni o'yindan chiqarib yuboradi. </w:t>
-      </w:r>
-      <w:r>
-        <w:rPr>
-          <w:i/>
-          <w:color w:val="505F73"/>
-          <w:sz w:val="18"/>
-        </w:rPr>
-        <w:t>(Выбрасывает героя из игры.)</w:t>
+        <w:t>Kiber#2026!Target</w:t>
       </w:r>
     </w:p>
     <w:p>
@@ -3037,18 +3029,10 @@
       </w:r>
       <w:r>
         <w:rPr>
-          <w:color w:val="0F172A"/>
+          <w:color w:val="1E293B"/>
           <w:sz w:val="19"/>
         </w:rPr>
-        <w:t xml:space="preserve">Bossni darhol yo'qotib yuboradi. </w:t>
-      </w:r>
-      <w:r>
-        <w:rPr>
-          <w:i/>
-          <w:color w:val="505F73"/>
-          <w:sz w:val="18"/>
-        </w:rPr>
-        <w:t>(Сразу же уничтожает Босса.)</w:t>
+        <w:t>123456</w:t>
       </w:r>
     </w:p>
     <w:p>
@@ -3066,18 +3050,10 @@
       </w:r>
       <w:r>
         <w:rPr>
-          <w:color w:val="0F172A"/>
+          <w:color w:val="1E293B"/>
           <w:sz w:val="19"/>
         </w:rPr>
-        <w:t xml:space="preserve">Faqat o'yinda yutqazib bo'lgandan keyin ishlaydi. </w:t>
-      </w:r>
-      <w:r>
-        <w:rPr>
-          <w:i/>
-          <w:color w:val="505F73"/>
-          <w:sz w:val="18"/>
-        </w:rPr>
-        <w:t>(Срабатывает только после полного проигрыша.)</w:t>
+        <w:t>0000</w:t>
       </w:r>
     </w:p>
     <w:p>
@@ -3095,18 +3071,10 @@
       </w:r>
       <w:r>
         <w:rPr>
-          <w:color w:val="0F172A"/>
+          <w:color w:val="1E293B"/>
           <w:sz w:val="19"/>
         </w:rPr>
-        <w:t xml:space="preserve">Barcha to'plangan tangalarni o'chirib yuboradi. </w:t>
-      </w:r>
-      <w:r>
-        <w:rPr>
-          <w:i/>
-          <w:color w:val="505F73"/>
-          <w:sz w:val="18"/>
-        </w:rPr>
-        <w:t>(Удаляет все собранные монетки.)</w:t>
+        <w:t>qwerty</w:t>
       </w:r>
     </w:p>
     <w:p>
@@ -3127,7 +3095,7 @@
           <w:color w:val="0F172A"/>
           <w:sz w:val="19"/>
         </w:rPr>
-        <w:t xml:space="preserve">Qalqon yoqilgan paytda dushman hujumlari qahramonga zarar yetkaza olmaydi. </w:t>
+        <w:t xml:space="preserve">meningismim </w:t>
       </w:r>
       <w:r>
         <w:rPr>
@@ -3135,7 +3103,7 @@
           <w:color w:val="505F73"/>
           <w:sz w:val="18"/>
         </w:rPr>
-        <w:t>(Пока щит включен, атаки и выстрелы врагов не наносят герою никакого урона.)</w:t>
+        <w:t>(moeimya)</w:t>
       </w:r>
     </w:p>
     <w:p>
@@ -3157,7 +3125,7 @@
           <w:color w:val="0F172A"/>
           <w:sz w:val="20"/>
         </w:rPr>
-        <w:t xml:space="preserve">4-hafta 15-darsda 'Dushman AI' qahramonni ko'rib qolsa nima qiladi? </w:t>
+        <w:t xml:space="preserve">Nima uchun o'z parolingizni begona odamlarga aytmasligingiz kerak? </w:t>
       </w:r>
       <w:r>
         <w:rPr>
@@ -3166,7 +3134,7 @@
           <w:color w:val="475569"/>
           <w:sz w:val="19"/>
         </w:rPr>
-        <w:t>(Что делает 'ИИ врага' на Уроке 15 (4-я неделя), когда замечает приближение героя?)</w:t>
+        <w:t>(Почему нельзя сообщать свой пароль посторонним людям?)</w:t>
       </w:r>
     </w:p>
     <w:p>
@@ -3187,7 +3155,7 @@
           <w:color w:val="0F172A"/>
           <w:sz w:val="19"/>
         </w:rPr>
-        <w:t xml:space="preserve">O'yinchiga salom deb yozadi. </w:t>
+        <w:t xml:space="preserve">Klaviatura tugmalari bosilmay qolishi uchun. </w:t>
       </w:r>
       <w:r>
         <w:rPr>
@@ -3195,7 +3163,7 @@
           <w:color w:val="505F73"/>
           <w:sz w:val="18"/>
         </w:rPr>
-        <w:t>(Пишет игроку приветствие в чат.)</w:t>
+        <w:t>(Чтобы клавиши клавиатуры не перестали нажиматься.)</w:t>
       </w:r>
     </w:p>
     <w:p>
@@ -3216,7 +3184,7 @@
           <w:color w:val="0F172A"/>
           <w:sz w:val="19"/>
         </w:rPr>
-        <w:t xml:space="preserve">Qahramonning orqasidan quva boshlaydi. </w:t>
+        <w:t xml:space="preserve">Begonalar sizning o'yindagi yutuqlaringizni va shaxsiy ma'lumotlaringizni o'g'irlamasligi uchun. </w:t>
       </w:r>
       <w:r>
         <w:rPr>
@@ -3224,7 +3192,7 @@
           <w:color w:val="505F73"/>
           <w:sz w:val="18"/>
         </w:rPr>
-        <w:t>(Начинает бежать и преследовать героя.)</w:t>
+        <w:t>(Чтобы чужие люди не украли ваши игровые достижения и личные данные.)</w:t>
       </w:r>
     </w:p>
     <w:p>
@@ -3245,7 +3213,7 @@
           <w:color w:val="0F172A"/>
           <w:sz w:val="19"/>
         </w:rPr>
-        <w:t xml:space="preserve">O'yin maydonidan uchib ketadi. </w:t>
+        <w:t xml:space="preserve">Kompyuter ekrani qizarib qolishi uchun. </w:t>
       </w:r>
       <w:r>
         <w:rPr>
@@ -3253,7 +3221,7 @@
           <w:color w:val="505F73"/>
           <w:sz w:val="18"/>
         </w:rPr>
-        <w:t>(Улетает за пределы игрового поля.)</w:t>
+        <w:t>(Чтобы экран компьютера не покраснел.)</w:t>
       </w:r>
     </w:p>
     <w:p>
@@ -3274,7 +3242,7 @@
           <w:color w:val="0F172A"/>
           <w:sz w:val="19"/>
         </w:rPr>
-        <w:t xml:space="preserve">Darhol o'zini o'zi yo'q qiladi. </w:t>
+        <w:t xml:space="preserve">Monitor o'z-o'zidan o'chib qolishi uchun. </w:t>
       </w:r>
       <w:r>
         <w:rPr>
@@ -3282,7 +3250,7 @@
           <w:color w:val="505F73"/>
           <w:sz w:val="18"/>
         </w:rPr>
-        <w:t>(Моментально взрывается сам по себе.)</w:t>
+        <w:t>(Чтобы монитор сам по себе не выключился.)</w:t>
       </w:r>
     </w:p>
     <w:p>
@@ -3303,7 +3271,7 @@
           <w:color w:val="0F172A"/>
           <w:sz w:val="19"/>
         </w:rPr>
-        <w:t xml:space="preserve">Barcha kristallarni yeb qo'yadi. </w:t>
+        <w:t xml:space="preserve">Faqat internet tezligini oshirish uchun. </w:t>
       </w:r>
       <w:r>
         <w:rPr>
@@ -3311,7 +3279,7 @@
           <w:color w:val="505F73"/>
           <w:sz w:val="18"/>
         </w:rPr>
-        <w:t>(Съедает все кристаллы на уровне.)</w:t>
+        <w:t>(Только чтобы увеличить скорость интернета.)</w:t>
       </w:r>
     </w:p>
     <w:p>
@@ -3333,7 +3301,7 @@
           <w:color w:val="0F172A"/>
           <w:sz w:val="20"/>
         </w:rPr>
-        <w:t xml:space="preserve">4-hafta 16-darsda o'zimiz yaratgan levelni do'stimiz ham o'ynashi uchun nima qilamiz? </w:t>
+        <w:t xml:space="preserve">Internetda kimdir: 'Mana bu havolaga kirsang, senga bepul 10 000 Robux beramiz!' deb yozsa, nima qilish kerak? </w:t>
       </w:r>
       <w:r>
         <w:rPr>
@@ -3342,7 +3310,7 @@
           <w:color w:val="475569"/>
           <w:sz w:val="19"/>
         </w:rPr>
-        <w:t>(Что нужно сделать, чтобы друг тоже смог поиграть на карте, которую мы создали в редакторе (Урок 16)?)</w:t>
+        <w:t>(Что делать, если в интернете обещают: «Перейди по ссылке и получи бесплатно 10 000 робуксов»?)</w:t>
       </w:r>
     </w:p>
     <w:p>
@@ -3363,7 +3331,7 @@
           <w:color w:val="0F172A"/>
           <w:sz w:val="19"/>
         </w:rPr>
-        <w:t xml:space="preserve">Level kodini hech kimga berib bo'lmaydi. </w:t>
+        <w:t xml:space="preserve">Barcha parollaringizni unga xat qilib jo'natish. </w:t>
       </w:r>
       <w:r>
         <w:rPr>
@@ -3371,7 +3339,7 @@
           <w:color w:val="505F73"/>
           <w:sz w:val="18"/>
         </w:rPr>
-        <w:t>(Созданную карту вообще никому нельзя передать.)</w:t>
+        <w:t>(Написать ему все свои личные пароли.)</w:t>
       </w:r>
     </w:p>
     <w:p>
@@ -3392,7 +3360,7 @@
           <w:color w:val="0F172A"/>
           <w:sz w:val="19"/>
         </w:rPr>
-        <w:t xml:space="preserve">Kompyuterni do'stimizning uyiga ko'tarib boramiz. </w:t>
+        <w:t xml:space="preserve">Darhol havolani ochib, o'z parolingizni yozish. </w:t>
       </w:r>
       <w:r>
         <w:rPr>
@@ -3400,7 +3368,7 @@
           <w:color w:val="505F73"/>
           <w:sz w:val="18"/>
         </w:rPr>
-        <w:t>(Принести системный блок к другу домой.)</w:t>
+        <w:t>(Срочно открыть ссылку и ввести свой пароль.)</w:t>
       </w:r>
     </w:p>
     <w:p>
@@ -3421,7 +3389,7 @@
           <w:color w:val="0F172A"/>
           <w:sz w:val="19"/>
         </w:rPr>
-        <w:t xml:space="preserve">O'yin kodini butunlay o'chirib tashlaymiz. </w:t>
+        <w:t xml:space="preserve">O'z uyingiz manzilini o'sha odamga yuborish. </w:t>
       </w:r>
       <w:r>
         <w:rPr>
@@ -3429,7 +3397,7 @@
           <w:color w:val="505F73"/>
           <w:sz w:val="18"/>
         </w:rPr>
-        <w:t>(Полностью стереть весь код игры.)</w:t>
+        <w:t>(Отправить этому человеку адрес своего дома.)</w:t>
       </w:r>
     </w:p>
     <w:p>
@@ -3450,7 +3418,7 @@
           <w:color w:val="0F172A"/>
           <w:sz w:val="19"/>
         </w:rPr>
-        <w:t xml:space="preserve">O'yinda chiqqan Level Kodini nusxalab do'stimizga jo'natamiz, u o'z o'yiniga joylaydi. </w:t>
+        <w:t xml:space="preserve">Bu yolg'on (fishing) qopqoni ekanini bilib, havolani ochmaslik va kattalarga aytish. </w:t>
       </w:r>
       <w:r>
         <w:rPr>
@@ -3458,7 +3426,7 @@
           <w:color w:val="505F73"/>
           <w:sz w:val="18"/>
         </w:rPr>
-        <w:t>(Скопировать полученный в редакторе Код Уровня и отправить другу в сообщении.)</w:t>
+        <w:t>(Понять, что это ловушка мошенников (фишинг), не нажимать и рассказать взрослым.)</w:t>
       </w:r>
     </w:p>
     <w:p>
@@ -3479,7 +3447,7 @@
           <w:color w:val="0F172A"/>
           <w:sz w:val="19"/>
         </w:rPr>
-        <w:t xml:space="preserve">Faqat telefon bilan ekranni rasmga olamiz. </w:t>
+        <w:t xml:space="preserve">Do'stlaringizning hammasiga o'sha havolani tarqatish. </w:t>
       </w:r>
       <w:r>
         <w:rPr>
@@ -3487,7 +3455,7 @@
           <w:color w:val="505F73"/>
           <w:sz w:val="18"/>
         </w:rPr>
-        <w:t>(Сфотографировать экран телефоном.)</w:t>
+        <w:t>(Разослать эту ссылку всем своим друзьям.)</w:t>
       </w:r>
     </w:p>
     <w:p>
@@ -3509,7 +3477,7 @@
           <w:color w:val="0F172A"/>
           <w:sz w:val="20"/>
         </w:rPr>
-        <w:t xml:space="preserve">5-hafta 17-darsga ko'ra, quyidagi parollardan qaysi biri eng mustahkam va xavfsiz? </w:t>
+        <w:t xml:space="preserve">Qaysi ma'lumotlarni internetdagi notanish odamlarga HECH QACHON aytmaslik kerak? </w:t>
       </w:r>
       <w:r>
         <w:rPr>
@@ -3518,7 +3486,7 @@
           <w:color w:val="475569"/>
           <w:sz w:val="19"/>
         </w:rPr>
-        <w:t>(Какой из следующих паролей является самым надежным и безопасным (Урок 17, 5-я неделя)?)</w:t>
+        <w:t>(Какую информацию НИКОГДА нельзя сообщать незнакомцам в интернете?)</w:t>
       </w:r>
     </w:p>
     <w:p>
@@ -3536,10 +3504,18 @@
       </w:r>
       <w:r>
         <w:rPr>
-          <w:color w:val="1E293B"/>
+          <w:color w:val="0F172A"/>
           <w:sz w:val="19"/>
         </w:rPr>
-        <w:t>12345678</w:t>
+        <w:t xml:space="preserve">O'zingiz yoqtirgan sevimli meva nomini. </w:t>
+      </w:r>
+      <w:r>
+        <w:rPr>
+          <w:i/>
+          <w:color w:val="505F73"/>
+          <w:sz w:val="18"/>
+        </w:rPr>
+        <w:t>(Название любимого фрукта.)</w:t>
       </w:r>
     </w:p>
     <w:p>
@@ -3557,10 +3533,18 @@
       </w:r>
       <w:r>
         <w:rPr>
-          <w:color w:val="1E293B"/>
+          <w:color w:val="0F172A"/>
           <w:sz w:val="19"/>
         </w:rPr>
-        <w:t>Target#2026!Kiber</w:t>
+        <w:t xml:space="preserve">Uy manzilingiz, telefon raqamingiz, maktabingiz va parollaringizni. </w:t>
+      </w:r>
+      <w:r>
+        <w:rPr>
+          <w:i/>
+          <w:color w:val="505F73"/>
+          <w:sz w:val="18"/>
+        </w:rPr>
+        <w:t>(Домашний адрес, номер телефона, номер школы и свои пароли.)</w:t>
       </w:r>
     </w:p>
     <w:p>
@@ -3578,10 +3562,18 @@
       </w:r>
       <w:r>
         <w:rPr>
-          <w:color w:val="1E293B"/>
+          <w:color w:val="0F172A"/>
           <w:sz w:val="19"/>
         </w:rPr>
-        <w:t>admin</w:t>
+        <w:t xml:space="preserve">O'yindagi robotning rangini. </w:t>
+      </w:r>
+      <w:r>
+        <w:rPr>
+          <w:i/>
+          <w:color w:val="505F73"/>
+          <w:sz w:val="18"/>
+        </w:rPr>
+        <w:t>(Цвет робота в вашей игре.)</w:t>
       </w:r>
     </w:p>
     <w:p>
@@ -3599,10 +3591,18 @@
       </w:r>
       <w:r>
         <w:rPr>
-          <w:color w:val="1E293B"/>
+          <w:color w:val="0F172A"/>
           <w:sz w:val="19"/>
         </w:rPr>
-        <w:t>parol123</w:t>
+        <w:t xml:space="preserve">Sevimli multfilmingiz qahramoni nomini. </w:t>
+      </w:r>
+      <w:r>
+        <w:rPr>
+          <w:i/>
+          <w:color w:val="505F73"/>
+          <w:sz w:val="18"/>
+        </w:rPr>
+        <w:t>(Имя любимого персонажа из мультфильма.)</w:t>
       </w:r>
     </w:p>
     <w:p>
@@ -3620,10 +3620,18 @@
       </w:r>
       <w:r>
         <w:rPr>
-          <w:color w:val="1E293B"/>
+          <w:color w:val="0F172A"/>
           <w:sz w:val="19"/>
         </w:rPr>
-        <w:t>qwerty</w:t>
+        <w:t xml:space="preserve">Sevimli futbol jamoangiz nomini. </w:t>
+      </w:r>
+      <w:r>
+        <w:rPr>
+          <w:i/>
+          <w:color w:val="505F73"/>
+          <w:sz w:val="18"/>
+        </w:rPr>
+        <w:t>(Название любимой футбольной команды.)</w:t>
       </w:r>
     </w:p>
     <w:p>
@@ -3645,7 +3653,7 @@
           <w:color w:val="0F172A"/>
           <w:sz w:val="20"/>
         </w:rPr>
-        <w:t xml:space="preserve">5-hafta 18-darsda o'rganilgan 'Fishing' (Phishing) aldovi nima? </w:t>
+        <w:t xml:space="preserve">Internetga rasm yoki xabar joylashdan oldin qanday o'ylash kerak (Katta Ekran qoidasi)? </w:t>
       </w:r>
       <w:r>
         <w:rPr>
@@ -3654,7 +3662,7 @@
           <w:color w:val="475569"/>
           <w:sz w:val="19"/>
         </w:rPr>
-        <w:t>(Что такое 'Фишинг' (Phishing), о котором мы говорили на Уроке 18 (5-я неделя)?)</w:t>
+        <w:t>(О чем нужно подумать перед тем, как выложить фото или сообщение в интернет (Правило билборда)?)</w:t>
       </w:r>
     </w:p>
     <w:p>
@@ -3675,7 +3683,7 @@
           <w:color w:val="0F172A"/>
           <w:sz w:val="19"/>
         </w:rPr>
-        <w:t xml:space="preserve">Maktab veb-saytini chiroyli qilish dasturi. </w:t>
+        <w:t xml:space="preserve">Faqat kompyuter narxini surishtirish. </w:t>
       </w:r>
       <w:r>
         <w:rPr>
@@ -3683,7 +3691,7 @@
           <w:color w:val="505F73"/>
           <w:sz w:val="18"/>
         </w:rPr>
-        <w:t>(Программа для украшения сайта школы.)</w:t>
+        <w:t>(Думать только о стоимости компьютера.)</w:t>
       </w:r>
     </w:p>
     <w:p>
@@ -3704,7 +3712,7 @@
           <w:color w:val="0F172A"/>
           <w:sz w:val="19"/>
         </w:rPr>
-        <w:t xml:space="preserve">Kompyuterga yangi o'yin yuklash usuli. </w:t>
+        <w:t xml:space="preserve">Hech narsa deb o'ylamasdan hamma narsani tarqatish. </w:t>
       </w:r>
       <w:r>
         <w:rPr>
@@ -3712,7 +3720,7 @@
           <w:color w:val="505F73"/>
           <w:sz w:val="18"/>
         </w:rPr>
-        <w:t>(Способ бесплатно скачать новую игру.)</w:t>
+        <w:t>(Не задумываясь выкладывать абсолютно всё.)</w:t>
       </w:r>
     </w:p>
     <w:p>
@@ -3733,7 +3741,7 @@
           <w:color w:val="0F172A"/>
           <w:sz w:val="19"/>
         </w:rPr>
-        <w:t xml:space="preserve">Internet tezligini oshiruvchi sim. </w:t>
+        <w:t xml:space="preserve">Ekranni qo'l bilan tozalash kerak deb o'ylash. </w:t>
       </w:r>
       <w:r>
         <w:rPr>
@@ -3741,7 +3749,7 @@
           <w:color w:val="505F73"/>
           <w:sz w:val="18"/>
         </w:rPr>
-        <w:t>(Провод для ускорения интернета.)</w:t>
+        <w:t>(Думать о том, как протереть монитор рукой.)</w:t>
       </w:r>
     </w:p>
     <w:p>
@@ -3762,7 +3770,7 @@
           <w:color w:val="0F172A"/>
           <w:sz w:val="19"/>
         </w:rPr>
-        <w:t xml:space="preserve">Baliq ovi haqidagi qiziqarli o'yin. </w:t>
+        <w:t xml:space="preserve">'Agar bu rasmni butun maktab va ota-onam ulkan ekranda ko'rsa, men xijolat bo'lmaymanmi?' deb o'ylash. </w:t>
       </w:r>
       <w:r>
         <w:rPr>
@@ -3770,7 +3778,7 @@
           <w:color w:val="505F73"/>
           <w:sz w:val="18"/>
         </w:rPr>
-        <w:t>(Компьютерная игра про рыбалку.)</w:t>
+        <w:t>(«Будет ли мне стыдно, если это фото увидят на огромном экране вся школа и родители?»)</w:t>
       </w:r>
     </w:p>
     <w:p>
@@ -3791,7 +3799,7 @@
           <w:color w:val="0F172A"/>
           <w:sz w:val="19"/>
         </w:rPr>
-        <w:t xml:space="preserve">Haqiqiy saytga o'xshatib yasalgan soxta havola orqali akkaunt va parollarni o'g'irlash usuli. </w:t>
+        <w:t xml:space="preserve">Faqat eng shovqinli xabarlarni yozish kerak deb o'ylash. </w:t>
       </w:r>
       <w:r>
         <w:rPr>
@@ -3799,7 +3807,7 @@
           <w:color w:val="505F73"/>
           <w:sz w:val="18"/>
         </w:rPr>
-        <w:t>(Поддельная ссылка, похожая на настоящий сайт, созданная мошенниками для кражи паролей.)</w:t>
+        <w:t>(Думать только о том, как сделать больше шума.)</w:t>
       </w:r>
     </w:p>
     <w:p>
@@ -3821,7 +3829,7 @@
           <w:color w:val="0F172A"/>
           <w:sz w:val="20"/>
         </w:rPr>
-        <w:t xml:space="preserve">5-hafta 19-darsda 'Troyalik Ot' virusi bolalarning kompyuteriga qanday qilib tushib qoladi? </w:t>
+        <w:t xml:space="preserve">Kompyuter virusi yoki zararli dastur nima? </w:t>
       </w:r>
       <w:r>
         <w:rPr>
@@ -3830,7 +3838,7 @@
           <w:color w:val="475569"/>
           <w:sz w:val="19"/>
         </w:rPr>
-        <w:t>(Как вирус 'Троянский Конь' чаще всего попадает на компьютеры (Урок 19, 5-я неделя)?)</w:t>
+        <w:t>(Что такое компьютерный вирус или вредоносная программа?)</w:t>
       </w:r>
     </w:p>
     <w:p>
@@ -3851,7 +3859,7 @@
           <w:color w:val="0F172A"/>
           <w:sz w:val="19"/>
         </w:rPr>
-        <w:t xml:space="preserve">Faqat rasm chizadigan dastur ochilganda. </w:t>
+        <w:t xml:space="preserve">Tezkor Wi-Fi signali. </w:t>
       </w:r>
       <w:r>
         <w:rPr>
@@ -3859,7 +3867,7 @@
           <w:color w:val="505F73"/>
           <w:sz w:val="18"/>
         </w:rPr>
-        <w:t>(Исключительно в программе для рисования.)</w:t>
+        <w:t>(Быстрый сигнал Wi-Fi.)</w:t>
       </w:r>
     </w:p>
     <w:p>
@@ -3880,7 +3888,7 @@
           <w:color w:val="0F172A"/>
           <w:sz w:val="19"/>
         </w:rPr>
-        <w:t xml:space="preserve">Faqat kompyuterni latta bilan tozalaganda. </w:t>
+        <w:t xml:space="preserve">Kompyuterga choy to'kilib ketishi. </w:t>
       </w:r>
       <w:r>
         <w:rPr>
@@ -3888,7 +3896,7 @@
           <w:color w:val="505F73"/>
           <w:sz w:val="18"/>
         </w:rPr>
-        <w:t>(Только во время протирки клавиатуры салфеткой.)</w:t>
+        <w:t>(Пролитый на клавиатуру чай.)</w:t>
       </w:r>
     </w:p>
     <w:p>
@@ -3909,7 +3917,7 @@
           <w:color w:val="0F172A"/>
           <w:sz w:val="19"/>
         </w:rPr>
-        <w:t xml:space="preserve">Faqat maktab kundaligi ochilganda. </w:t>
+        <w:t xml:space="preserve">O'yin qahramonining yangi kiyimi. </w:t>
       </w:r>
       <w:r>
         <w:rPr>
@@ -3917,7 +3925,7 @@
           <w:color w:val="505F73"/>
           <w:sz w:val="18"/>
         </w:rPr>
-        <w:t>(Только при открытии школьного электронного дневника.)</w:t>
+        <w:t>(Новый костюм персонажа в игре.)</w:t>
       </w:r>
     </w:p>
     <w:p>
@@ -3938,7 +3946,7 @@
           <w:color w:val="0F172A"/>
           <w:sz w:val="19"/>
         </w:rPr>
-        <w:t xml:space="preserve">'Tekin Robux', 'O'yin uchun cheat' yoki 'Tekin o'yin' niqobi ostidagi soxta fayllarni yuklaganda. </w:t>
+        <w:t xml:space="preserve">Kompyuterdagi fayllarni o'chiradigan yoki buzadigan xavfli, yashirin dastur. </w:t>
       </w:r>
       <w:r>
         <w:rPr>
@@ -3946,7 +3954,7 @@
           <w:color w:val="505F73"/>
           <w:sz w:val="18"/>
         </w:rPr>
-        <w:t>(Под видом 'бесплатных робуксов', 'читов для игры' или 'бесплатной игры' с сомнительных сайтов.)</w:t>
+        <w:t>(Опасная скрытая программа, которая может удалить или повредить файлы на компьютере.)</w:t>
       </w:r>
     </w:p>
     <w:p>
@@ -3967,7 +3975,7 @@
           <w:color w:val="0F172A"/>
           <w:sz w:val="19"/>
         </w:rPr>
-        <w:t xml:space="preserve">Kompyuterga hech qachon virus tushmaydi. </w:t>
+        <w:t xml:space="preserve">Chiroyli ish stoli fon rasmi. </w:t>
       </w:r>
       <w:r>
         <w:rPr>
@@ -3975,7 +3983,7 @@
           <w:color w:val="505F73"/>
           <w:sz w:val="18"/>
         </w:rPr>
-        <w:t>(На компьютеры вирусы вообще никогда не попадают.)</w:t>
+        <w:t>(Красивые обои для рабочего стола.)</w:t>
       </w:r>
     </w:p>
     <w:p>
@@ -3997,7 +4005,7 @@
           <w:color w:val="0F172A"/>
           <w:sz w:val="20"/>
         </w:rPr>
-        <w:t xml:space="preserve">6-hafta 20-darsda biz yasagan 'Cyber Shield' ilovasi nima ish qilar edi? </w:t>
+        <w:t xml:space="preserve">O'yinlar yoki dasturlarni qayerdan yuklab olish eng xavfsiz hisoblanadi? </w:t>
       </w:r>
       <w:r>
         <w:rPr>
@@ -4006,7 +4014,7 @@
           <w:color w:val="475569"/>
           <w:sz w:val="19"/>
         </w:rPr>
-        <w:t>(Какую полезную задачу выполняло приложение 'Cyber Shield', собранное нами на Уроке 20?)</w:t>
+        <w:t>(Откуда безопаснее всего скачивать игры и программы?)</w:t>
       </w:r>
     </w:p>
     <w:p>
@@ -4027,7 +4035,7 @@
           <w:color w:val="0F172A"/>
           <w:sz w:val="19"/>
         </w:rPr>
-        <w:t xml:space="preserve">Faqat musiqa chalar edi. </w:t>
+        <w:t xml:space="preserve">Qidiruvdagi birinchi chiqqan noma'lum havoladan. </w:t>
       </w:r>
       <w:r>
         <w:rPr>
@@ -4035,7 +4043,7 @@
           <w:color w:val="505F73"/>
           <w:sz w:val="18"/>
         </w:rPr>
-        <w:t>(Оно только проигрывало музыку.)</w:t>
+        <w:t>(По первой попавшейся непонятной ссылке.)</w:t>
       </w:r>
     </w:p>
     <w:p>
@@ -4056,7 +4064,7 @@
           <w:color w:val="0F172A"/>
           <w:sz w:val="19"/>
         </w:rPr>
-        <w:t xml:space="preserve">Kompyuterdagi suratlarni o'chirib yuborar edi. </w:t>
+        <w:t xml:space="preserve">Faqat elektron pochta spam xabarlaridan. </w:t>
       </w:r>
       <w:r>
         <w:rPr>
@@ -4064,7 +4072,7 @@
           <w:color w:val="505F73"/>
           <w:sz w:val="18"/>
         </w:rPr>
-        <w:t>(Оно стирало фотографии с компьютера.)</w:t>
+        <w:t>(Только из спам-писем электронной почты.)</w:t>
       </w:r>
     </w:p>
     <w:p>
@@ -4085,7 +4093,7 @@
           <w:color w:val="0F172A"/>
           <w:sz w:val="19"/>
         </w:rPr>
-        <w:t xml:space="preserve">Chatdagi shubhali xabarlarni tekshirib, yolg'on va aldov bor joylarni qizil bilan ko'rsatar edi. </w:t>
+        <w:t xml:space="preserve">Rasmiy va ishonchli do'konlardan (masalan, rasmiy saytlar yoki App Store/Google Play). </w:t>
       </w:r>
       <w:r>
         <w:rPr>
@@ -4093,7 +4101,7 @@
           <w:color w:val="505F73"/>
           <w:sz w:val="18"/>
         </w:rPr>
-        <w:t>(Оно проверяло сообщения чата и подсвечивало красным цветом опасные ссылки и обман.)</w:t>
+        <w:t>(Из официальных и проверенных источников (официальные сайты, App Store, Google Play).)</w:t>
       </w:r>
     </w:p>
     <w:p>
@@ -4114,7 +4122,7 @@
           <w:color w:val="0F172A"/>
           <w:sz w:val="19"/>
         </w:rPr>
-        <w:t xml:space="preserve">Uy vazifasini o'quvchi o'rniga ishlab berar edi. </w:t>
+        <w:t xml:space="preserve">Telegramdagi notanish odam yuborgan fayldan. </w:t>
       </w:r>
       <w:r>
         <w:rPr>
@@ -4122,7 +4130,7 @@
           <w:color w:val="505F73"/>
           <w:sz w:val="18"/>
         </w:rPr>
-        <w:t>(Оно решало домашнее задание за учеников.)</w:t>
+        <w:t>(Из файлов, которые прислал незнакомец в Telegram.)</w:t>
       </w:r>
     </w:p>
     <w:p>
@@ -4143,7 +4151,7 @@
           <w:color w:val="0F172A"/>
           <w:sz w:val="19"/>
         </w:rPr>
-        <w:t xml:space="preserve">Faqat kompyuter o'yinlarini o'ynatar edi. </w:t>
+        <w:t xml:space="preserve">Noma'lum va shubhali reklama saytlaridan. </w:t>
       </w:r>
       <w:r>
         <w:rPr>
@@ -4151,7 +4159,7 @@
           <w:color w:val="505F73"/>
           <w:sz w:val="18"/>
         </w:rPr>
-        <w:t>(Оно только запускало игры.)</w:t>
+        <w:t>(С неизвестных и подозрительных сайтов с рекламой.)</w:t>
       </w:r>
     </w:p>
     <w:p>
@@ -4173,7 +4181,7 @@
           <w:color w:val="0F172A"/>
           <w:sz w:val="20"/>
         </w:rPr>
-        <w:t xml:space="preserve">7-hafta 21-darsda nega internetda begona odamlarga uydan olingan suratlarni yubormaslik kerak? </w:t>
+        <w:t xml:space="preserve">Do'stlar bilan birgalikda o'yin yaratishning eng katta foydasi nimada? </w:t>
       </w:r>
       <w:r>
         <w:rPr>
@@ -4182,7 +4190,7 @@
           <w:color w:val="475569"/>
           <w:sz w:val="19"/>
         </w:rPr>
-        <w:t>(Почему на Уроке 21 не рекомендуется пересылать незнакомым людям фотографии, сделанные дома?)</w:t>
+        <w:t>(В чем главная польза совместной работы над игрой с друзьями?)</w:t>
       </w:r>
     </w:p>
     <w:p>
@@ -4203,7 +4211,7 @@
           <w:color w:val="0F172A"/>
           <w:sz w:val="19"/>
         </w:rPr>
-        <w:t xml:space="preserve">Chunki suratlarda uyning qayerda joylashgani (GPS manzili) ko'rinib qolishi mumkin. </w:t>
+        <w:t xml:space="preserve">Har kim o'zining yaxshi bilgan ishini (biri rasm chizadi, biri hikoya yozadi, biri kodlaydi) qilib, ajoyib o'yin yarata oladi. </w:t>
       </w:r>
       <w:r>
         <w:rPr>
@@ -4211,7 +4219,7 @@
           <w:color w:val="505F73"/>
           <w:sz w:val="18"/>
         </w:rPr>
-        <w:t>(Потому что в свойствах фото могут сохраниться координаты и адрес вашего дома (GPS).)</w:t>
+        <w:t>(Каждый делает то, что умеет лучше всего (один рисует, другой пишет сюжет, третий кодит), и получается крутая игра.)</w:t>
       </w:r>
     </w:p>
     <w:p>
@@ -4232,7 +4240,7 @@
           <w:color w:val="0F172A"/>
           <w:sz w:val="19"/>
         </w:rPr>
-        <w:t xml:space="preserve">Suratlarda hech qanday xavf bo'lmaydi. </w:t>
+        <w:t xml:space="preserve">Dars vaqti behuda o'tadi. </w:t>
       </w:r>
       <w:r>
         <w:rPr>
@@ -4240,7 +4248,7 @@
           <w:color w:val="505F73"/>
           <w:sz w:val="18"/>
         </w:rPr>
-        <w:t>(В фотографиях нет никакой опасности.)</w:t>
+        <w:t>(Можно просто потерять время.)</w:t>
       </w:r>
     </w:p>
     <w:p>
@@ -4261,7 +4269,7 @@
           <w:color w:val="0F172A"/>
           <w:sz w:val="19"/>
         </w:rPr>
-        <w:t xml:space="preserve">Chunki telefon ekranining rangi o'chadi. </w:t>
+        <w:t xml:space="preserve">O'yinni tezroq o'chirib tashlash oson bo'ladi. </w:t>
       </w:r>
       <w:r>
         <w:rPr>
@@ -4269,7 +4277,7 @@
           <w:color w:val="505F73"/>
           <w:sz w:val="18"/>
         </w:rPr>
-        <w:t>(Потому что экран телефона станет бледным.)</w:t>
+        <w:t>(Проще быстрее удалить игру.)</w:t>
       </w:r>
     </w:p>
     <w:p>
@@ -4290,7 +4298,7 @@
           <w:color w:val="0F172A"/>
           <w:sz w:val="19"/>
         </w:rPr>
-        <w:t xml:space="preserve">Chunki suratlar telefonni og'irlashtiradi. </w:t>
+        <w:t xml:space="preserve">Kompyuter klaviaturasini talashib sindirish mumkin. </w:t>
       </w:r>
       <w:r>
         <w:rPr>
@@ -4298,7 +4306,7 @@
           <w:color w:val="505F73"/>
           <w:sz w:val="18"/>
         </w:rPr>
-        <w:t>(Потому что телефон от этого станет тяжелым.)</w:t>
+        <w:t>(Можно подраться из-за клавиатуры и сломать её.)</w:t>
       </w:r>
     </w:p>
     <w:p>
@@ -4319,7 +4327,7 @@
           <w:color w:val="0F172A"/>
           <w:sz w:val="19"/>
         </w:rPr>
-        <w:t xml:space="preserve">Chunki suratlar xonadagi havoni sovutib qo'yishi mumkin. </w:t>
+        <w:t xml:space="preserve">Hech kim ish qilmasdan faqat uxlashi mumkin. </w:t>
       </w:r>
       <w:r>
         <w:rPr>
@@ -4327,7 +4335,7 @@
           <w:color w:val="505F73"/>
           <w:sz w:val="18"/>
         </w:rPr>
-        <w:t>(Потому что фотографии могут остудить воздух в комнате.)</w:t>
+        <w:t>(Никто ничего не делает и можно просто спать.)</w:t>
       </w:r>
     </w:p>
     <w:p>
@@ -4349,7 +4357,7 @@
           <w:color w:val="0F172A"/>
           <w:sz w:val="20"/>
         </w:rPr>
-        <w:t xml:space="preserve">8-hafta 22-darsdagi 'Katta Ekran Qoidasi' (Billboard Rule) nima haqida? </w:t>
+        <w:t xml:space="preserve">O'zingiz yaratgan o'yinni boshqalarga tanishtirayotganda nimalar haqida gapirib berish kerak? </w:t>
       </w:r>
       <w:r>
         <w:rPr>
@@ -4358,7 +4366,7 @@
           <w:color w:val="475569"/>
           <w:sz w:val="19"/>
         </w:rPr>
-        <w:t>(О чем предупреждает 'Правило Большого Экрана' (Billboard Rule) из Урока 22 (8-я неделя)?)</w:t>
+        <w:t>(О чем нужно рассказать, презентуя созданную вами игру друзьям и одноклассникам?)</w:t>
       </w:r>
     </w:p>
     <w:p>
@@ -4379,7 +4387,7 @@
           <w:color w:val="0F172A"/>
           <w:sz w:val="19"/>
         </w:rPr>
-        <w:t xml:space="preserve">O'yinlarni faqat kinoteatrda ko'rish haqida. </w:t>
+        <w:t xml:space="preserve">Faqat xonadagi chiroqlar nechta ekanligi haqida. </w:t>
       </w:r>
       <w:r>
         <w:rPr>
@@ -4387,7 +4395,7 @@
           <w:color w:val="505F73"/>
           <w:sz w:val="18"/>
         </w:rPr>
-        <w:t>(О том, что фильмы нужно смотреть только в кинотеатре.)</w:t>
+        <w:t>(О том, сколько лампочек горит в комнате.)</w:t>
       </w:r>
     </w:p>
     <w:p>
@@ -4408,7 +4416,7 @@
           <w:color w:val="0F172A"/>
           <w:sz w:val="19"/>
         </w:rPr>
-        <w:t xml:space="preserve">Telefon ekranini qorong'i qilish haqida. </w:t>
+        <w:t xml:space="preserve">Monitor qanchalik og'irligi haqida. </w:t>
       </w:r>
       <w:r>
         <w:rPr>
@@ -4416,7 +4424,7 @@
           <w:color w:val="505F73"/>
           <w:sz w:val="18"/>
         </w:rPr>
-        <w:t>(О том, что нужно сделать экран телефона темным.)</w:t>
+        <w:t>(О том, сколько весит монитор.)</w:t>
       </w:r>
     </w:p>
     <w:p>
@@ -4437,7 +4445,7 @@
           <w:color w:val="0F172A"/>
           <w:sz w:val="19"/>
         </w:rPr>
-        <w:t xml:space="preserve">Katta ko'cha ekraniga osishga uyaladigan shaxsiy rasm yoki gaplarni internetga ham aslo qo'ymaslik haqida. </w:t>
+        <w:t xml:space="preserve">Ertalab nima tush ko'rganingiz haqida. </w:t>
       </w:r>
       <w:r>
         <w:rPr>
@@ -4445,7 +4453,7 @@
           <w:color w:val="505F73"/>
           <w:sz w:val="18"/>
         </w:rPr>
-        <w:t>(О том, что нельзя выкладывать в интернет то, что постеснялся бы показать на огромном экране посреди города.)</w:t>
+        <w:t>(О том, какой сон приснился утром.)</w:t>
       </w:r>
     </w:p>
     <w:p>
@@ -4466,7 +4474,7 @@
           <w:color w:val="0F172A"/>
           <w:sz w:val="19"/>
         </w:rPr>
-        <w:t xml:space="preserve">Katta televizor sotib olish haqida. </w:t>
+        <w:t xml:space="preserve">O'yin nomi, qahramonning maqsadi va qanday o'ynash (qoidalari) haqida. </w:t>
       </w:r>
       <w:r>
         <w:rPr>
@@ -4474,7 +4482,7 @@
           <w:color w:val="505F73"/>
           <w:sz w:val="18"/>
         </w:rPr>
-        <w:t>(О том, что нужно купить огромный телевизор.)</w:t>
+        <w:t>(Об названии игры, цели главного героя и правилах управления.)</w:t>
       </w:r>
     </w:p>
     <w:p>
@@ -4495,7 +4503,7 @@
           <w:color w:val="0F172A"/>
           <w:sz w:val="19"/>
         </w:rPr>
-        <w:t xml:space="preserve">Kompyuter ekranini pardalar bilan to'sish haqida. </w:t>
+        <w:t xml:space="preserve">Hech narsa demasdan yig'lash kerak. </w:t>
       </w:r>
       <w:r>
         <w:rPr>
@@ -4503,7 +4511,7 @@
           <w:color w:val="505F73"/>
           <w:sz w:val="18"/>
         </w:rPr>
-        <w:t>(О том, что монитор нужно закрывать шторами.)</w:t>
+        <w:t>(Нужно молчать и плакать.)</w:t>
       </w:r>
     </w:p>
     <w:p>
@@ -4525,7 +4533,7 @@
           <w:color w:val="0F172A"/>
           <w:sz w:val="20"/>
         </w:rPr>
-        <w:t xml:space="preserve">Vibecoding darslarida o'rganilgan eng muhim qoida qaysi? </w:t>
+        <w:t xml:space="preserve">Vibecoding darslarida haqiqiy kiber-ijodkor bo'lish uchun nima eng muhimi? </w:t>
       </w:r>
       <w:r>
         <w:rPr>
@@ -4534,7 +4542,7 @@
           <w:color w:val="475569"/>
           <w:sz w:val="19"/>
         </w:rPr>
-        <w:t>(Какое самое главное правило отличает настоящего юного разработчика (Vibecoder)?)</w:t>
+        <w:t>(Vibecoding darslarida haqiqiy kiber-ijodkor bo'lish uchun nima eng muhimi?)</w:t>
       </w:r>
     </w:p>
     <w:p>
@@ -4552,18 +4560,10 @@
       </w:r>
       <w:r>
         <w:rPr>
-          <w:color w:val="0F172A"/>
+          <w:color w:val="1E293B"/>
           <w:sz w:val="19"/>
         </w:rPr>
-        <w:t xml:space="preserve">Boshqalarning o'yinini o'g'irlab, o'zimniki deb aytish. </w:t>
-      </w:r>
-      <w:r>
-        <w:rPr>
-          <w:i/>
-          <w:color w:val="505F73"/>
-          <w:sz w:val="18"/>
-        </w:rPr>
-        <w:t>(Копировать чужие игры и говорить, что сделал сам.)</w:t>
+        <w:t>Xato qilishdan qo'rqmaslik, yangi g'oyalarni sinab ko'rish va AI bilan do'stlashish.</w:t>
       </w:r>
     </w:p>
     <w:p>
@@ -4581,18 +4581,10 @@
       </w:r>
       <w:r>
         <w:rPr>
-          <w:color w:val="0F172A"/>
+          <w:color w:val="1E293B"/>
           <w:sz w:val="19"/>
         </w:rPr>
-        <w:t xml:space="preserve">Notanish odamlar yuborgan har qanday havolani tekshirmasdan bosish. </w:t>
-      </w:r>
-      <w:r>
-        <w:rPr>
-          <w:i/>
-          <w:color w:val="505F73"/>
-          <w:sz w:val="18"/>
-        </w:rPr>
-        <w:t>(Нажимать на любые незнакомые ссылки от чужих людей.)</w:t>
+        <w:t>Hech narsani o'rganmasdan o'tirish.</w:t>
       </w:r>
     </w:p>
     <w:p>
@@ -4610,18 +4602,10 @@
       </w:r>
       <w:r>
         <w:rPr>
-          <w:color w:val="0F172A"/>
+          <w:color w:val="1E293B"/>
           <w:sz w:val="19"/>
         </w:rPr>
-        <w:t xml:space="preserve">Parollarni hamma do'stlarga tarqatish. </w:t>
-      </w:r>
-      <w:r>
-        <w:rPr>
-          <w:i/>
-          <w:color w:val="505F73"/>
-          <w:sz w:val="18"/>
-        </w:rPr>
-        <w:t>(Раздавать свои пароли всем знакомым.)</w:t>
+        <w:t>Kompyuter simlarini chalkashtirib qo'yish.</w:t>
       </w:r>
     </w:p>
     <w:p>
@@ -4639,18 +4623,10 @@
       </w:r>
       <w:r>
         <w:rPr>
-          <w:color w:val="0F172A"/>
+          <w:color w:val="1E293B"/>
           <w:sz w:val="19"/>
         </w:rPr>
-        <w:t xml:space="preserve">Sun'iy intellektdan unumli foydalanib o'z o'yinlarimizni yaratish va kiber-xavfsizlik qoidalariga doimo amal qilish. </w:t>
-      </w:r>
-      <w:r>
-        <w:rPr>
-          <w:i/>
-          <w:color w:val="505F73"/>
-          <w:sz w:val="18"/>
-        </w:rPr>
-        <w:t>(Умно использовать ИИ для создания полезных игр и всегда соблюдать правила безопасности в интернете.)</w:t>
+        <w:t>Birinchi xatodanoq kompyuterni o'chirib qo'yish.</w:t>
       </w:r>
     </w:p>
     <w:p>
@@ -4668,18 +4644,10 @@
       </w:r>
       <w:r>
         <w:rPr>
-          <w:color w:val="0F172A"/>
+          <w:color w:val="1E293B"/>
           <w:sz w:val="19"/>
         </w:rPr>
-        <w:t xml:space="preserve">Kun bo'yi faqat o'yin o'ynash. </w:t>
-      </w:r>
-      <w:r>
-        <w:rPr>
-          <w:i/>
-          <w:color w:val="505F73"/>
-          <w:sz w:val="18"/>
-        </w:rPr>
-        <w:t>(Играть в компьютерные игры сутки напролет.)</w:t>
+        <w:t>Faqat boshqalarning o'yinini ko'chirib olish.</w:t>
       </w:r>
     </w:p>
     <w:p>
@@ -4904,14 +4872,14 @@
               <w:rPr>
                 <w:b/>
               </w:rPr>
-              <w:t xml:space="preserve">01-dars: AI nima </w:t>
+              <w:t xml:space="preserve">01: Sun'iy intellekt nima </w:t>
             </w:r>
             <w:r>
               <w:rPr>
                 <w:i/>
                 <w:color w:val="64748B"/>
               </w:rPr>
-              <w:t>(Урок 01: Что такое ИИ)</w:t>
+              <w:t>(01: Что такое ИИ)</w:t>
             </w:r>
           </w:p>
         </w:tc>
@@ -4934,14 +4902,14 @@
           </w:tcPr>
           <w:p>
             <w:r>
-              <w:t xml:space="preserve">AI — bu inson bergan topshiriqlar asosida yangi g'oyalar va o'yinlar yaratishda yordam beruvchi aqlli dastur. </w:t>
+              <w:t xml:space="preserve">AI — inson ko'rsatmasi bilan g'oyalar, rasmlar va matnlar yaratishda yordam beruvchi aqlli dastur. </w:t>
             </w:r>
             <w:r>
               <w:rPr>
                 <w:i/>
                 <w:color w:val="64748B"/>
               </w:rPr>
-              <w:t>(ИИ — это умный цифровой помощник, помогающий создавать новые игры и генерировать идеи.)</w:t>
+              <w:t>(ИИ — это умная программа, помогающая создавать идеи, тексты и изображения по инструкциям человека.)</w:t>
             </w:r>
           </w:p>
         </w:tc>
@@ -5026,14 +4994,14 @@
               <w:rPr>
                 <w:b/>
               </w:rPr>
-              <w:t xml:space="preserve">02-dars: AI Aktyor va NPC </w:t>
+              <w:t xml:space="preserve">02: Prompt tushunchasi </w:t>
             </w:r>
             <w:r>
               <w:rPr>
                 <w:i/>
                 <w:color w:val="64748B"/>
               </w:rPr>
-              <w:t>(Урок 02: Персонажи NPC с характером)</w:t>
+              <w:t>(02: Понятие промпта)</w:t>
             </w:r>
           </w:p>
         </w:tc>
@@ -5055,14 +5023,14 @@
           </w:tcPr>
           <w:p>
             <w:r>
-              <w:t xml:space="preserve">Promptda qahramonning xarakteri qanchalik aniq yozilsa, u o'yinda shunchalik qiziqarli gapiradi. </w:t>
+              <w:t xml:space="preserve">Prompt — bu AI ga nima qilish kerakligini tushuntiruvchi matnli topshiriq. </w:t>
             </w:r>
             <w:r>
               <w:rPr>
                 <w:i/>
                 <w:color w:val="64748B"/>
               </w:rPr>
-              <w:t>(Чем понятнее описан характер персонажа в промпте, тем живее и интереснее он общается в игре.)</w:t>
+              <w:t>(Промпт — это текстовое задание, объясняющее ИИ, что нужно сделать.)</w:t>
             </w:r>
           </w:p>
         </w:tc>
@@ -5150,14 +5118,14 @@
               <w:rPr>
                 <w:b/>
               </w:rPr>
-              <w:t xml:space="preserve">03-dars: Game Lore </w:t>
+              <w:t xml:space="preserve">03: Vibecoding maqsadi </w:t>
             </w:r>
             <w:r>
               <w:rPr>
                 <w:i/>
                 <w:color w:val="64748B"/>
               </w:rPr>
-              <w:t>(Урок 03: Game Lore и история мира)</w:t>
+              <w:t>(03: Цель Vibecoding)</w:t>
             </w:r>
           </w:p>
         </w:tc>
@@ -5180,14 +5148,14 @@
           </w:tcPr>
           <w:p>
             <w:r>
-              <w:t xml:space="preserve">Game Lore — bu o'yin olamining ertaknamo qiziqarli tarixi bo'lib, o'yinni maroqli qiladi. </w:t>
+              <w:t xml:space="preserve">Vibecoding o'quvchiga o'zining qiziqarli o'yin g'oyalarini AI yordamida amalga oshirish imkonini beradi. </w:t>
             </w:r>
             <w:r>
               <w:rPr>
                 <w:i/>
                 <w:color w:val="64748B"/>
               </w:rPr>
-              <w:t>(Game Lore — это сказочная предыстория игры, делающая прохождение интересным и захватывающим.)</w:t>
+              <w:t>(Vibecoding позволяет ученику воплощать свои игровые идеи с помощью ИИ.)</w:t>
             </w:r>
           </w:p>
         </w:tc>
@@ -5272,14 +5240,14 @@
               <w:rPr>
                 <w:b/>
               </w:rPr>
-              <w:t xml:space="preserve">04-dars: Concept Art uslublari </w:t>
+              <w:t xml:space="preserve">04: Qahramonni boshqarish </w:t>
             </w:r>
             <w:r>
               <w:rPr>
                 <w:i/>
                 <w:color w:val="64748B"/>
               </w:rPr>
-              <w:t>(Урок 04: Стили концепт-арта)</w:t>
+              <w:t>(04: Управление персонажем)</w:t>
             </w:r>
           </w:p>
         </w:tc>
@@ -5301,14 +5269,14 @@
           </w:tcPr>
           <w:p>
             <w:r>
-              <w:t xml:space="preserve">Pixel Art yoki 3D multfilm kabi chiroyli uslublar yordamida o'yinimizga ajoyib rasmlar chizdiramiz. </w:t>
+              <w:t xml:space="preserve">O'yin qahramoni foydalanuvchi klaviatura va sichqonchada bergan signallar orqali harakatlanadi. </w:t>
             </w:r>
             <w:r>
               <w:rPr>
                 <w:i/>
                 <w:color w:val="64748B"/>
               </w:rPr>
-              <w:t>(С помощью таких стилей, как Pixel Art или 3D мультфильм, мы создаем красивые изображения для игры.)</w:t>
+              <w:t>(Персонаж игры управляется нажатиями клавиш клавиатуры и движениями мыши.)</w:t>
             </w:r>
           </w:p>
         </w:tc>
@@ -5396,14 +5364,14 @@
               <w:rPr>
                 <w:b/>
               </w:rPr>
-              <w:t xml:space="preserve">05-dars: Deepfake belgilari </w:t>
+              <w:t xml:space="preserve">05: Qahramon jonlari (HP) </w:t>
             </w:r>
             <w:r>
               <w:rPr>
                 <w:i/>
                 <w:color w:val="64748B"/>
               </w:rPr>
-              <w:t>(Урок 05: Признаки дипфейка)</w:t>
+              <w:t>(05: Жизни героя (HP))</w:t>
             </w:r>
           </w:p>
         </w:tc>
@@ -5426,14 +5394,14 @@
           </w:tcPr>
           <w:p>
             <w:r>
-              <w:t xml:space="preserve">AI ba'zan qo'l barmoqlarini yoki ko'z qorachiqlarini chizishda xato qilib qo'yadi va buni osongina payqash mumkin. </w:t>
+              <w:t xml:space="preserve">HP (Health Points) qahramonning qancha kuchi yoki joni qolganini ifodalaydi. </w:t>
             </w:r>
             <w:r>
               <w:rPr>
                 <w:i/>
                 <w:color w:val="64748B"/>
               </w:rPr>
-              <w:t>(ИИ иногда ошибается при рисовании пальцев рук или зрачков, и такие неточности легко заметить.)</w:t>
+              <w:t>(HP показывает текущий запас здоровья или попыток персонажа.)</w:t>
             </w:r>
           </w:p>
         </w:tc>
@@ -5518,14 +5486,14 @@
               <w:rPr>
                 <w:b/>
               </w:rPr>
-              <w:t xml:space="preserve">06-dars: Game Pitch taqdimoti </w:t>
+              <w:t xml:space="preserve">06: O'yin to'siqlari </w:t>
             </w:r>
             <w:r>
               <w:rPr>
                 <w:i/>
                 <w:color w:val="64748B"/>
               </w:rPr>
-              <w:t>(Урок 06: Презентация Game Pitch)</w:t>
+              <w:t>(06: Игровые препятствия)</w:t>
             </w:r>
           </w:p>
         </w:tc>
@@ -5547,14 +5515,14 @@
           </w:tcPr>
           <w:p>
             <w:r>
-              <w:t xml:space="preserve">Demo Day kuni har bir o'quvchi o'zi yaratgan o'yinni sinfdoshlariga faxr bilan ko'rsatib, tanishtiradi. </w:t>
+              <w:t xml:space="preserve">To'siqlar o'yinga hayajon va qiyinchilik qo'shib, o'yinni maroqli qiladi. </w:t>
             </w:r>
             <w:r>
               <w:rPr>
                 <w:i/>
                 <w:color w:val="64748B"/>
               </w:rPr>
-              <w:t>(На Demo Day каждый ученик с гордостью показывает свою созданную игру одноклассникам.)</w:t>
+              <w:t>(Препятствия добавляют азарт и сложность, делая игру интересной.)</w:t>
             </w:r>
           </w:p>
         </w:tc>
@@ -5642,14 +5610,14 @@
               <w:rPr>
                 <w:b/>
               </w:rPr>
-              <w:t xml:space="preserve">07-dars: 3D Modellar </w:t>
+              <w:t xml:space="preserve">07: Ballar va mukofotlar </w:t>
             </w:r>
             <w:r>
               <w:rPr>
                 <w:i/>
                 <w:color w:val="64748B"/>
               </w:rPr>
-              <w:t>(Урок 07: 3D Модели и сетка Mesh)</w:t>
+              <w:t>(07: Очки и награды)</w:t>
             </w:r>
           </w:p>
         </w:tc>
@@ -5672,14 +5640,14 @@
           </w:tcPr>
           <w:p>
             <w:r>
-              <w:t xml:space="preserve">3D o'yin qahramonlari fazoviy nuqtalardan tashkil topgan shakllar to'plami (mesh) orqali chiziladi. </w:t>
+              <w:t xml:space="preserve">Kristall va tangalar o'yinchiga ko'proq ball to'plash va g'olib bo'lish imkonini beradi. </w:t>
             </w:r>
             <w:r>
               <w:rPr>
                 <w:i/>
                 <w:color w:val="64748B"/>
               </w:rPr>
-              <w:t>(Трехмерные игровые персонажи строятся из точек и граней (сетки Mesh), образующих форму тела.)</w:t>
+              <w:t>(Сбор предметов увеличивает счет игрока и ведет к победе.)</w:t>
             </w:r>
           </w:p>
         </w:tc>
@@ -5764,14 +5732,14 @@
               <w:rPr>
                 <w:b/>
               </w:rPr>
-              <w:t xml:space="preserve">08-dars: Level Design elementlari </w:t>
+              <w:t xml:space="preserve">08: Game Over holati </w:t>
             </w:r>
             <w:r>
               <w:rPr>
                 <w:i/>
                 <w:color w:val="64748B"/>
               </w:rPr>
-              <w:t>(Урок 08: Элементы дизайна уровня)</w:t>
+              <w:t>(08: Состояние Game Over)</w:t>
             </w:r>
           </w:p>
         </w:tc>
@@ -5793,14 +5761,14 @@
           </w:tcPr>
           <w:p>
             <w:r>
-              <w:t xml:space="preserve">Level dizayneri o'yinchiga qiziq bo'lishi uchun sakraydigan yerlar (platformalar), tangalar va to'siqlarni chizadi. </w:t>
+              <w:t xml:space="preserve">Game Over — sinov tugaganini va yangidan harakat qilib o'ynash mumkinligini bildiradi. </w:t>
             </w:r>
             <w:r>
               <w:rPr>
                 <w:i/>
                 <w:color w:val="64748B"/>
               </w:rPr>
-              <w:t>(Левел-дизайнер размещает дорожки для прыжков, награды и препятствия, чтобы игра была увлекательной.)</w:t>
+              <w:t>(Game Over означает окончание попытки и возможность сыграть снова.)</w:t>
             </w:r>
           </w:p>
         </w:tc>
@@ -5862,7 +5830,7 @@
                 <w:color w:val="0284C7"/>
                 <w:sz w:val="22"/>
               </w:rPr>
-              <w:t>E</w:t>
+              <w:t>D</w:t>
             </w:r>
           </w:p>
         </w:tc>
@@ -5888,14 +5856,14 @@
               <w:rPr>
                 <w:b/>
               </w:rPr>
-              <w:t xml:space="preserve">09-dars: SFX tovushlar </w:t>
+              <w:t xml:space="preserve">09: O'yin tovushlari </w:t>
             </w:r>
             <w:r>
               <w:rPr>
                 <w:i/>
                 <w:color w:val="64748B"/>
               </w:rPr>
-              <w:t>(Урок 09: Звуковые эффекты SFX)</w:t>
+              <w:t>(09: Звуки в игре)</w:t>
             </w:r>
           </w:p>
         </w:tc>
@@ -5918,14 +5886,14 @@
           </w:tcPr>
           <w:p>
             <w:r>
-              <w:t xml:space="preserve">SFX — qahramon harakatlanganda chalinadigan quvnoq o'yin tovushlari (sakrash, tanga jiringlashi). </w:t>
+              <w:t xml:space="preserve">Tovushlar va musiqa o'yin atmosferasini yaratadi va qahramon harakatlarini jonlantiradi. </w:t>
             </w:r>
             <w:r>
               <w:rPr>
                 <w:i/>
                 <w:color w:val="64748B"/>
               </w:rPr>
-              <w:t>(SFX — это звуки событий в игре (прыжки, монетка 'дзынь'), делающие игру динамичной.)</w:t>
+              <w:t>(Звуки и музыка создают атмосферу игры и оживляют действия персонажа.)</w:t>
             </w:r>
           </w:p>
         </w:tc>
@@ -6010,14 +5978,14 @@
               <w:rPr>
                 <w:b/>
               </w:rPr>
-              <w:t xml:space="preserve">10-dars: Aqlli NPC dialoglari </w:t>
+              <w:t xml:space="preserve">10: O'yin qahramonlari (NPC) </w:t>
             </w:r>
             <w:r>
               <w:rPr>
                 <w:i/>
                 <w:color w:val="64748B"/>
               </w:rPr>
-              <w:t>(Урок 10: Умные диалоги NPC)</w:t>
+              <w:t>(10: Персонажи игры (NPC))</w:t>
             </w:r>
           </w:p>
         </w:tc>
@@ -6039,14 +6007,14 @@
           </w:tcPr>
           <w:p>
             <w:r>
-              <w:t xml:space="preserve">Aqlli NPC larda o'yinchi tanlagan javobiga qarab yangi topshiriq yoki sovg'a beriladi. </w:t>
+              <w:t xml:space="preserve">NPC — o'yinda yordam beruvchi yoki qiziqarli topshiriq beruvchi do'stona qahramonlar. </w:t>
             </w:r>
             <w:r>
               <w:rPr>
                 <w:i/>
                 <w:color w:val="64748B"/>
               </w:rPr>
-              <w:t>(Умные персонажи реагируют на ответы игрока и могут выдать новый квест или награду.)</w:t>
+              <w:t>(NPC — это персонажи, которые помогают игроку и дают задания в игровом мире.)</w:t>
             </w:r>
           </w:p>
         </w:tc>
@@ -6108,7 +6076,7 @@
                 <w:color w:val="0284C7"/>
                 <w:sz w:val="22"/>
               </w:rPr>
-              <w:t>E</w:t>
+              <w:t>B</w:t>
             </w:r>
           </w:p>
         </w:tc>
@@ -6134,14 +6102,14 @@
               <w:rPr>
                 <w:b/>
               </w:rPr>
-              <w:t xml:space="preserve">11-dars: HUD paneli </w:t>
+              <w:t xml:space="preserve">11: O'yin animatsiyasi </w:t>
             </w:r>
             <w:r>
               <w:rPr>
                 <w:i/>
                 <w:color w:val="64748B"/>
               </w:rPr>
-              <w:t>(Урок 11: Панель HUD)</w:t>
+              <w:t>(11: Анимация в играх)</w:t>
             </w:r>
           </w:p>
         </w:tc>
@@ -6164,14 +6132,14 @@
           </w:tcPr>
           <w:p>
             <w:r>
-              <w:t xml:space="preserve">HUD paneli o'yinchiga nechta joni (HP) va nechta tangasi borligini doim ko'rsatib turadi. </w:t>
+              <w:t xml:space="preserve">Animatsiya — bir nechta rasmlarning tez almashishi natijasida hosil bo'ladigan silliq harakat. </w:t>
             </w:r>
             <w:r>
               <w:rPr>
                 <w:i/>
                 <w:color w:val="64748B"/>
               </w:rPr>
-              <w:t>(Панель HUD всегда показывает игроку, сколько жизней (HP) и кристаллов у него осталось.)</w:t>
+              <w:t>(Анимация — это быстрая смена кадров, создающая эффект плавного движения.)</w:t>
             </w:r>
           </w:p>
         </w:tc>
@@ -6256,14 +6224,14 @@
               <w:rPr>
                 <w:b/>
               </w:rPr>
-              <w:t xml:space="preserve">12-dars: Game Jam marafoni </w:t>
+              <w:t xml:space="preserve">12: Dasturchi kasbi </w:t>
             </w:r>
             <w:r>
               <w:rPr>
                 <w:i/>
                 <w:color w:val="64748B"/>
               </w:rPr>
-              <w:t>(Урок 12: Марафон Game Jam)</w:t>
+              <w:t>(12: Профессия программиста)</w:t>
             </w:r>
           </w:p>
         </w:tc>
@@ -6285,14 +6253,14 @@
           </w:tcPr>
           <w:p>
             <w:r>
-              <w:t xml:space="preserve">Game Jam — bolalar qisqa vaqt ichida o'zlarining shaxsiy o'yinini yaratib sinab ko'radigan qiziqarli dars. </w:t>
+              <w:t xml:space="preserve">Dasturchi o'yindagi qahramonlar va to'siqlarning qanday ishlashini kod orqali buyuradi. </w:t>
             </w:r>
             <w:r>
               <w:rPr>
                 <w:i/>
                 <w:color w:val="64748B"/>
               </w:rPr>
-              <w:t>(Game Jam — это марафон, на котором ребята за короткий срок пробуют собрать свою игру.)</w:t>
+              <w:t>(Программист с помощью кода задает правила движения персонажей и работы игры.)</w:t>
             </w:r>
           </w:p>
         </w:tc>
@@ -6380,14 +6348,14 @@
               <w:rPr>
                 <w:b/>
               </w:rPr>
-              <w:t xml:space="preserve">13-dars: Game Loop boshqaruvi </w:t>
+              <w:t xml:space="preserve">13: O'yindagi Bug </w:t>
             </w:r>
             <w:r>
               <w:rPr>
                 <w:i/>
                 <w:color w:val="64748B"/>
               </w:rPr>
-              <w:t>(Урок 13: Игровой цикл Game Loop)</w:t>
+              <w:t>(13: Ошибка (баг))</w:t>
             </w:r>
           </w:p>
         </w:tc>
@@ -6410,14 +6378,14 @@
           </w:tcPr>
           <w:p>
             <w:r>
-              <w:t xml:space="preserve">Game Loop to'xtovsiz ishlab, klaviatura bosilishiga qarab qahramonni ekranda harakatlantiradi. </w:t>
+              <w:t xml:space="preserve">Bug — bu dastur kodida yo'l qo'yilgan xatolik bo'lib, uni topib tuzatish kerak. </w:t>
             </w:r>
             <w:r>
               <w:rPr>
                 <w:i/>
                 <w:color w:val="64748B"/>
               </w:rPr>
-              <w:t>(Game Loop непрерывно опрашивает клавиши управления и двигает героя по экрану.)</w:t>
+              <w:t>(Баг — это программная ошибка, которую необходимо найти и исправить.)</w:t>
             </w:r>
           </w:p>
         </w:tc>
@@ -6502,14 +6470,14 @@
               <w:rPr>
                 <w:b/>
               </w:rPr>
-              <w:t xml:space="preserve">14-dars: To'siqlar va HP </w:t>
+              <w:t xml:space="preserve">14: Debugging jarayoni </w:t>
             </w:r>
             <w:r>
               <w:rPr>
                 <w:i/>
                 <w:color w:val="64748B"/>
               </w:rPr>
-              <w:t>(Урок 14: Препятствия и потеря HP)</w:t>
+              <w:t>(14: Исправление ошибок)</w:t>
             </w:r>
           </w:p>
         </w:tc>
@@ -6531,14 +6499,14 @@
           </w:tcPr>
           <w:p>
             <w:r>
-              <w:t xml:space="preserve">Xavfli to'siqqa tekkanda o'yinchining bitta joni ketadi, agar hamma jonlari tugasa o'yin qayta boshlanadi. </w:t>
+              <w:t xml:space="preserve">Dasturchilar xatolardan qo'rqmaydi, balki xatoni qidirib topib tuzatadi (debugging qiladi). </w:t>
             </w:r>
             <w:r>
               <w:rPr>
                 <w:i/>
                 <w:color w:val="64748B"/>
               </w:rPr>
-              <w:t>(При касании шипов отнимается жизнь; если все сердечки закончились, уровень начинается заново.)</w:t>
+              <w:t>(Программисты не боятся ошибок, а находят и аккуратно исправляют их.)</w:t>
             </w:r>
           </w:p>
         </w:tc>
@@ -6600,7 +6568,7 @@
                 <w:color w:val="0284C7"/>
                 <w:sz w:val="22"/>
               </w:rPr>
-              <w:t>A</w:t>
+              <w:t>E</w:t>
             </w:r>
           </w:p>
         </w:tc>
@@ -6626,14 +6594,14 @@
               <w:rPr>
                 <w:b/>
               </w:rPr>
-              <w:t xml:space="preserve">15-dars: Kristall yig'ish </w:t>
+              <w:t xml:space="preserve">15: O'yin darajalari </w:t>
             </w:r>
             <w:r>
               <w:rPr>
                 <w:i/>
                 <w:color w:val="64748B"/>
               </w:rPr>
-              <w:t>(Урок 15: Сбор кристаллов)</w:t>
+              <w:t>(15: Уровни в игре)</w:t>
             </w:r>
           </w:p>
         </w:tc>
@@ -6656,14 +6624,14 @@
           </w:tcPr>
           <w:p>
             <w:r>
-              <w:t xml:space="preserve">Oltin kristallga tekkanda ballarimiz ko'payadi, tovush yangraydi va kristall yig'ib olinadi. </w:t>
+              <w:t xml:space="preserve">Darajalar bosqichma-bosqich murakkablashib, o'yinchiga qiziq bo'lishini ta'minlaydi. </w:t>
             </w:r>
             <w:r>
               <w:rPr>
                 <w:i/>
                 <w:color w:val="64748B"/>
               </w:rPr>
-              <w:t>(Сбор кристалла увеличивает наш счет, звучит звуковой эффект, а кристалл исчезает.)</w:t>
+              <w:t>(Уровни усложняются постепенно, поддерживая интерес игрока.)</w:t>
             </w:r>
           </w:p>
         </w:tc>
@@ -6723,7 +6691,7 @@
                 <w:color w:val="0284C7"/>
                 <w:sz w:val="22"/>
               </w:rPr>
-              <w:t>E</w:t>
+              <w:t>A</w:t>
             </w:r>
           </w:p>
         </w:tc>
@@ -6748,14 +6716,14 @@
               <w:rPr>
                 <w:b/>
               </w:rPr>
-              <w:t xml:space="preserve">16-dars: Qalqon himoyasi </w:t>
+              <w:t xml:space="preserve">16: Mustahkam parol </w:t>
             </w:r>
             <w:r>
               <w:rPr>
                 <w:i/>
                 <w:color w:val="64748B"/>
               </w:rPr>
-              <w:t>(Урок 16: Лазерный щит)</w:t>
+              <w:t>(16: Надежный пароль)</w:t>
             </w:r>
           </w:p>
         </w:tc>
@@ -6777,14 +6745,14 @@
           </w:tcPr>
           <w:p>
             <w:r>
-              <w:t xml:space="preserve">Lazer qalqoni o'yinchini dushmanning xavfli zarbalaridan vaqtinchalik himoya qilib turadi. </w:t>
+              <w:t xml:space="preserve">Katta-kichik harflar, raqamlar va belgilar (#, !) aralashgan uzun parol eng mustahkamdir. </w:t>
             </w:r>
             <w:r>
               <w:rPr>
                 <w:i/>
                 <w:color w:val="64748B"/>
               </w:rPr>
-              <w:t>(Щит дает герою временную защиту, спасая от опасных лазерных залпов босса.)</w:t>
+              <w:t>(Длинный пароль с буквами разного регистра, цифрами и знаками самый безопасный.)</w:t>
             </w:r>
           </w:p>
         </w:tc>
@@ -6872,14 +6840,14 @@
               <w:rPr>
                 <w:b/>
               </w:rPr>
-              <w:t xml:space="preserve">15-dars (4-h): Dushman AI quvishi </w:t>
+              <w:t xml:space="preserve">17: Parol maxfiyligi </w:t>
             </w:r>
             <w:r>
               <w:rPr>
                 <w:i/>
                 <w:color w:val="64748B"/>
               </w:rPr>
-              <w:t>(Урок 15 (4-нед): Погоня врагов)</w:t>
+              <w:t>(17: Секретность пароля)</w:t>
             </w:r>
           </w:p>
         </w:tc>
@@ -6902,14 +6870,14 @@
           </w:tcPr>
           <w:p>
             <w:r>
-              <w:t xml:space="preserve">Dushman o'yinchini ko'rish doirasiga kirishi bilan uni quvishni boshlaydi. </w:t>
+              <w:t xml:space="preserve">Parol — bu sizning shaxsiy kalitingiz, uni faqat o'zingiz va ota-onangiz bilishi kerak. </w:t>
             </w:r>
             <w:r>
               <w:rPr>
                 <w:i/>
                 <w:color w:val="64748B"/>
               </w:rPr>
-              <w:t>(Как только герой заходит в зону видимости врага, тот сразу начинает погоню.)</w:t>
+              <w:t>(Пароль — это личный ключ, который должны знать только вы и ваши родители.)</w:t>
             </w:r>
           </w:p>
         </w:tc>
@@ -6994,14 +6962,14 @@
               <w:rPr>
                 <w:b/>
               </w:rPr>
-              <w:t xml:space="preserve">16-dars (4-h): Level Kodi bilan ulashish </w:t>
+              <w:t xml:space="preserve">18: Fishing qopqoni </w:t>
             </w:r>
             <w:r>
               <w:rPr>
                 <w:i/>
                 <w:color w:val="64748B"/>
               </w:rPr>
-              <w:t>(Урок 16 (4-нед): Передача Кода Уровня)</w:t>
+              <w:t>(18: Фишинг и обман)</w:t>
             </w:r>
           </w:p>
         </w:tc>
@@ -7023,14 +6991,14 @@
           </w:tcPr>
           <w:p>
             <w:r>
-              <w:t xml:space="preserve">Level kodi bu matn bo'lib, uni do'stimizga yuborsak, u o'z kompyuterida biz chizgan xaritani ochib o'ynay oladi. </w:t>
+              <w:t xml:space="preserve">Bepul narsalar va'da qiluvchi soxta havolalar o'g'rilarning aldovi hisoblanadi. </w:t>
             </w:r>
             <w:r>
               <w:rPr>
                 <w:i/>
                 <w:color w:val="64748B"/>
               </w:rPr>
-              <w:t>(Код уровня — это текст; если отправить его другу, он сможет загрузить именно нашу карту.)</w:t>
+              <w:t>(Обещания бесплатных игровых денег — частый обман мошенников для кражи аккаунтов.)</w:t>
             </w:r>
           </w:p>
         </w:tc>
@@ -7118,14 +7086,14 @@
               <w:rPr>
                 <w:b/>
               </w:rPr>
-              <w:t xml:space="preserve">17-dars (5-h): Xavfsiz parol </w:t>
+              <w:t xml:space="preserve">19: Shaxsiy ma'lumotlar </w:t>
             </w:r>
             <w:r>
               <w:rPr>
                 <w:i/>
                 <w:color w:val="64748B"/>
               </w:rPr>
-              <w:t>(Урок 17 (5-нед): Надежный пароль)</w:t>
+              <w:t>(19: Личные данные)</w:t>
             </w:r>
           </w:p>
         </w:tc>
@@ -7148,14 +7116,14 @@
           </w:tcPr>
           <w:p>
             <w:r>
-              <w:t xml:space="preserve">Katta-kichik harflar, raqamlar va maxsus belgilar (#!) aralashgan uzun parol eng xavfsiz hisoblanadi. </w:t>
+              <w:t xml:space="preserve">Uy manzili va telefon raqami shaxsiy ma'lumot bo'lib, begonalarga aytilmaydi. </w:t>
             </w:r>
             <w:r>
               <w:rPr>
                 <w:i/>
                 <w:color w:val="64748B"/>
               </w:rPr>
-              <w:t>(Длинный пароль с большими и маленькими буквами, цифрами и спецсимволами (#!) сложнее всего взломать.)</w:t>
+              <w:t>(Личные данные (адрес, телефон, пароли) должны быть строго защищены от незнакомцев.)</w:t>
             </w:r>
           </w:p>
         </w:tc>
@@ -7215,7 +7183,7 @@
                 <w:color w:val="0284C7"/>
                 <w:sz w:val="22"/>
               </w:rPr>
-              <w:t>E</w:t>
+              <w:t>D</w:t>
             </w:r>
           </w:p>
         </w:tc>
@@ -7240,14 +7208,14 @@
               <w:rPr>
                 <w:b/>
               </w:rPr>
-              <w:t xml:space="preserve">18-dars (5-h): Fishing havolalar </w:t>
+              <w:t xml:space="preserve">20: Katta Ekran qoidasi </w:t>
             </w:r>
             <w:r>
               <w:rPr>
                 <w:i/>
                 <w:color w:val="64748B"/>
               </w:rPr>
-              <w:t>(Урок 18 (5-нед): Фишинговые ссылки)</w:t>
+              <w:t>(20: Правило билборда)</w:t>
             </w:r>
           </w:p>
         </w:tc>
@@ -7269,14 +7237,14 @@
           </w:tcPr>
           <w:p>
             <w:r>
-              <w:t xml:space="preserve">Fishing bu firibgarlarning soxta sayti bo'lib, ular parollarni bilib olishga urinadi. </w:t>
+              <w:t xml:space="preserve">Internetga qo'yilgan ma'lumotni hamma ko'rishi mumkin, shuning uchun faqat yaxshi narsalarni ulashish kerak. </w:t>
             </w:r>
             <w:r>
               <w:rPr>
                 <w:i/>
                 <w:color w:val="64748B"/>
               </w:rPr>
-              <w:t>(Фишинг — это ловушка мошенников, маскирующаяся под сайт игры, чтобы выманить пароль.)</w:t>
+              <w:t>(Всё, что попадает в интернет, могут увидеть другие, поэтому публикуйте только то, за что не будет стыдно.)</w:t>
             </w:r>
           </w:p>
         </w:tc>
@@ -7364,14 +7332,14 @@
               <w:rPr>
                 <w:b/>
               </w:rPr>
-              <w:t xml:space="preserve">19-dars (5-h): Troyan viruslari </w:t>
+              <w:t xml:space="preserve">21: Kompyuter viruslari </w:t>
             </w:r>
             <w:r>
               <w:rPr>
                 <w:i/>
                 <w:color w:val="64748B"/>
               </w:rPr>
-              <w:t>(Урок 19 (5-нед): Троянские программы)</w:t>
+              <w:t>(21: Компьютерные вирусы)</w:t>
             </w:r>
           </w:p>
         </w:tc>
@@ -7394,14 +7362,14 @@
           </w:tcPr>
           <w:p>
             <w:r>
-              <w:t xml:space="preserve">Troyan virusi o'zini yoqimli sovg'a yoki tekin o'yin deb ko'rsatib, kompyuterga yashirincha kirib oladi. </w:t>
+              <w:t xml:space="preserve">Viruslar — kompyuter ishini buzuvchi zararli dasturlar bo'lib, antivirus ulardan himoya qiladi. </w:t>
             </w:r>
             <w:r>
               <w:rPr>
                 <w:i/>
                 <w:color w:val="64748B"/>
               </w:rPr>
-              <w:t>(Троян притворяется заманчивым бесплатным подарком, но на деле вредит компьютеру.)</w:t>
+              <w:t>(Вирусы — это вредоносные программы, нарушающие работу компьютера.)</w:t>
             </w:r>
           </w:p>
         </w:tc>
@@ -7486,14 +7454,14 @@
               <w:rPr>
                 <w:b/>
               </w:rPr>
-              <w:t xml:space="preserve">20-dars (6-h): Cyber Shield ilovasi </w:t>
+              <w:t xml:space="preserve">22: Xavfsiz yuklab olish </w:t>
             </w:r>
             <w:r>
               <w:rPr>
                 <w:i/>
                 <w:color w:val="64748B"/>
               </w:rPr>
-              <w:t>(Урок 20 (6-нед): Приложение Cyber Shield)</w:t>
+              <w:t>(22: Безопасная загрузка)</w:t>
             </w:r>
           </w:p>
         </w:tc>
@@ -7515,14 +7483,14 @@
           </w:tcPr>
           <w:p>
             <w:r>
-              <w:t xml:space="preserve">Cyber Shield chatdagi firibgarlik va shubhali havolalarni tekshirib, xavfdan ogohlantiradi. </w:t>
+              <w:t xml:space="preserve">Dastur va o'yinlarni faqat rasmiy manbalardan yuklab olish viruslardan himoya qiladi. </w:t>
             </w:r>
             <w:r>
               <w:rPr>
                 <w:i/>
                 <w:color w:val="64748B"/>
               </w:rPr>
-              <w:t>(Cyber Shield анализирует текст в чатах и вовремя предупреждает об уловках мошенников.)</w:t>
+              <w:t>(Скачивание из проверенных официальных магазинов защищает от вирусов.)</w:t>
             </w:r>
           </w:p>
         </w:tc>
@@ -7610,14 +7578,14 @@
               <w:rPr>
                 <w:b/>
               </w:rPr>
-              <w:t xml:space="preserve">21-dars (7-h): Shaxsiy fotosuratlar va maxfiylik </w:t>
+              <w:t xml:space="preserve">23: Jamoaviy ishlash </w:t>
             </w:r>
             <w:r>
               <w:rPr>
                 <w:i/>
                 <w:color w:val="64748B"/>
               </w:rPr>
-              <w:t>(Урок 21 (7-нед): Приватность домашних фото)</w:t>
+              <w:t>(23: Командная работа)</w:t>
             </w:r>
           </w:p>
         </w:tc>
@@ -7640,14 +7608,14 @@
           </w:tcPr>
           <w:p>
             <w:r>
-              <w:t xml:space="preserve">Suratlarda uyning manzili va shaxsiy ma'lumotlar fosh bo'lmasligi uchun ularni begonalarga yubormaslik kerak. </w:t>
+              <w:t xml:space="preserve">Jamoada ishlash g'oyalarni birlashtirib, yanada qiziqarliroq o'yin yaratishga yordam beradi. </w:t>
             </w:r>
             <w:r>
               <w:rPr>
                 <w:i/>
                 <w:color w:val="64748B"/>
               </w:rPr>
-              <w:t>(Фотографии могут раскрыть точное местоположение дома, поэтому не стоит отправлять их посторонним.)</w:t>
+              <w:t>(Командная работа объединяет разные таланты и позволяет создать отличную игру.)</w:t>
             </w:r>
           </w:p>
         </w:tc>
@@ -7707,7 +7675,7 @@
                 <w:color w:val="0284C7"/>
                 <w:sz w:val="22"/>
               </w:rPr>
-              <w:t>C</w:t>
+              <w:t>D</w:t>
             </w:r>
           </w:p>
         </w:tc>
@@ -7732,14 +7700,14 @@
               <w:rPr>
                 <w:b/>
               </w:rPr>
-              <w:t xml:space="preserve">22-dars (8-h): Katta Ekran Qoidasi </w:t>
+              <w:t xml:space="preserve">24: O'yin taqdimoti </w:t>
             </w:r>
             <w:r>
               <w:rPr>
                 <w:i/>
                 <w:color w:val="64748B"/>
               </w:rPr>
-              <w:t>(Урок 22 (8-нед): Правило Большого Экрана)</w:t>
+              <w:t>(24: Презентация игры)</w:t>
             </w:r>
           </w:p>
         </w:tc>
@@ -7761,14 +7729,14 @@
           </w:tcPr>
           <w:p>
             <w:r>
-              <w:t xml:space="preserve">Internet ommaviy joy. Butun shahar ko'rishini istamaydigan shaxsiy narsalaringizni internetga joylamang. </w:t>
+              <w:t xml:space="preserve">Taqdimotda o'yinning qiziqarli g'oyasi, qahramoni va o'ynash qoidalari tushuntiriladi. </w:t>
             </w:r>
             <w:r>
               <w:rPr>
                 <w:i/>
                 <w:color w:val="64748B"/>
               </w:rPr>
-              <w:t>(Интернет публичен: то, что вы не готовы показать всему городу на билборде, нельзя выкладывать в сеть.)</w:t>
+              <w:t>(В презентации объясняют сюжет игры, цель героя и правила управления.)</w:t>
             </w:r>
           </w:p>
         </w:tc>
@@ -7830,7 +7798,7 @@
                 <w:color w:val="0284C7"/>
                 <w:sz w:val="22"/>
               </w:rPr>
-              <w:t>D</w:t>
+              <w:t>A</w:t>
             </w:r>
           </w:p>
         </w:tc>
@@ -7856,14 +7824,14 @@
               <w:rPr>
                 <w:b/>
               </w:rPr>
-              <w:t xml:space="preserve">Xulosa: Yosh Vibecoder qoidasi </w:t>
+              <w:t xml:space="preserve">25: Kiber-ijodkorlik </w:t>
             </w:r>
             <w:r>
               <w:rPr>
                 <w:i/>
                 <w:color w:val="64748B"/>
               </w:rPr>
-              <w:t>(Итог: Правило юного Vibecoder)</w:t>
+              <w:t>(25: Кибер-творчество)</w:t>
             </w:r>
           </w:p>
         </w:tc>
@@ -7886,14 +7854,14 @@
           </w:tcPr>
           <w:p>
             <w:r>
-              <w:t xml:space="preserve">Vibecoder — texnologiyalar yordamida yangi foydali o'yinlar yaratadigan va xavfsizlikka doim amal qiladigan ijodkordir. </w:t>
+              <w:t xml:space="preserve">Xatolardan qo'rqmay yangi narsalarni sinab ko'rish eng zo'r dasturchi va o'yin yaratuvchi bo'lish siri. </w:t>
             </w:r>
             <w:r>
               <w:rPr>
                 <w:i/>
                 <w:color w:val="64748B"/>
               </w:rPr>
-              <w:t>(Vibecoder создает классные проекты с помощью технологий и бережет свою цифровую безопасность.)</w:t>
+              <w:t>(Xatolardan qo'rqmay yangi narsalarni sinab ko'rish eng zo'r dasturchi va o'yin yaratuvchi bo'lish siri.)</w:t>
             </w:r>
           </w:p>
         </w:tc>

</xml_diff>

<commit_message>
feat(exams): unify UZ+RU bilingual structure across ALL cohort test papers including 10-11
</commit_message>
<xml_diff>
--- a/tests/TEST_5-6_SINF_VIBECODING.docx
+++ b/tests/TEST_5-6_SINF_VIBECODING.docx
@@ -4542,7 +4542,7 @@
           <w:color w:val="475569"/>
           <w:sz w:val="19"/>
         </w:rPr>
-        <w:t>(Vibecoding darslarida haqiqiy kiber-ijodkor bo'lish uchun nima eng muhimi?)</w:t>
+        <w:t>(Что самое главное на уроках Vibecoding, чтобы стать настоящим кибер-создателем?)</w:t>
       </w:r>
     </w:p>
     <w:p>
@@ -4560,10 +4560,18 @@
       </w:r>
       <w:r>
         <w:rPr>
-          <w:color w:val="1E293B"/>
+          <w:color w:val="0F172A"/>
           <w:sz w:val="19"/>
         </w:rPr>
-        <w:t>Xato qilishdan qo'rqmaslik, yangi g'oyalarni sinab ko'rish va AI bilan do'stlashish.</w:t>
+        <w:t xml:space="preserve">Xato qilishdan qo'rqmaslik, yangi g'oyalarni sinab ko'rish va AI bilan do'stlashish. </w:t>
+      </w:r>
+      <w:r>
+        <w:rPr>
+          <w:i/>
+          <w:color w:val="505F73"/>
+          <w:sz w:val="18"/>
+        </w:rPr>
+        <w:t>(Не бояться ошибок, пробовать новые идеи и творить вместе с ИИ.)</w:t>
       </w:r>
     </w:p>
     <w:p>
@@ -4581,10 +4589,18 @@
       </w:r>
       <w:r>
         <w:rPr>
-          <w:color w:val="1E293B"/>
+          <w:color w:val="0F172A"/>
           <w:sz w:val="19"/>
         </w:rPr>
-        <w:t>Hech narsani o'rganmasdan o'tirish.</w:t>
+        <w:t xml:space="preserve">Hech narsani o'rganmasdan o'tirish. </w:t>
+      </w:r>
+      <w:r>
+        <w:rPr>
+          <w:i/>
+          <w:color w:val="505F73"/>
+          <w:sz w:val="18"/>
+        </w:rPr>
+        <w:t>(Сидеть и ничего нового не изучать.)</w:t>
       </w:r>
     </w:p>
     <w:p>
@@ -4602,10 +4618,18 @@
       </w:r>
       <w:r>
         <w:rPr>
-          <w:color w:val="1E293B"/>
+          <w:color w:val="0F172A"/>
           <w:sz w:val="19"/>
         </w:rPr>
-        <w:t>Kompyuter simlarini chalkashtirib qo'yish.</w:t>
+        <w:t xml:space="preserve">Kompyuter simlarini chalkashtirib qo'yish. </w:t>
+      </w:r>
+      <w:r>
+        <w:rPr>
+          <w:i/>
+          <w:color w:val="505F73"/>
+          <w:sz w:val="18"/>
+        </w:rPr>
+        <w:t>(Запутать провода компьютера в узел.)</w:t>
       </w:r>
     </w:p>
     <w:p>
@@ -4623,10 +4647,18 @@
       </w:r>
       <w:r>
         <w:rPr>
-          <w:color w:val="1E293B"/>
+          <w:color w:val="0F172A"/>
           <w:sz w:val="19"/>
         </w:rPr>
-        <w:t>Birinchi xatodanoq kompyuterni o'chirib qo'yish.</w:t>
+        <w:t xml:space="preserve">Birinchi xatodanoq kompyuterni o'chirib qo'yish. </w:t>
+      </w:r>
+      <w:r>
+        <w:rPr>
+          <w:i/>
+          <w:color w:val="505F73"/>
+          <w:sz w:val="18"/>
+        </w:rPr>
+        <w:t>(Сдаваться и выключать компьютер при первой же ошибке.)</w:t>
       </w:r>
     </w:p>
     <w:p>
@@ -4644,10 +4676,18 @@
       </w:r>
       <w:r>
         <w:rPr>
-          <w:color w:val="1E293B"/>
+          <w:color w:val="0F172A"/>
           <w:sz w:val="19"/>
         </w:rPr>
-        <w:t>Faqat boshqalarning o'yinini ko'chirib olish.</w:t>
+        <w:t xml:space="preserve">Faqat boshqalarning o'yinini ko'chirib olish. </w:t>
+      </w:r>
+      <w:r>
+        <w:rPr>
+          <w:i/>
+          <w:color w:val="505F73"/>
+          <w:sz w:val="18"/>
+        </w:rPr>
+        <w:t>(Только копировать чужие готовые игры.)</w:t>
       </w:r>
     </w:p>
     <w:p>
@@ -7861,7 +7901,7 @@
                 <w:i/>
                 <w:color w:val="64748B"/>
               </w:rPr>
-              <w:t>(Xatolardan qo'rqmay yangi narsalarni sinab ko'rish eng zo'r dasturchi va o'yin yaratuvchi bo'lish siri.)</w:t>
+              <w:t>(Пробовать новое и не бояться ошибок — главный секрет успешного создателя игр.)</w:t>
             </w:r>
           </w:p>
         </w:tc>

</xml_diff>